<commit_message>
Add CX-count resource scaling to the simple paper
Co-Authored-By: Claude Sonnet 5.5 <noreply@anthropic.com>
Claude-Session: https://claude.ai/code/session_01MwP9ak6eXBRPY8cKeU4Bsg
</commit_message>
<xml_diff>
--- a/simple_paper/paper.docx
+++ b/simple_paper/paper.docx
@@ -529,7 +529,248 @@
         <w:t xml:space="preserve"> </w:t>
       </w:r>
       <w:r>
-        <w:t xml:space="preserve">more Trotter steps than are empirically needed. We also show where Pinsker’s inequality does and does not enter.</w:t>
+        <w:t xml:space="preserve">more Trotter steps than are empirically needed. Translated to two-qubit gates, the filter costs</w:t>
+      </w:r>
+      <w:r>
+        <w:t xml:space="preserve"> </w:t>
+      </w:r>
+      <m:oMath>
+        <m:r>
+          <m:t>2</m:t>
+        </m:r>
+        <m:r>
+          <m:rPr>
+            <m:sty m:val="p"/>
+          </m:rPr>
+          <m:t>×</m:t>
+        </m:r>
+        <m:sSup>
+          <m:e>
+            <m:r>
+              <m:t>10</m:t>
+            </m:r>
+          </m:e>
+          <m:sup>
+            <m:r>
+              <m:t>3</m:t>
+            </m:r>
+          </m:sup>
+        </m:sSup>
+      </m:oMath>
+      <w:r>
+        <w:t xml:space="preserve">–</w:t>
+      </w:r>
+      <m:oMath>
+        <m:r>
+          <m:t>6</m:t>
+        </m:r>
+        <m:r>
+          <m:rPr>
+            <m:sty m:val="p"/>
+          </m:rPr>
+          <m:t>×</m:t>
+        </m:r>
+        <m:sSup>
+          <m:e>
+            <m:r>
+              <m:t>10</m:t>
+            </m:r>
+          </m:e>
+          <m:sup>
+            <m:r>
+              <m:t>5</m:t>
+            </m:r>
+          </m:sup>
+        </m:sSup>
+      </m:oMath>
+      <w:r>
+        <w:t xml:space="preserve"> </w:t>
+      </w:r>
+      <w:r>
+        <w:t xml:space="preserve">CX at the bound’s step count (</w:t>
+      </w:r>
+      <m:oMath>
+        <m:r>
+          <m:t>2</m:t>
+        </m:r>
+        <m:r>
+          <m:rPr>
+            <m:sty m:val="p"/>
+          </m:rPr>
+          <m:t>×</m:t>
+        </m:r>
+        <m:sSup>
+          <m:e>
+            <m:r>
+              <m:t>10</m:t>
+            </m:r>
+          </m:e>
+          <m:sup>
+            <m:r>
+              <m:t>2</m:t>
+            </m:r>
+          </m:sup>
+        </m:sSup>
+      </m:oMath>
+      <w:r>
+        <w:t xml:space="preserve">–</w:t>
+      </w:r>
+      <m:oMath>
+        <m:r>
+          <m:t>1.4</m:t>
+        </m:r>
+        <m:r>
+          <m:rPr>
+            <m:sty m:val="p"/>
+          </m:rPr>
+          <m:t>×</m:t>
+        </m:r>
+        <m:sSup>
+          <m:e>
+            <m:r>
+              <m:t>10</m:t>
+            </m:r>
+          </m:e>
+          <m:sup>
+            <m:r>
+              <m:t>4</m:t>
+            </m:r>
+          </m:sup>
+        </m:sSup>
+      </m:oMath>
+      <w:r>
+        <w:t xml:space="preserve"> </w:t>
+      </w:r>
+      <w:r>
+        <w:t xml:space="preserve">at the measured step count), growing roughly as</w:t>
+      </w:r>
+      <w:r>
+        <w:t xml:space="preserve"> </w:t>
+      </w:r>
+      <m:oMath>
+        <m:sSup>
+          <m:e>
+            <m:r>
+              <m:t>N</m:t>
+            </m:r>
+          </m:e>
+          <m:sup>
+            <m:r>
+              <m:t>4.6</m:t>
+            </m:r>
+          </m:sup>
+        </m:sSup>
+      </m:oMath>
+      <w:r>
+        <w:t xml:space="preserve">–</w:t>
+      </w:r>
+      <m:oMath>
+        <m:sSup>
+          <m:e>
+            <m:r>
+              <m:t>N</m:t>
+            </m:r>
+          </m:e>
+          <m:sup>
+            <m:r>
+              <m:t>5.2</m:t>
+            </m:r>
+          </m:sup>
+        </m:sSup>
+      </m:oMath>
+      <w:r>
+        <w:t xml:space="preserve"> </w:t>
+      </w:r>
+      <w:r>
+        <w:t xml:space="preserve">(bound) and</w:t>
+      </w:r>
+      <w:r>
+        <w:t xml:space="preserve"> </w:t>
+      </w:r>
+      <m:oMath>
+        <m:sSup>
+          <m:e>
+            <m:r>
+              <m:t>N</m:t>
+            </m:r>
+          </m:e>
+          <m:sup>
+            <m:r>
+              <m:t>2.8</m:t>
+            </m:r>
+          </m:sup>
+        </m:sSup>
+      </m:oMath>
+      <w:r>
+        <w:t xml:space="preserve">–</w:t>
+      </w:r>
+      <m:oMath>
+        <m:sSup>
+          <m:e>
+            <m:r>
+              <m:t>N</m:t>
+            </m:r>
+          </m:e>
+          <m:sup>
+            <m:r>
+              <m:t>3.9</m:t>
+            </m:r>
+          </m:sup>
+        </m:sSup>
+      </m:oMath>
+      <w:r>
+        <w:t xml:space="preserve"> </w:t>
+      </w:r>
+      <w:r>
+        <w:t xml:space="preserve">(measured) over</w:t>
+      </w:r>
+      <w:r>
+        <w:t xml:space="preserve"> </w:t>
+      </w:r>
+      <m:oMath>
+        <m:r>
+          <m:t>N</m:t>
+        </m:r>
+        <m:r>
+          <m:rPr>
+            <m:sty m:val="p"/>
+          </m:rPr>
+          <m:t>=</m:t>
+        </m:r>
+        <m:r>
+          <m:t>6</m:t>
+        </m:r>
+      </m:oMath>
+      <w:r>
+        <w:t xml:space="preserve">–</w:t>
+      </w:r>
+      <m:oMath>
+        <m:r>
+          <m:t>12</m:t>
+        </m:r>
+      </m:oMath>
+      <w:r>
+        <w:t xml:space="preserve">, against a</w:t>
+      </w:r>
+      <w:r>
+        <w:t xml:space="preserve"> </w:t>
+      </w:r>
+      <m:oMath>
+        <m:r>
+          <m:t>4</m:t>
+        </m:r>
+        <m:r>
+          <m:rPr>
+            <m:sty m:val="p"/>
+          </m:rPr>
+          <m:t>×</m:t>
+        </m:r>
+      </m:oMath>
+      <w:r>
+        <w:t xml:space="preserve"> </w:t>
+      </w:r>
+      <w:r>
+        <w:t xml:space="preserve">increase per two qubits for exact generic state preparation. We also show where Pinsker’s inequality does and does not enter.</w:t>
       </w:r>
     </w:p>
     <w:bookmarkEnd w:id="20"/>
@@ -1033,6 +1274,18 @@
         <w:pStyle w:val="Compact"/>
       </w:pPr>
       <w:r>
+        <w:t xml:space="preserve">CX-count resource scaling of the certified and the measured step counts, on all-to-all and line connectivity (Section 5.8).</w:t>
+      </w:r>
+    </w:p>
+    <w:p>
+      <w:pPr>
+        <w:numPr>
+          <w:ilvl w:val="0"/>
+          <w:numId w:val="1001"/>
+        </w:numPr>
+        <w:pStyle w:val="Compact"/>
+      </w:pPr>
+      <w:r>
         <w:t xml:space="preserve">A short account of where Pinsker’s inequality fits (Section 3.5), including why it cannot replace the triangle-inequality argument for a pure target.</w:t>
       </w:r>
     </w:p>
@@ -1085,7 +1338,7 @@
         </m:r>
       </m:oMath>
       <w:r>
-        <w:t xml:space="preserve">). Hardware noise and gate synthesis are not modelled. Section 6 lists the consequences. We report Trotter steps, not gate counts; a companion cost study in this repository (</w:t>
+        <w:t xml:space="preserve">). Hardware noise and gate synthesis are not modelled. Section 6 lists the consequences. Resource counts are CX only (no T counts or synthesis error), noiseless, for the filter alone (the trial-state circuit is not included). A companion cost study in this repository (</w:t>
       </w:r>
       <w:r>
         <w:rPr>
@@ -1094,7 +1347,7 @@
         <w:t xml:space="preserve">evaluation/</w:t>
       </w:r>
       <w:r>
-        <w:t xml:space="preserve">) compares CX counts with direct MPS-circuit preparation and finds no resource advantage for the filter on 1D chains with</w:t>
+        <w:t xml:space="preserve">) compares the filter with direct MPS-circuit preparation and finds no resource advantage for 1D chains with</w:t>
       </w:r>
       <w:r>
         <w:t xml:space="preserve"> </w:t>
@@ -1114,7 +1367,7 @@
         </m:r>
       </m:oMath>
       <w:r>
-        <w:t xml:space="preserve">. This note does not revisit that conclusion.</w:t>
+        <w:t xml:space="preserve">; Section 5.8 uses a weaker baseline (exact generic state preparation) and does not revisit that conclusion.</w:t>
       </w:r>
     </w:p>
     <w:bookmarkEnd w:id="21"/>
@@ -11362,7 +11615,7 @@
         </m:r>
       </m:oMath>
       <w:r>
-        <w:t xml:space="preserve">. This is a necessary condition on the cost, not an error bound, and (Section 5.7) it is weak for the cases studied. We include it to mark where relative-entropy tools apply and to be explicit that they do not drive the main result.</w:t>
+        <w:t xml:space="preserve">. This is a necessary condition on the cost, not an error bound, and (Section 5.8) it is weak for the cases studied. We include it to mark where relative-entropy tools apply and to be explicit that they do not drive the main result.</w:t>
       </w:r>
     </w:p>
     <w:bookmarkEnd w:id="30"/>
@@ -12395,7 +12648,7 @@
       </w:r>
     </w:p>
     <w:bookmarkEnd w:id="32"/>
-    <w:bookmarkStart w:id="46" w:name="empirical-study"/>
+    <w:bookmarkStart w:id="50" w:name="empirical-study"/>
     <w:p>
       <w:pPr>
         <w:pStyle w:val="Heading2"/>
@@ -23724,13 +23977,2522 @@
       </w:r>
     </w:p>
     <w:bookmarkEnd w:id="44"/>
-    <w:bookmarkStart w:id="45" w:name="pinsker-numerics"/>
+    <w:bookmarkStart w:id="48" w:name="resource-scaling-cx-counts"/>
     <w:p>
       <w:pPr>
         <w:pStyle w:val="Heading3"/>
       </w:pPr>
       <w:r>
-        <w:t xml:space="preserve">5.7 Pinsker numerics</w:t>
+        <w:t xml:space="preserve">5.7 Resource scaling: CX counts</w:t>
+      </w:r>
+    </w:p>
+    <w:p>
+      <w:pPr>
+        <w:pStyle w:val="FirstParagraph"/>
+      </w:pPr>
+      <w:r>
+        <w:t xml:space="preserve">One Trotter step of one pulse is, for each bond, the three Pauli rotations</w:t>
+      </w:r>
+      <w:r>
+        <w:t xml:space="preserve"> </w:t>
+      </w:r>
+      <m:oMath>
+        <m:r>
+          <m:t>X</m:t>
+        </m:r>
+        <m:r>
+          <m:t>X</m:t>
+        </m:r>
+        <m:r>
+          <m:rPr>
+            <m:sty m:val="p"/>
+          </m:rPr>
+          <m:t>,</m:t>
+        </m:r>
+        <m:r>
+          <m:t>Y</m:t>
+        </m:r>
+        <m:r>
+          <m:t>Y</m:t>
+        </m:r>
+        <m:r>
+          <m:rPr>
+            <m:sty m:val="p"/>
+          </m:rPr>
+          <m:t>,</m:t>
+        </m:r>
+        <m:r>
+          <m:t>Z</m:t>
+        </m:r>
+        <m:r>
+          <m:t>Z</m:t>
+        </m:r>
+      </m:oMath>
+      <w:r>
+        <w:t xml:space="preserve"> </w:t>
+      </w:r>
+      <w:r>
+        <w:t xml:space="preserve">on the bond tensored with</w:t>
+      </w:r>
+      <w:r>
+        <w:t xml:space="preserve"> </w:t>
+      </w:r>
+      <m:oMath>
+        <m:r>
+          <m:t>Z</m:t>
+        </m:r>
+      </m:oMath>
+      <w:r>
+        <w:t xml:space="preserve"> </w:t>
+      </w:r>
+      <w:r>
+        <w:t xml:space="preserve">on the ancilla, transpiled with qiskit (optimisation level 3) to</w:t>
+      </w:r>
+      <w:r>
+        <w:t xml:space="preserve"> </w:t>
+      </w:r>
+      <m:oMath>
+        <m:r>
+          <m:rPr>
+            <m:sty m:val="p"/>
+          </m:rPr>
+          <m:t>{</m:t>
+        </m:r>
+        <m:r>
+          <m:rPr>
+            <m:sty m:val="p"/>
+          </m:rPr>
+          <m:t>C</m:t>
+        </m:r>
+        <m:r>
+          <m:rPr>
+            <m:sty m:val="p"/>
+          </m:rPr>
+          <m:t>X</m:t>
+        </m:r>
+        <m:r>
+          <m:rPr>
+            <m:sty m:val="p"/>
+          </m:rPr>
+          <m:t>,</m:t>
+        </m:r>
+        <m:r>
+          <m:rPr>
+            <m:sty m:val="p"/>
+          </m:rPr>
+          <m:t>R</m:t>
+        </m:r>
+        <m:r>
+          <m:rPr>
+            <m:sty m:val="p"/>
+          </m:rPr>
+          <m:t>z</m:t>
+        </m:r>
+        <m:r>
+          <m:rPr>
+            <m:sty m:val="p"/>
+          </m:rPr>
+          <m:t>,</m:t>
+        </m:r>
+        <m:r>
+          <m:rPr>
+            <m:sty m:val="p"/>
+          </m:rPr>
+          <m:t>H</m:t>
+        </m:r>
+        <m:r>
+          <m:rPr>
+            <m:sty m:val="p"/>
+          </m:rPr>
+          <m:t>,</m:t>
+        </m:r>
+        <m:r>
+          <m:rPr>
+            <m:sty m:val="p"/>
+          </m:rPr>
+          <m:t>S</m:t>
+        </m:r>
+        <m:r>
+          <m:rPr>
+            <m:sty m:val="p"/>
+          </m:rPr>
+          <m:t>}</m:t>
+        </m:r>
+      </m:oMath>
+      <w:r>
+        <w:t xml:space="preserve">. Ancilla Hadamards and phase rotations add no CX, so the total is</w:t>
+      </w:r>
+      <w:r>
+        <w:t xml:space="preserve"> </w:t>
+      </w:r>
+      <m:oMath>
+        <m:r>
+          <m:t>n</m:t>
+        </m:r>
+        <m:r>
+          <m:rPr>
+            <m:sty m:val="p"/>
+          </m:rPr>
+          <m:t>×</m:t>
+        </m:r>
+        <m:d>
+          <m:dPr>
+            <m:begChr m:val="("/>
+            <m:endChr m:val=")"/>
+            <m:sepChr m:val=""/>
+            <m:grow/>
+          </m:dPr>
+          <m:e>
+            <m:r>
+              <m:rPr>
+                <m:nor/>
+                <m:sty m:val="p"/>
+              </m:rPr>
+              <m:t>CX per step</m:t>
+            </m:r>
+          </m:e>
+        </m:d>
+      </m:oMath>
+      <w:r>
+        <w:t xml:space="preserve">. The per-step count was identical for 1 and 3 consecutive steps on all-to-all connectivity (no cross-step cancellation); on a line with the ancilla at the end it grows with repetition, and we use the 3-step average there.</w:t>
+      </w:r>
+    </w:p>
+    <w:tbl>
+      <w:tblPr>
+        <w:tblStyle w:val="Table"/>
+        <w:tblW w:type="pct" w:w="5000"/>
+        <w:tblLook w:firstRow="1" w:lastRow="0" w:firstColumn="0" w:lastColumn="0" w:noHBand="0" w:noVBand="0" w:val="0020"/>
+        <w:jc w:val="start"/>
+      </w:tblPr>
+      <w:tblGrid>
+        <w:gridCol w:w="792"/>
+        <w:gridCol w:w="792"/>
+        <w:gridCol w:w="792"/>
+        <w:gridCol w:w="792"/>
+        <w:gridCol w:w="792"/>
+        <w:gridCol w:w="792"/>
+        <w:gridCol w:w="792"/>
+        <w:gridCol w:w="792"/>
+        <w:gridCol w:w="792"/>
+        <w:gridCol w:w="792"/>
+      </w:tblGrid>
+      <w:tr>
+        <w:trPr>
+          <w:tblHeader w:val="true"/>
+        </w:trPr>
+        <w:tc>
+          <w:tcPr/>
+          <w:p>
+            <w:pPr>
+              <w:pStyle w:val="Compact"/>
+              <w:jc w:val="left"/>
+            </w:pPr>
+            <m:oMath>
+              <m:r>
+                <m:t>N</m:t>
+              </m:r>
+            </m:oMath>
+          </w:p>
+        </w:tc>
+        <w:tc>
+          <w:tcPr/>
+          <w:p>
+            <w:pPr>
+              <w:pStyle w:val="Compact"/>
+              <w:jc w:val="left"/>
+            </w:pPr>
+            <m:oMath>
+              <m:sSub>
+                <m:e>
+                  <m:r>
+                    <m:t>J</m:t>
+                  </m:r>
+                </m:e>
+                <m:sub>
+                  <m:r>
+                    <m:t>2</m:t>
+                  </m:r>
+                </m:sub>
+              </m:sSub>
+            </m:oMath>
+          </w:p>
+        </w:tc>
+        <w:tc>
+          <w:tcPr/>
+          <w:p>
+            <w:pPr>
+              <w:pStyle w:val="Compact"/>
+              <w:jc w:val="left"/>
+            </w:pPr>
+            <w:r>
+              <w:t xml:space="preserve">CX / step (all-to-all)</w:t>
+            </w:r>
+          </w:p>
+        </w:tc>
+        <w:tc>
+          <w:tcPr/>
+          <w:p>
+            <w:pPr>
+              <w:pStyle w:val="Compact"/>
+              <w:jc w:val="left"/>
+            </w:pPr>
+            <w:r>
+              <w:t xml:space="preserve">CX / step (line)</w:t>
+            </w:r>
+          </w:p>
+        </w:tc>
+        <w:tc>
+          <w:tcPr/>
+          <w:p>
+            <w:pPr>
+              <w:pStyle w:val="Compact"/>
+              <w:jc w:val="left"/>
+            </w:pPr>
+            <m:oMath>
+              <m:sSub>
+                <m:e>
+                  <m:r>
+                    <m:t>n</m:t>
+                  </m:r>
+                </m:e>
+                <m:sub>
+                  <m:r>
+                    <m:rPr>
+                      <m:sty m:val="p"/>
+                    </m:rPr>
+                    <m:t>b</m:t>
+                  </m:r>
+                  <m:r>
+                    <m:rPr>
+                      <m:sty m:val="p"/>
+                    </m:rPr>
+                    <m:t>o</m:t>
+                  </m:r>
+                  <m:r>
+                    <m:rPr>
+                      <m:sty m:val="p"/>
+                    </m:rPr>
+                    <m:t>u</m:t>
+                  </m:r>
+                  <m:r>
+                    <m:rPr>
+                      <m:sty m:val="p"/>
+                    </m:rPr>
+                    <m:t>n</m:t>
+                  </m:r>
+                  <m:r>
+                    <m:rPr>
+                      <m:sty m:val="p"/>
+                    </m:rPr>
+                    <m:t>d</m:t>
+                  </m:r>
+                </m:sub>
+              </m:sSub>
+            </m:oMath>
+          </w:p>
+        </w:tc>
+        <w:tc>
+          <w:tcPr/>
+          <w:p>
+            <w:pPr>
+              <w:pStyle w:val="Compact"/>
+              <w:jc w:val="left"/>
+            </w:pPr>
+            <m:oMath>
+              <m:sSub>
+                <m:e>
+                  <m:r>
+                    <m:t>n</m:t>
+                  </m:r>
+                </m:e>
+                <m:sub>
+                  <m:r>
+                    <m:rPr>
+                      <m:sty m:val="p"/>
+                    </m:rPr>
+                    <m:t>e</m:t>
+                  </m:r>
+                  <m:r>
+                    <m:rPr>
+                      <m:sty m:val="p"/>
+                    </m:rPr>
+                    <m:t>m</m:t>
+                  </m:r>
+                  <m:r>
+                    <m:rPr>
+                      <m:sty m:val="p"/>
+                    </m:rPr>
+                    <m:t>p</m:t>
+                  </m:r>
+                </m:sub>
+              </m:sSub>
+            </m:oMath>
+          </w:p>
+        </w:tc>
+        <w:tc>
+          <w:tcPr/>
+          <w:p>
+            <w:pPr>
+              <w:pStyle w:val="Compact"/>
+              <w:jc w:val="left"/>
+            </w:pPr>
+            <w:r>
+              <w:t xml:space="preserve">CX bound (all-to-all)</w:t>
+            </w:r>
+          </w:p>
+        </w:tc>
+        <w:tc>
+          <w:tcPr/>
+          <w:p>
+            <w:pPr>
+              <w:pStyle w:val="Compact"/>
+              <w:jc w:val="left"/>
+            </w:pPr>
+            <w:r>
+              <w:t xml:space="preserve">CX measured-</w:t>
+            </w:r>
+            <m:oMath>
+              <m:r>
+                <m:t>n</m:t>
+              </m:r>
+            </m:oMath>
+            <w:r>
+              <w:t xml:space="preserve"> </w:t>
+            </w:r>
+            <w:r>
+              <w:t xml:space="preserve">(all-to-all)</w:t>
+            </w:r>
+          </w:p>
+        </w:tc>
+        <w:tc>
+          <w:tcPr/>
+          <w:p>
+            <w:pPr>
+              <w:pStyle w:val="Compact"/>
+              <w:jc w:val="left"/>
+            </w:pPr>
+            <w:r>
+              <w:t xml:space="preserve">CX bound (line)</w:t>
+            </w:r>
+          </w:p>
+        </w:tc>
+        <w:tc>
+          <w:tcPr/>
+          <w:p>
+            <w:pPr>
+              <w:pStyle w:val="Compact"/>
+              <w:jc w:val="left"/>
+            </w:pPr>
+            <w:r>
+              <w:t xml:space="preserve">exact generic state prep</w:t>
+            </w:r>
+          </w:p>
+        </w:tc>
+      </w:tr>
+      <w:tr>
+        <w:tc>
+          <w:tcPr/>
+          <w:p>
+            <w:pPr>
+              <w:pStyle w:val="Compact"/>
+              <w:jc w:val="left"/>
+            </w:pPr>
+            <w:r>
+              <w:t xml:space="preserve">4</w:t>
+            </w:r>
+          </w:p>
+        </w:tc>
+        <w:tc>
+          <w:tcPr/>
+          <w:p>
+            <w:pPr>
+              <w:pStyle w:val="Compact"/>
+              <w:jc w:val="left"/>
+            </w:pPr>
+            <w:r>
+              <w:t xml:space="preserve">0.0</w:t>
+            </w:r>
+          </w:p>
+        </w:tc>
+        <w:tc>
+          <w:tcPr/>
+          <w:p>
+            <w:pPr>
+              <w:pStyle w:val="Compact"/>
+              <w:jc w:val="left"/>
+            </w:pPr>
+            <w:r>
+              <w:t xml:space="preserve">21</w:t>
+            </w:r>
+          </w:p>
+        </w:tc>
+        <w:tc>
+          <w:tcPr/>
+          <w:p>
+            <w:pPr>
+              <w:pStyle w:val="Compact"/>
+              <w:jc w:val="left"/>
+            </w:pPr>
+            <w:r>
+              <w:t xml:space="preserve">30</w:t>
+            </w:r>
+          </w:p>
+        </w:tc>
+        <w:tc>
+          <w:tcPr/>
+          <w:p>
+            <w:pPr>
+              <w:pStyle w:val="Compact"/>
+              <w:jc w:val="left"/>
+            </w:pPr>
+            <w:r>
+              <w:t xml:space="preserve">88</w:t>
+            </w:r>
+          </w:p>
+        </w:tc>
+        <w:tc>
+          <w:tcPr/>
+          <w:p>
+            <w:pPr>
+              <w:pStyle w:val="Compact"/>
+              <w:jc w:val="left"/>
+            </w:pPr>
+            <w:r>
+              <w:t xml:space="preserve">8</w:t>
+            </w:r>
+          </w:p>
+        </w:tc>
+        <w:tc>
+          <w:tcPr/>
+          <w:p>
+            <w:pPr>
+              <w:pStyle w:val="Compact"/>
+              <w:jc w:val="left"/>
+            </w:pPr>
+            <w:r>
+              <w:t xml:space="preserve">1,848</w:t>
+            </w:r>
+          </w:p>
+        </w:tc>
+        <w:tc>
+          <w:tcPr/>
+          <w:p>
+            <w:pPr>
+              <w:pStyle w:val="Compact"/>
+              <w:jc w:val="left"/>
+            </w:pPr>
+            <w:r>
+              <w:t xml:space="preserve">168</w:t>
+            </w:r>
+          </w:p>
+        </w:tc>
+        <w:tc>
+          <w:tcPr/>
+          <w:p>
+            <w:pPr>
+              <w:pStyle w:val="Compact"/>
+              <w:jc w:val="left"/>
+            </w:pPr>
+            <w:r>
+              <w:t xml:space="preserve">2,640</w:t>
+            </w:r>
+          </w:p>
+        </w:tc>
+        <w:tc>
+          <w:tcPr/>
+          <w:p>
+            <w:pPr>
+              <w:pStyle w:val="Compact"/>
+              <w:jc w:val="left"/>
+            </w:pPr>
+            <w:r>
+              <w:t xml:space="preserve">11</w:t>
+            </w:r>
+          </w:p>
+        </w:tc>
+      </w:tr>
+      <w:tr>
+        <w:tc>
+          <w:tcPr/>
+          <w:p>
+            <w:pPr>
+              <w:pStyle w:val="Compact"/>
+              <w:jc w:val="left"/>
+            </w:pPr>
+            <w:r>
+              <w:t xml:space="preserve">6</w:t>
+            </w:r>
+          </w:p>
+        </w:tc>
+        <w:tc>
+          <w:tcPr/>
+          <w:p>
+            <w:pPr>
+              <w:pStyle w:val="Compact"/>
+              <w:jc w:val="left"/>
+            </w:pPr>
+            <w:r>
+              <w:t xml:space="preserve">0.0</w:t>
+            </w:r>
+          </w:p>
+        </w:tc>
+        <w:tc>
+          <w:tcPr/>
+          <w:p>
+            <w:pPr>
+              <w:pStyle w:val="Compact"/>
+              <w:jc w:val="left"/>
+            </w:pPr>
+            <w:r>
+              <w:t xml:space="preserve">35</w:t>
+            </w:r>
+          </w:p>
+        </w:tc>
+        <w:tc>
+          <w:tcPr/>
+          <w:p>
+            <w:pPr>
+              <w:pStyle w:val="Compact"/>
+              <w:jc w:val="left"/>
+            </w:pPr>
+            <w:r>
+              <w:t xml:space="preserve">65</w:t>
+            </w:r>
+          </w:p>
+        </w:tc>
+        <w:tc>
+          <w:tcPr/>
+          <w:p>
+            <w:pPr>
+              <w:pStyle w:val="Compact"/>
+              <w:jc w:val="left"/>
+            </w:pPr>
+            <w:r>
+              <w:t xml:space="preserve">375</w:t>
+            </w:r>
+          </w:p>
+        </w:tc>
+        <w:tc>
+          <w:tcPr/>
+          <w:p>
+            <w:pPr>
+              <w:pStyle w:val="Compact"/>
+              <w:jc w:val="left"/>
+            </w:pPr>
+            <w:r>
+              <w:t xml:space="preserve">18</w:t>
+            </w:r>
+          </w:p>
+        </w:tc>
+        <w:tc>
+          <w:tcPr/>
+          <w:p>
+            <w:pPr>
+              <w:pStyle w:val="Compact"/>
+              <w:jc w:val="left"/>
+            </w:pPr>
+            <w:r>
+              <w:t xml:space="preserve">13,125</w:t>
+            </w:r>
+          </w:p>
+        </w:tc>
+        <w:tc>
+          <w:tcPr/>
+          <w:p>
+            <w:pPr>
+              <w:pStyle w:val="Compact"/>
+              <w:jc w:val="left"/>
+            </w:pPr>
+            <w:r>
+              <w:t xml:space="preserve">630</w:t>
+            </w:r>
+          </w:p>
+        </w:tc>
+        <w:tc>
+          <w:tcPr/>
+          <w:p>
+            <w:pPr>
+              <w:pStyle w:val="Compact"/>
+              <w:jc w:val="left"/>
+            </w:pPr>
+            <w:r>
+              <w:t xml:space="preserve">24,375</w:t>
+            </w:r>
+          </w:p>
+        </w:tc>
+        <w:tc>
+          <w:tcPr/>
+          <w:p>
+            <w:pPr>
+              <w:pStyle w:val="Compact"/>
+              <w:jc w:val="left"/>
+            </w:pPr>
+            <w:r>
+              <w:t xml:space="preserve">57</w:t>
+            </w:r>
+          </w:p>
+        </w:tc>
+      </w:tr>
+      <w:tr>
+        <w:tc>
+          <w:tcPr/>
+          <w:p>
+            <w:pPr>
+              <w:pStyle w:val="Compact"/>
+              <w:jc w:val="left"/>
+            </w:pPr>
+            <w:r>
+              <w:t xml:space="preserve">8</w:t>
+            </w:r>
+          </w:p>
+        </w:tc>
+        <w:tc>
+          <w:tcPr/>
+          <w:p>
+            <w:pPr>
+              <w:pStyle w:val="Compact"/>
+              <w:jc w:val="left"/>
+            </w:pPr>
+            <w:r>
+              <w:t xml:space="preserve">0.0</w:t>
+            </w:r>
+          </w:p>
+        </w:tc>
+        <w:tc>
+          <w:tcPr/>
+          <w:p>
+            <w:pPr>
+              <w:pStyle w:val="Compact"/>
+              <w:jc w:val="left"/>
+            </w:pPr>
+            <w:r>
+              <w:t xml:space="preserve">49</w:t>
+            </w:r>
+          </w:p>
+        </w:tc>
+        <w:tc>
+          <w:tcPr/>
+          <w:p>
+            <w:pPr>
+              <w:pStyle w:val="Compact"/>
+              <w:jc w:val="left"/>
+            </w:pPr>
+            <w:r>
+              <w:t xml:space="preserve">102</w:t>
+            </w:r>
+          </w:p>
+        </w:tc>
+        <w:tc>
+          <w:tcPr/>
+          <w:p>
+            <w:pPr>
+              <w:pStyle w:val="Compact"/>
+              <w:jc w:val="left"/>
+            </w:pPr>
+            <w:r>
+              <w:t xml:space="preserve">992</w:t>
+            </w:r>
+          </w:p>
+        </w:tc>
+        <w:tc>
+          <w:tcPr/>
+          <w:p>
+            <w:pPr>
+              <w:pStyle w:val="Compact"/>
+              <w:jc w:val="left"/>
+            </w:pPr>
+            <w:r>
+              <w:t xml:space="preserve">37</w:t>
+            </w:r>
+          </w:p>
+        </w:tc>
+        <w:tc>
+          <w:tcPr/>
+          <w:p>
+            <w:pPr>
+              <w:pStyle w:val="Compact"/>
+              <w:jc w:val="left"/>
+            </w:pPr>
+            <w:r>
+              <w:t xml:space="preserve">48,608</w:t>
+            </w:r>
+          </w:p>
+        </w:tc>
+        <w:tc>
+          <w:tcPr/>
+          <w:p>
+            <w:pPr>
+              <w:pStyle w:val="Compact"/>
+              <w:jc w:val="left"/>
+            </w:pPr>
+            <w:r>
+              <w:t xml:space="preserve">1,813</w:t>
+            </w:r>
+          </w:p>
+        </w:tc>
+        <w:tc>
+          <w:tcPr/>
+          <w:p>
+            <w:pPr>
+              <w:pStyle w:val="Compact"/>
+              <w:jc w:val="left"/>
+            </w:pPr>
+            <w:r>
+              <w:t xml:space="preserve">101,184</w:t>
+            </w:r>
+          </w:p>
+        </w:tc>
+        <w:tc>
+          <w:tcPr/>
+          <w:p>
+            <w:pPr>
+              <w:pStyle w:val="Compact"/>
+              <w:jc w:val="left"/>
+            </w:pPr>
+            <w:r>
+              <w:t xml:space="preserve">247</w:t>
+            </w:r>
+          </w:p>
+        </w:tc>
+      </w:tr>
+      <w:tr>
+        <w:tc>
+          <w:tcPr/>
+          <w:p>
+            <w:pPr>
+              <w:pStyle w:val="Compact"/>
+              <w:jc w:val="left"/>
+            </w:pPr>
+            <w:r>
+              <w:t xml:space="preserve">10</w:t>
+            </w:r>
+          </w:p>
+        </w:tc>
+        <w:tc>
+          <w:tcPr/>
+          <w:p>
+            <w:pPr>
+              <w:pStyle w:val="Compact"/>
+              <w:jc w:val="left"/>
+            </w:pPr>
+            <w:r>
+              <w:t xml:space="preserve">0.0</w:t>
+            </w:r>
+          </w:p>
+        </w:tc>
+        <w:tc>
+          <w:tcPr/>
+          <w:p>
+            <w:pPr>
+              <w:pStyle w:val="Compact"/>
+              <w:jc w:val="left"/>
+            </w:pPr>
+            <w:r>
+              <w:t xml:space="preserve">63</w:t>
+            </w:r>
+          </w:p>
+        </w:tc>
+        <w:tc>
+          <w:tcPr/>
+          <w:p>
+            <w:pPr>
+              <w:pStyle w:val="Compact"/>
+              <w:jc w:val="left"/>
+            </w:pPr>
+            <w:r>
+              <w:t xml:space="preserve">149</w:t>
+            </w:r>
+          </w:p>
+        </w:tc>
+        <w:tc>
+          <w:tcPr/>
+          <w:p>
+            <w:pPr>
+              <w:pStyle w:val="Compact"/>
+              <w:jc w:val="left"/>
+            </w:pPr>
+            <w:r>
+              <w:t xml:space="preserve">2183</w:t>
+            </w:r>
+          </w:p>
+        </w:tc>
+        <w:tc>
+          <w:tcPr/>
+          <w:p>
+            <w:pPr>
+              <w:pStyle w:val="Compact"/>
+              <w:jc w:val="left"/>
+            </w:pPr>
+            <w:r>
+              <w:t xml:space="preserve">74</w:t>
+            </w:r>
+          </w:p>
+        </w:tc>
+        <w:tc>
+          <w:tcPr/>
+          <w:p>
+            <w:pPr>
+              <w:pStyle w:val="Compact"/>
+              <w:jc w:val="left"/>
+            </w:pPr>
+            <w:r>
+              <w:t xml:space="preserve">137,529</w:t>
+            </w:r>
+          </w:p>
+        </w:tc>
+        <w:tc>
+          <w:tcPr/>
+          <w:p>
+            <w:pPr>
+              <w:pStyle w:val="Compact"/>
+              <w:jc w:val="left"/>
+            </w:pPr>
+            <w:r>
+              <w:t xml:space="preserve">4,662</w:t>
+            </w:r>
+          </w:p>
+        </w:tc>
+        <w:tc>
+          <w:tcPr/>
+          <w:p>
+            <w:pPr>
+              <w:pStyle w:val="Compact"/>
+              <w:jc w:val="left"/>
+            </w:pPr>
+            <w:r>
+              <w:t xml:space="preserve">325,267</w:t>
+            </w:r>
+          </w:p>
+        </w:tc>
+        <w:tc>
+          <w:tcPr/>
+          <w:p>
+            <w:pPr>
+              <w:pStyle w:val="Compact"/>
+              <w:jc w:val="left"/>
+            </w:pPr>
+            <w:r>
+              <w:t xml:space="preserve">1,013</w:t>
+            </w:r>
+          </w:p>
+        </w:tc>
+      </w:tr>
+      <w:tr>
+        <w:tc>
+          <w:tcPr/>
+          <w:p>
+            <w:pPr>
+              <w:pStyle w:val="Compact"/>
+              <w:jc w:val="left"/>
+            </w:pPr>
+            <w:r>
+              <w:t xml:space="preserve">12</w:t>
+            </w:r>
+          </w:p>
+        </w:tc>
+        <w:tc>
+          <w:tcPr/>
+          <w:p>
+            <w:pPr>
+              <w:pStyle w:val="Compact"/>
+              <w:jc w:val="left"/>
+            </w:pPr>
+            <w:r>
+              <w:t xml:space="preserve">0.0</w:t>
+            </w:r>
+          </w:p>
+        </w:tc>
+        <w:tc>
+          <w:tcPr/>
+          <w:p>
+            <w:pPr>
+              <w:pStyle w:val="Compact"/>
+              <w:jc w:val="left"/>
+            </w:pPr>
+            <w:r>
+              <w:t xml:space="preserve">77</w:t>
+            </w:r>
+          </w:p>
+        </w:tc>
+        <w:tc>
+          <w:tcPr/>
+          <w:p>
+            <w:pPr>
+              <w:pStyle w:val="Compact"/>
+              <w:jc w:val="left"/>
+            </w:pPr>
+            <w:r>
+              <w:t xml:space="preserve">196</w:t>
+            </w:r>
+          </w:p>
+        </w:tc>
+        <w:tc>
+          <w:tcPr/>
+          <w:p>
+            <w:pPr>
+              <w:pStyle w:val="Compact"/>
+              <w:jc w:val="left"/>
+            </w:pPr>
+            <w:r>
+              <w:t xml:space="preserve">6967</w:t>
+            </w:r>
+          </w:p>
+        </w:tc>
+        <w:tc>
+          <w:tcPr/>
+          <w:p>
+            <w:pPr>
+              <w:pStyle w:val="Compact"/>
+              <w:jc w:val="left"/>
+            </w:pPr>
+            <w:r>
+              <w:t xml:space="preserve">117</w:t>
+            </w:r>
+          </w:p>
+        </w:tc>
+        <w:tc>
+          <w:tcPr/>
+          <w:p>
+            <w:pPr>
+              <w:pStyle w:val="Compact"/>
+              <w:jc w:val="left"/>
+            </w:pPr>
+            <w:r>
+              <w:t xml:space="preserve">536,459</w:t>
+            </w:r>
+          </w:p>
+        </w:tc>
+        <w:tc>
+          <w:tcPr/>
+          <w:p>
+            <w:pPr>
+              <w:pStyle w:val="Compact"/>
+              <w:jc w:val="left"/>
+            </w:pPr>
+            <w:r>
+              <w:t xml:space="preserve">9,009</w:t>
+            </w:r>
+          </w:p>
+        </w:tc>
+        <w:tc>
+          <w:tcPr/>
+          <w:p>
+            <w:pPr>
+              <w:pStyle w:val="Compact"/>
+              <w:jc w:val="left"/>
+            </w:pPr>
+            <w:r>
+              <w:t xml:space="preserve">1,365,532</w:t>
+            </w:r>
+          </w:p>
+        </w:tc>
+        <w:tc>
+          <w:tcPr/>
+          <w:p>
+            <w:pPr>
+              <w:pStyle w:val="Compact"/>
+              <w:jc w:val="left"/>
+            </w:pPr>
+            <w:r>
+              <w:t xml:space="preserve">4,083</w:t>
+            </w:r>
+          </w:p>
+        </w:tc>
+      </w:tr>
+      <w:tr>
+        <w:tc>
+          <w:tcPr/>
+          <w:p>
+            <w:pPr>
+              <w:pStyle w:val="Compact"/>
+              <w:jc w:val="left"/>
+            </w:pPr>
+            <w:r>
+              <w:t xml:space="preserve">6</w:t>
+            </w:r>
+          </w:p>
+        </w:tc>
+        <w:tc>
+          <w:tcPr/>
+          <w:p>
+            <w:pPr>
+              <w:pStyle w:val="Compact"/>
+              <w:jc w:val="left"/>
+            </w:pPr>
+            <w:r>
+              <w:t xml:space="preserve">0.4</w:t>
+            </w:r>
+          </w:p>
+        </w:tc>
+        <w:tc>
+          <w:tcPr/>
+          <w:p>
+            <w:pPr>
+              <w:pStyle w:val="Compact"/>
+              <w:jc w:val="left"/>
+            </w:pPr>
+            <w:r>
+              <w:t xml:space="preserve">63</w:t>
+            </w:r>
+          </w:p>
+        </w:tc>
+        <w:tc>
+          <w:tcPr/>
+          <w:p>
+            <w:pPr>
+              <w:pStyle w:val="Compact"/>
+              <w:jc w:val="left"/>
+            </w:pPr>
+            <w:r>
+              <w:t xml:space="preserve">120</w:t>
+            </w:r>
+          </w:p>
+        </w:tc>
+        <w:tc>
+          <w:tcPr/>
+          <w:p>
+            <w:pPr>
+              <w:pStyle w:val="Compact"/>
+              <w:jc w:val="left"/>
+            </w:pPr>
+            <w:r>
+              <w:t xml:space="preserve">405</w:t>
+            </w:r>
+          </w:p>
+        </w:tc>
+        <w:tc>
+          <w:tcPr/>
+          <w:p>
+            <w:pPr>
+              <w:pStyle w:val="Compact"/>
+              <w:jc w:val="left"/>
+            </w:pPr>
+            <w:r>
+              <w:t xml:space="preserve">29</w:t>
+            </w:r>
+          </w:p>
+        </w:tc>
+        <w:tc>
+          <w:tcPr/>
+          <w:p>
+            <w:pPr>
+              <w:pStyle w:val="Compact"/>
+              <w:jc w:val="left"/>
+            </w:pPr>
+            <w:r>
+              <w:t xml:space="preserve">25,515</w:t>
+            </w:r>
+          </w:p>
+        </w:tc>
+        <w:tc>
+          <w:tcPr/>
+          <w:p>
+            <w:pPr>
+              <w:pStyle w:val="Compact"/>
+              <w:jc w:val="left"/>
+            </w:pPr>
+            <w:r>
+              <w:t xml:space="preserve">1,827</w:t>
+            </w:r>
+          </w:p>
+        </w:tc>
+        <w:tc>
+          <w:tcPr/>
+          <w:p>
+            <w:pPr>
+              <w:pStyle w:val="Compact"/>
+              <w:jc w:val="left"/>
+            </w:pPr>
+            <w:r>
+              <w:t xml:space="preserve">48,465</w:t>
+            </w:r>
+          </w:p>
+        </w:tc>
+        <w:tc>
+          <w:tcPr/>
+          <w:p>
+            <w:pPr>
+              <w:pStyle w:val="Compact"/>
+              <w:jc w:val="left"/>
+            </w:pPr>
+            <w:r>
+              <w:t xml:space="preserve">57</w:t>
+            </w:r>
+          </w:p>
+        </w:tc>
+      </w:tr>
+      <w:tr>
+        <w:tc>
+          <w:tcPr/>
+          <w:p>
+            <w:pPr>
+              <w:pStyle w:val="Compact"/>
+              <w:jc w:val="left"/>
+            </w:pPr>
+            <w:r>
+              <w:t xml:space="preserve">8</w:t>
+            </w:r>
+          </w:p>
+        </w:tc>
+        <w:tc>
+          <w:tcPr/>
+          <w:p>
+            <w:pPr>
+              <w:pStyle w:val="Compact"/>
+              <w:jc w:val="left"/>
+            </w:pPr>
+            <w:r>
+              <w:t xml:space="preserve">0.4</w:t>
+            </w:r>
+          </w:p>
+        </w:tc>
+        <w:tc>
+          <w:tcPr/>
+          <w:p>
+            <w:pPr>
+              <w:pStyle w:val="Compact"/>
+              <w:jc w:val="left"/>
+            </w:pPr>
+            <w:r>
+              <w:t xml:space="preserve">91</w:t>
+            </w:r>
+          </w:p>
+        </w:tc>
+        <w:tc>
+          <w:tcPr/>
+          <w:p>
+            <w:pPr>
+              <w:pStyle w:val="Compact"/>
+              <w:jc w:val="left"/>
+            </w:pPr>
+            <w:r>
+              <w:t xml:space="preserve">197</w:t>
+            </w:r>
+          </w:p>
+        </w:tc>
+        <w:tc>
+          <w:tcPr/>
+          <w:p>
+            <w:pPr>
+              <w:pStyle w:val="Compact"/>
+              <w:jc w:val="left"/>
+            </w:pPr>
+            <w:r>
+              <w:t xml:space="preserve">1075</w:t>
+            </w:r>
+          </w:p>
+        </w:tc>
+        <w:tc>
+          <w:tcPr/>
+          <w:p>
+            <w:pPr>
+              <w:pStyle w:val="Compact"/>
+              <w:jc w:val="left"/>
+            </w:pPr>
+            <w:r>
+              <w:t xml:space="preserve">47</w:t>
+            </w:r>
+          </w:p>
+        </w:tc>
+        <w:tc>
+          <w:tcPr/>
+          <w:p>
+            <w:pPr>
+              <w:pStyle w:val="Compact"/>
+              <w:jc w:val="left"/>
+            </w:pPr>
+            <w:r>
+              <w:t xml:space="preserve">97,825</w:t>
+            </w:r>
+          </w:p>
+        </w:tc>
+        <w:tc>
+          <w:tcPr/>
+          <w:p>
+            <w:pPr>
+              <w:pStyle w:val="Compact"/>
+              <w:jc w:val="left"/>
+            </w:pPr>
+            <w:r>
+              <w:t xml:space="preserve">4,277</w:t>
+            </w:r>
+          </w:p>
+        </w:tc>
+        <w:tc>
+          <w:tcPr/>
+          <w:p>
+            <w:pPr>
+              <w:pStyle w:val="Compact"/>
+              <w:jc w:val="left"/>
+            </w:pPr>
+            <w:r>
+              <w:t xml:space="preserve">212,133</w:t>
+            </w:r>
+          </w:p>
+        </w:tc>
+        <w:tc>
+          <w:tcPr/>
+          <w:p>
+            <w:pPr>
+              <w:pStyle w:val="Compact"/>
+              <w:jc w:val="left"/>
+            </w:pPr>
+            <w:r>
+              <w:t xml:space="preserve">247</w:t>
+            </w:r>
+          </w:p>
+        </w:tc>
+      </w:tr>
+      <w:tr>
+        <w:tc>
+          <w:tcPr/>
+          <w:p>
+            <w:pPr>
+              <w:pStyle w:val="Compact"/>
+              <w:jc w:val="left"/>
+            </w:pPr>
+            <w:r>
+              <w:t xml:space="preserve">10</w:t>
+            </w:r>
+          </w:p>
+        </w:tc>
+        <w:tc>
+          <w:tcPr/>
+          <w:p>
+            <w:pPr>
+              <w:pStyle w:val="Compact"/>
+              <w:jc w:val="left"/>
+            </w:pPr>
+            <w:r>
+              <w:t xml:space="preserve">0.4</w:t>
+            </w:r>
+          </w:p>
+        </w:tc>
+        <w:tc>
+          <w:tcPr/>
+          <w:p>
+            <w:pPr>
+              <w:pStyle w:val="Compact"/>
+              <w:jc w:val="left"/>
+            </w:pPr>
+            <w:r>
+              <w:t xml:space="preserve">119</w:t>
+            </w:r>
+          </w:p>
+        </w:tc>
+        <w:tc>
+          <w:tcPr/>
+          <w:p>
+            <w:pPr>
+              <w:pStyle w:val="Compact"/>
+              <w:jc w:val="left"/>
+            </w:pPr>
+            <w:r>
+              <w:t xml:space="preserve">288</w:t>
+            </w:r>
+          </w:p>
+        </w:tc>
+        <w:tc>
+          <w:tcPr/>
+          <w:p>
+            <w:pPr>
+              <w:pStyle w:val="Compact"/>
+              <w:jc w:val="left"/>
+            </w:pPr>
+            <w:r>
+              <w:t xml:space="preserve">2256</w:t>
+            </w:r>
+          </w:p>
+        </w:tc>
+        <w:tc>
+          <w:tcPr/>
+          <w:p>
+            <w:pPr>
+              <w:pStyle w:val="Compact"/>
+              <w:jc w:val="left"/>
+            </w:pPr>
+            <w:r>
+              <w:t xml:space="preserve">59</w:t>
+            </w:r>
+          </w:p>
+        </w:tc>
+        <w:tc>
+          <w:tcPr/>
+          <w:p>
+            <w:pPr>
+              <w:pStyle w:val="Compact"/>
+              <w:jc w:val="left"/>
+            </w:pPr>
+            <w:r>
+              <w:t xml:space="preserve">268,464</w:t>
+            </w:r>
+          </w:p>
+        </w:tc>
+        <w:tc>
+          <w:tcPr/>
+          <w:p>
+            <w:pPr>
+              <w:pStyle w:val="Compact"/>
+              <w:jc w:val="left"/>
+            </w:pPr>
+            <w:r>
+              <w:t xml:space="preserve">7,021</w:t>
+            </w:r>
+          </w:p>
+        </w:tc>
+        <w:tc>
+          <w:tcPr/>
+          <w:p>
+            <w:pPr>
+              <w:pStyle w:val="Compact"/>
+              <w:jc w:val="left"/>
+            </w:pPr>
+            <w:r>
+              <w:t xml:space="preserve">649,728</w:t>
+            </w:r>
+          </w:p>
+        </w:tc>
+        <w:tc>
+          <w:tcPr/>
+          <w:p>
+            <w:pPr>
+              <w:pStyle w:val="Compact"/>
+              <w:jc w:val="left"/>
+            </w:pPr>
+            <w:r>
+              <w:t xml:space="preserve">1,013</w:t>
+            </w:r>
+          </w:p>
+        </w:tc>
+      </w:tr>
+      <w:tr>
+        <w:tc>
+          <w:tcPr/>
+          <w:p>
+            <w:pPr>
+              <w:pStyle w:val="Compact"/>
+              <w:jc w:val="left"/>
+            </w:pPr>
+            <w:r>
+              <w:t xml:space="preserve">12</w:t>
+            </w:r>
+          </w:p>
+        </w:tc>
+        <w:tc>
+          <w:tcPr/>
+          <w:p>
+            <w:pPr>
+              <w:pStyle w:val="Compact"/>
+              <w:jc w:val="left"/>
+            </w:pPr>
+            <w:r>
+              <w:t xml:space="preserve">0.4</w:t>
+            </w:r>
+          </w:p>
+        </w:tc>
+        <w:tc>
+          <w:tcPr/>
+          <w:p>
+            <w:pPr>
+              <w:pStyle w:val="Compact"/>
+              <w:jc w:val="left"/>
+            </w:pPr>
+            <w:r>
+              <w:t xml:space="preserve">147</w:t>
+            </w:r>
+          </w:p>
+        </w:tc>
+        <w:tc>
+          <w:tcPr/>
+          <w:p>
+            <w:pPr>
+              <w:pStyle w:val="Compact"/>
+              <w:jc w:val="left"/>
+            </w:pPr>
+            <w:r>
+              <w:t xml:space="preserve">388</w:t>
+            </w:r>
+          </w:p>
+        </w:tc>
+        <w:tc>
+          <w:tcPr/>
+          <w:p>
+            <w:pPr>
+              <w:pStyle w:val="Compact"/>
+              <w:jc w:val="left"/>
+            </w:pPr>
+            <w:r>
+              <w:t xml:space="preserve">4060</w:t>
+            </w:r>
+          </w:p>
+        </w:tc>
+        <w:tc>
+          <w:tcPr/>
+          <w:p>
+            <w:pPr>
+              <w:pStyle w:val="Compact"/>
+              <w:jc w:val="left"/>
+            </w:pPr>
+            <w:r>
+              <w:t xml:space="preserve">93</w:t>
+            </w:r>
+          </w:p>
+        </w:tc>
+        <w:tc>
+          <w:tcPr/>
+          <w:p>
+            <w:pPr>
+              <w:pStyle w:val="Compact"/>
+              <w:jc w:val="left"/>
+            </w:pPr>
+            <w:r>
+              <w:t xml:space="preserve">596,820</w:t>
+            </w:r>
+          </w:p>
+        </w:tc>
+        <w:tc>
+          <w:tcPr/>
+          <w:p>
+            <w:pPr>
+              <w:pStyle w:val="Compact"/>
+              <w:jc w:val="left"/>
+            </w:pPr>
+            <w:r>
+              <w:t xml:space="preserve">13,671</w:t>
+            </w:r>
+          </w:p>
+        </w:tc>
+        <w:tc>
+          <w:tcPr/>
+          <w:p>
+            <w:pPr>
+              <w:pStyle w:val="Compact"/>
+              <w:jc w:val="left"/>
+            </w:pPr>
+            <w:r>
+              <w:t xml:space="preserve">1,573,927</w:t>
+            </w:r>
+          </w:p>
+        </w:tc>
+        <w:tc>
+          <w:tcPr/>
+          <w:p>
+            <w:pPr>
+              <w:pStyle w:val="Compact"/>
+              <w:jc w:val="left"/>
+            </w:pPr>
+            <w:r>
+              <w:t xml:space="preserve">4,083</w:t>
+            </w:r>
+          </w:p>
+        </w:tc>
+      </w:tr>
+    </w:tbl>
+    <w:p>
+      <w:pPr>
+        <w:pStyle w:val="BodyText"/>
+      </w:pPr>
+      <w:r>
+        <w:rPr>
+          <w:iCs/>
+          <w:i/>
+        </w:rPr>
+        <w:t xml:space="preserve">Table 5.</w:t>
+      </w:r>
+      <w:r>
+        <w:t xml:space="preserve"> </w:t>
+      </w:r>
+      <m:oMath>
+        <m:r>
+          <m:t>ε</m:t>
+        </m:r>
+        <m:r>
+          <m:rPr>
+            <m:sty m:val="p"/>
+          </m:rPr>
+          <m:t>=</m:t>
+        </m:r>
+        <m:sSup>
+          <m:e>
+            <m:r>
+              <m:t>10</m:t>
+            </m:r>
+          </m:e>
+          <m:sup>
+            <m:r>
+              <m:rPr>
+                <m:sty m:val="p"/>
+              </m:rPr>
+              <m:t>−</m:t>
+            </m:r>
+            <m:r>
+              <m:t>2</m:t>
+            </m:r>
+          </m:sup>
+        </m:sSup>
+      </m:oMath>
+      <w:r>
+        <w:t xml:space="preserve">,</w:t>
+      </w:r>
+      <w:r>
+        <w:t xml:space="preserve"> </w:t>
+      </w:r>
+      <m:oMath>
+        <m:r>
+          <m:t>χ</m:t>
+        </m:r>
+        <m:r>
+          <m:rPr>
+            <m:sty m:val="p"/>
+          </m:rPr>
+          <m:t>=</m:t>
+        </m:r>
+        <m:r>
+          <m:t>2</m:t>
+        </m:r>
+      </m:oMath>
+      <w:r>
+        <w:t xml:space="preserve">. CX totals are</w:t>
+      </w:r>
+      <w:r>
+        <w:t xml:space="preserve"> </w:t>
+      </w:r>
+      <m:oMath>
+        <m:r>
+          <m:t>n</m:t>
+        </m:r>
+        <m:r>
+          <m:rPr>
+            <m:sty m:val="p"/>
+          </m:rPr>
+          <m:t>×</m:t>
+        </m:r>
+      </m:oMath>
+      <w:r>
+        <w:t xml:space="preserve"> </w:t>
+      </w:r>
+      <w:r>
+        <w:t xml:space="preserve">per-step CX, for the step count prescribed by the bound and for the oracle measured step count. The last column is qiskit’s exact preparation of a generic</w:t>
+      </w:r>
+      <w:r>
+        <w:t xml:space="preserve"> </w:t>
+      </w:r>
+      <m:oMath>
+        <m:r>
+          <m:t>N</m:t>
+        </m:r>
+      </m:oMath>
+      <w:r>
+        <w:t xml:space="preserve">-qubit state (no structure used).</w:t>
+      </w:r>
+    </w:p>
+    <w:p>
+      <w:pPr>
+        <w:pStyle w:val="CaptionedFigure"/>
+      </w:pPr>
+      <w:r>
+        <w:drawing>
+          <wp:inline>
+            <wp:extent cx="2933700" cy="2331915"/>
+            <wp:effectExtent b="0" l="0" r="0" t="0"/>
+            <wp:docPr descr="Figure 4. CX count vs. N." title="" id="46" name="Picture"/>
+            <a:graphic>
+              <a:graphicData uri="http://schemas.openxmlformats.org/drawingml/2006/picture">
+                <pic:pic>
+                  <pic:nvPicPr>
+                    <pic:cNvPr descr="figs/fig_cx.png" id="47" name="Picture"/>
+                    <pic:cNvPicPr>
+                      <a:picLocks noChangeArrowheads="1" noChangeAspect="1"/>
+                    </pic:cNvPicPr>
+                  </pic:nvPicPr>
+                  <pic:blipFill>
+                    <a:blip r:embed="rId45"/>
+                    <a:stretch>
+                      <a:fillRect/>
+                    </a:stretch>
+                  </pic:blipFill>
+                  <pic:spPr bwMode="auto">
+                    <a:xfrm>
+                      <a:off x="0" y="0"/>
+                      <a:ext cx="2933700" cy="2331915"/>
+                    </a:xfrm>
+                    <a:prstGeom prst="rect">
+                      <a:avLst/>
+                    </a:prstGeom>
+                    <a:noFill/>
+                    <a:ln w="9525">
+                      <a:noFill/>
+                      <a:headEnd/>
+                      <a:tailEnd/>
+                    </a:ln>
+                  </pic:spPr>
+                </pic:pic>
+              </a:graphicData>
+            </a:graphic>
+          </wp:inline>
+        </w:drawing>
+      </w:r>
+    </w:p>
+    <w:p>
+      <w:pPr>
+        <w:pStyle w:val="ImageCaption"/>
+      </w:pPr>
+      <w:r>
+        <w:t xml:space="preserve">Figure 4. CX count vs. </w:t>
+      </w:r>
+      <m:oMath>
+        <m:r>
+          <m:t>N</m:t>
+        </m:r>
+      </m:oMath>
+      <w:r>
+        <w:t xml:space="preserve">.</w:t>
+      </w:r>
+    </w:p>
+    <w:p>
+      <w:pPr>
+        <w:numPr>
+          <w:ilvl w:val="0"/>
+          <w:numId w:val="1007"/>
+        </w:numPr>
+        <w:pStyle w:val="Compact"/>
+      </w:pPr>
+      <w:r>
+        <w:rPr>
+          <w:bCs/>
+          <w:b/>
+        </w:rPr>
+        <w:t xml:space="preserve">Per step.</w:t>
+      </w:r>
+      <w:r>
+        <w:t xml:space="preserve"> </w:t>
+      </w:r>
+      <w:r>
+        <w:t xml:space="preserve">CX per step grows as</w:t>
+      </w:r>
+      <w:r>
+        <w:t xml:space="preserve"> </w:t>
+      </w:r>
+      <m:oMath>
+        <m:sSup>
+          <m:e>
+            <m:r>
+              <m:t>N</m:t>
+            </m:r>
+          </m:e>
+          <m:sup>
+            <m:r>
+              <m:t>1.1</m:t>
+            </m:r>
+          </m:sup>
+        </m:sSup>
+      </m:oMath>
+      <w:r>
+        <w:t xml:space="preserve"> </w:t>
+      </w:r>
+      <w:r>
+        <w:t xml:space="preserve">(</w:t>
+      </w:r>
+      <m:oMath>
+        <m:sSub>
+          <m:e>
+            <m:r>
+              <m:t>J</m:t>
+            </m:r>
+          </m:e>
+          <m:sub>
+            <m:r>
+              <m:t>2</m:t>
+            </m:r>
+          </m:sub>
+        </m:sSub>
+        <m:r>
+          <m:rPr>
+            <m:sty m:val="p"/>
+          </m:rPr>
+          <m:t>=</m:t>
+        </m:r>
+        <m:r>
+          <m:t>0</m:t>
+        </m:r>
+      </m:oMath>
+      <w:r>
+        <w:t xml:space="preserve">) and</w:t>
+      </w:r>
+      <w:r>
+        <w:t xml:space="preserve"> </w:t>
+      </w:r>
+      <m:oMath>
+        <m:sSup>
+          <m:e>
+            <m:r>
+              <m:t>N</m:t>
+            </m:r>
+          </m:e>
+          <m:sup>
+            <m:r>
+              <m:t>1.2</m:t>
+            </m:r>
+          </m:sup>
+        </m:sSup>
+      </m:oMath>
+      <w:r>
+        <w:t xml:space="preserve"> </w:t>
+      </w:r>
+      <w:r>
+        <w:t xml:space="preserve">(</w:t>
+      </w:r>
+      <m:oMath>
+        <m:sSub>
+          <m:e>
+            <m:r>
+              <m:t>J</m:t>
+            </m:r>
+          </m:e>
+          <m:sub>
+            <m:r>
+              <m:t>2</m:t>
+            </m:r>
+          </m:sub>
+        </m:sSub>
+        <m:r>
+          <m:rPr>
+            <m:sty m:val="p"/>
+          </m:rPr>
+          <m:t>=</m:t>
+        </m:r>
+        <m:r>
+          <m:t>0.4</m:t>
+        </m:r>
+      </m:oMath>
+      <w:r>
+        <w:t xml:space="preserve">): linear in the number of bonds, with</w:t>
+      </w:r>
+      <w:r>
+        <w:t xml:space="preserve"> </w:t>
+      </w:r>
+      <m:oMath>
+        <m:sSub>
+          <m:e>
+            <m:r>
+              <m:t>J</m:t>
+            </m:r>
+          </m:e>
+          <m:sub>
+            <m:r>
+              <m:t>2</m:t>
+            </m:r>
+          </m:sub>
+        </m:sSub>
+        <m:r>
+          <m:rPr>
+            <m:sty m:val="p"/>
+          </m:rPr>
+          <m:t>=</m:t>
+        </m:r>
+        <m:r>
+          <m:t>0.4</m:t>
+        </m:r>
+      </m:oMath>
+      <w:r>
+        <w:t xml:space="preserve"> </w:t>
+      </w:r>
+      <w:r>
+        <w:t xml:space="preserve">about twice as expensive (twice as many bonds, plus longer-range gates). A line with the ancilla at the end costs about</w:t>
+      </w:r>
+      <w:r>
+        <w:t xml:space="preserve"> </w:t>
+      </w:r>
+      <m:oMath>
+        <m:r>
+          <m:t>1.4</m:t>
+        </m:r>
+      </m:oMath>
+      <w:r>
+        <w:t xml:space="preserve">–</w:t>
+      </w:r>
+      <m:oMath>
+        <m:r>
+          <m:t>2.6</m:t>
+        </m:r>
+        <m:r>
+          <m:rPr>
+            <m:sty m:val="p"/>
+          </m:rPr>
+          <m:t>×</m:t>
+        </m:r>
+      </m:oMath>
+      <w:r>
+        <w:t xml:space="preserve"> </w:t>
+      </w:r>
+      <w:r>
+        <w:t xml:space="preserve">more.</w:t>
+      </w:r>
+    </w:p>
+    <w:p>
+      <w:pPr>
+        <w:numPr>
+          <w:ilvl w:val="0"/>
+          <w:numId w:val="1007"/>
+        </w:numPr>
+        <w:pStyle w:val="Compact"/>
+      </w:pPr>
+      <w:r>
+        <w:rPr>
+          <w:bCs/>
+          <w:b/>
+        </w:rPr>
+        <w:t xml:space="preserve">Steps.</w:t>
+      </w:r>
+      <w:r>
+        <w:t xml:space="preserve"> </w:t>
+      </w:r>
+      <w:r>
+        <w:t xml:space="preserve">The bound’s</w:t>
+      </w:r>
+      <w:r>
+        <w:t xml:space="preserve"> </w:t>
+      </w:r>
+      <m:oMath>
+        <m:r>
+          <m:t>n</m:t>
+        </m:r>
+      </m:oMath>
+      <w:r>
+        <w:t xml:space="preserve"> </w:t>
+      </w:r>
+      <w:r>
+        <w:t xml:space="preserve">grows as</w:t>
+      </w:r>
+      <w:r>
+        <w:t xml:space="preserve"> </w:t>
+      </w:r>
+      <m:oMath>
+        <m:sSup>
+          <m:e>
+            <m:r>
+              <m:t>N</m:t>
+            </m:r>
+          </m:e>
+          <m:sup>
+            <m:r>
+              <m:t>4.1</m:t>
+            </m:r>
+          </m:sup>
+        </m:sSup>
+      </m:oMath>
+      <w:r>
+        <w:t xml:space="preserve"> </w:t>
+      </w:r>
+      <w:r>
+        <w:t xml:space="preserve">(</w:t>
+      </w:r>
+      <m:oMath>
+        <m:sSub>
+          <m:e>
+            <m:r>
+              <m:t>J</m:t>
+            </m:r>
+          </m:e>
+          <m:sub>
+            <m:r>
+              <m:t>2</m:t>
+            </m:r>
+          </m:sub>
+        </m:sSub>
+        <m:r>
+          <m:rPr>
+            <m:sty m:val="p"/>
+          </m:rPr>
+          <m:t>=</m:t>
+        </m:r>
+        <m:r>
+          <m:t>0</m:t>
+        </m:r>
+      </m:oMath>
+      <w:r>
+        <w:t xml:space="preserve">), the measured one as</w:t>
+      </w:r>
+      <w:r>
+        <w:t xml:space="preserve"> </w:t>
+      </w:r>
+      <m:oMath>
+        <m:sSup>
+          <m:e>
+            <m:r>
+              <m:t>N</m:t>
+            </m:r>
+          </m:e>
+          <m:sup>
+            <m:r>
+              <m:t>2.7</m:t>
+            </m:r>
+          </m:sup>
+        </m:sSup>
+      </m:oMath>
+      <w:r>
+        <w:t xml:space="preserve">: the bound’s growth reflects</w:t>
+      </w:r>
+      <w:r>
+        <w:t xml:space="preserve"> </w:t>
+      </w:r>
+      <m:oMath>
+        <m:sSup>
+          <m:e>
+            <m:r>
+              <m:t>T</m:t>
+            </m:r>
+          </m:e>
+          <m:sup>
+            <m:r>
+              <m:t>2</m:t>
+            </m:r>
+          </m:sup>
+        </m:sSup>
+        <m:r>
+          <m:rPr>
+            <m:sty m:val="p"/>
+          </m:rPr>
+          <m:t>∝</m:t>
+        </m:r>
+        <m:sSup>
+          <m:e>
+            <m:r>
+              <m:t>Δ</m:t>
+            </m:r>
+          </m:e>
+          <m:sup>
+            <m:r>
+              <m:rPr>
+                <m:sty m:val="p"/>
+              </m:rPr>
+              <m:t>−</m:t>
+            </m:r>
+            <m:r>
+              <m:t>2</m:t>
+            </m:r>
+          </m:sup>
+        </m:sSup>
+      </m:oMath>
+      <w:r>
+        <w:t xml:space="preserve">, with the scaled gap falling from</w:t>
+      </w:r>
+      <w:r>
+        <w:t xml:space="preserve"> </w:t>
+      </w:r>
+      <m:oMath>
+        <m:r>
+          <m:t>0.28</m:t>
+        </m:r>
+      </m:oMath>
+      <w:r>
+        <w:t xml:space="preserve"> </w:t>
+      </w:r>
+      <w:r>
+        <w:t xml:space="preserve">to</w:t>
+      </w:r>
+      <w:r>
+        <w:t xml:space="preserve"> </w:t>
+      </w:r>
+      <m:oMath>
+        <m:r>
+          <m:t>0.036</m:t>
+        </m:r>
+      </m:oMath>
+      <w:r>
+        <w:t xml:space="preserve"> </w:t>
+      </w:r>
+      <w:r>
+        <w:t xml:space="preserve">over</w:t>
+      </w:r>
+      <w:r>
+        <w:t xml:space="preserve"> </w:t>
+      </w:r>
+      <m:oMath>
+        <m:r>
+          <m:t>N</m:t>
+        </m:r>
+        <m:r>
+          <m:rPr>
+            <m:sty m:val="p"/>
+          </m:rPr>
+          <m:t>=</m:t>
+        </m:r>
+        <m:r>
+          <m:t>4</m:t>
+        </m:r>
+      </m:oMath>
+      <w:r>
+        <w:t xml:space="preserve">–</w:t>
+      </w:r>
+      <m:oMath>
+        <m:r>
+          <m:t>12</m:t>
+        </m:r>
+      </m:oMath>
+      <w:r>
+        <w:t xml:space="preserve">.</w:t>
+      </w:r>
+    </w:p>
+    <w:p>
+      <w:pPr>
+        <w:numPr>
+          <w:ilvl w:val="0"/>
+          <w:numId w:val="1007"/>
+        </w:numPr>
+        <w:pStyle w:val="Compact"/>
+      </w:pPr>
+      <w:r>
+        <w:rPr>
+          <w:bCs/>
+          <w:b/>
+        </w:rPr>
+        <w:t xml:space="preserve">Total.</w:t>
+      </w:r>
+      <w:r>
+        <w:t xml:space="preserve"> </w:t>
+      </w:r>
+      <w:r>
+        <w:t xml:space="preserve">CX at the bound’s</w:t>
+      </w:r>
+      <w:r>
+        <w:t xml:space="preserve"> </w:t>
+      </w:r>
+      <m:oMath>
+        <m:r>
+          <m:t>n</m:t>
+        </m:r>
+      </m:oMath>
+      <w:r>
+        <w:t xml:space="preserve"> </w:t>
+      </w:r>
+      <w:r>
+        <w:t xml:space="preserve">grows as</w:t>
+      </w:r>
+      <w:r>
+        <w:t xml:space="preserve"> </w:t>
+      </w:r>
+      <m:oMath>
+        <m:sSup>
+          <m:e>
+            <m:r>
+              <m:t>N</m:t>
+            </m:r>
+          </m:e>
+          <m:sup>
+            <m:r>
+              <m:t>5.2</m:t>
+            </m:r>
+          </m:sup>
+        </m:sSup>
+      </m:oMath>
+      <w:r>
+        <w:t xml:space="preserve"> </w:t>
+      </w:r>
+      <w:r>
+        <w:t xml:space="preserve">(</w:t>
+      </w:r>
+      <m:oMath>
+        <m:sSub>
+          <m:e>
+            <m:r>
+              <m:t>J</m:t>
+            </m:r>
+          </m:e>
+          <m:sub>
+            <m:r>
+              <m:t>2</m:t>
+            </m:r>
+          </m:sub>
+        </m:sSub>
+        <m:r>
+          <m:rPr>
+            <m:sty m:val="p"/>
+          </m:rPr>
+          <m:t>=</m:t>
+        </m:r>
+        <m:r>
+          <m:t>0</m:t>
+        </m:r>
+      </m:oMath>
+      <w:r>
+        <w:t xml:space="preserve">;</w:t>
+      </w:r>
+      <w:r>
+        <w:t xml:space="preserve"> </w:t>
+      </w:r>
+      <m:oMath>
+        <m:sSup>
+          <m:e>
+            <m:r>
+              <m:t>N</m:t>
+            </m:r>
+          </m:e>
+          <m:sup>
+            <m:r>
+              <m:t>4.6</m:t>
+            </m:r>
+          </m:sup>
+        </m:sSup>
+      </m:oMath>
+      <w:r>
+        <w:t xml:space="preserve"> </w:t>
+      </w:r>
+      <w:r>
+        <w:t xml:space="preserve">at</w:t>
+      </w:r>
+      <w:r>
+        <w:t xml:space="preserve"> </w:t>
+      </w:r>
+      <m:oMath>
+        <m:sSub>
+          <m:e>
+            <m:r>
+              <m:t>J</m:t>
+            </m:r>
+          </m:e>
+          <m:sub>
+            <m:r>
+              <m:t>2</m:t>
+            </m:r>
+          </m:sub>
+        </m:sSub>
+        <m:r>
+          <m:rPr>
+            <m:sty m:val="p"/>
+          </m:rPr>
+          <m:t>=</m:t>
+        </m:r>
+        <m:r>
+          <m:t>0.4</m:t>
+        </m:r>
+      </m:oMath>
+      <w:r>
+        <w:t xml:space="preserve">) and at the measured</w:t>
+      </w:r>
+      <w:r>
+        <w:t xml:space="preserve"> </w:t>
+      </w:r>
+      <m:oMath>
+        <m:r>
+          <m:t>n</m:t>
+        </m:r>
+      </m:oMath>
+      <w:r>
+        <w:t xml:space="preserve"> </w:t>
+      </w:r>
+      <w:r>
+        <w:t xml:space="preserve">as</w:t>
+      </w:r>
+      <w:r>
+        <w:t xml:space="preserve"> </w:t>
+      </w:r>
+      <m:oMath>
+        <m:sSup>
+          <m:e>
+            <m:r>
+              <m:t>N</m:t>
+            </m:r>
+          </m:e>
+          <m:sup>
+            <m:r>
+              <m:t>3.9</m:t>
+            </m:r>
+          </m:sup>
+        </m:sSup>
+      </m:oMath>
+      <w:r>
+        <w:t xml:space="preserve"> </w:t>
+      </w:r>
+      <w:r>
+        <w:t xml:space="preserve">(</w:t>
+      </w:r>
+      <m:oMath>
+        <m:sSup>
+          <m:e>
+            <m:r>
+              <m:t>N</m:t>
+            </m:r>
+          </m:e>
+          <m:sup>
+            <m:r>
+              <m:t>2.8</m:t>
+            </m:r>
+          </m:sup>
+        </m:sSup>
+      </m:oMath>
+      <w:r>
+        <w:t xml:space="preserve">). The bound costs 11–60</w:t>
+      </w:r>
+      <m:oMath>
+        <m:r>
+          <m:rPr>
+            <m:sty m:val="p"/>
+          </m:rPr>
+          <m:t>×</m:t>
+        </m:r>
+      </m:oMath>
+      <w:r>
+        <w:t xml:space="preserve"> </w:t>
+      </w:r>
+      <w:r>
+        <w:t xml:space="preserve">more than the measured count, as for the steps, since CX per step is the same.</w:t>
+      </w:r>
+    </w:p>
+    <w:p>
+      <w:pPr>
+        <w:numPr>
+          <w:ilvl w:val="0"/>
+          <w:numId w:val="1007"/>
+        </w:numPr>
+        <w:pStyle w:val="Compact"/>
+      </w:pPr>
+      <w:r>
+        <w:rPr>
+          <w:bCs/>
+          <w:b/>
+        </w:rPr>
+        <w:t xml:space="preserve">Against exact generic preparation.</w:t>
+      </w:r>
+      <w:r>
+        <w:t xml:space="preserve"> </w:t>
+      </w:r>
+      <w:r>
+        <w:t xml:space="preserve">Generic preparation grows by a factor 4.0</w:t>
+      </w:r>
+      <m:oMath>
+        <m:r>
+          <m:rPr>
+            <m:sty m:val="p"/>
+          </m:rPr>
+          <m:t>×</m:t>
+        </m:r>
+      </m:oMath>
+      <w:r>
+        <w:t xml:space="preserve"> </w:t>
+      </w:r>
+      <w:r>
+        <w:t xml:space="preserve">per two qubits (exponential). The filter at the</w:t>
+      </w:r>
+      <w:r>
+        <w:t xml:space="preserve"> </w:t>
+      </w:r>
+      <w:r>
+        <w:rPr>
+          <w:iCs/>
+          <w:i/>
+        </w:rPr>
+        <w:t xml:space="preserve">measured</w:t>
+      </w:r>
+      <w:r>
+        <w:t xml:space="preserve"> </w:t>
+      </w:r>
+      <w:r>
+        <w:t xml:space="preserve">step count falls from 15</w:t>
+      </w:r>
+      <m:oMath>
+        <m:r>
+          <m:rPr>
+            <m:sty m:val="p"/>
+          </m:rPr>
+          <m:t>×</m:t>
+        </m:r>
+      </m:oMath>
+      <w:r>
+        <w:t xml:space="preserve"> </w:t>
+      </w:r>
+      <w:r>
+        <w:t xml:space="preserve">the generic cost at</w:t>
+      </w:r>
+      <w:r>
+        <w:t xml:space="preserve"> </w:t>
+      </w:r>
+      <m:oMath>
+        <m:r>
+          <m:t>N</m:t>
+        </m:r>
+        <m:r>
+          <m:rPr>
+            <m:sty m:val="p"/>
+          </m:rPr>
+          <m:t>=</m:t>
+        </m:r>
+        <m:r>
+          <m:t>4</m:t>
+        </m:r>
+      </m:oMath>
+      <w:r>
+        <w:t xml:space="preserve"> </w:t>
+      </w:r>
+      <w:r>
+        <w:t xml:space="preserve">to 2.2</w:t>
+      </w:r>
+      <m:oMath>
+        <m:r>
+          <m:rPr>
+            <m:sty m:val="p"/>
+          </m:rPr>
+          <m:t>×</m:t>
+        </m:r>
+      </m:oMath>
+      <w:r>
+        <w:t xml:space="preserve"> </w:t>
+      </w:r>
+      <w:r>
+        <w:t xml:space="preserve">at</w:t>
+      </w:r>
+      <w:r>
+        <w:t xml:space="preserve"> </w:t>
+      </w:r>
+      <m:oMath>
+        <m:r>
+          <m:t>N</m:t>
+        </m:r>
+        <m:r>
+          <m:rPr>
+            <m:sty m:val="p"/>
+          </m:rPr>
+          <m:t>=</m:t>
+        </m:r>
+        <m:r>
+          <m:t>12</m:t>
+        </m:r>
+      </m:oMath>
+      <w:r>
+        <w:t xml:space="preserve"> </w:t>
+      </w:r>
+      <w:r>
+        <w:t xml:space="preserve">(</w:t>
+      </w:r>
+      <m:oMath>
+        <m:sSub>
+          <m:e>
+            <m:r>
+              <m:t>J</m:t>
+            </m:r>
+          </m:e>
+          <m:sub>
+            <m:r>
+              <m:t>2</m:t>
+            </m:r>
+          </m:sub>
+        </m:sSub>
+        <m:r>
+          <m:rPr>
+            <m:sty m:val="p"/>
+          </m:rPr>
+          <m:t>=</m:t>
+        </m:r>
+        <m:r>
+          <m:t>0</m:t>
+        </m:r>
+      </m:oMath>
+      <w:r>
+        <w:t xml:space="preserve">), so a crossover could appear a little above</w:t>
+      </w:r>
+      <w:r>
+        <w:t xml:space="preserve"> </w:t>
+      </w:r>
+      <m:oMath>
+        <m:r>
+          <m:t>N</m:t>
+        </m:r>
+        <m:r>
+          <m:rPr>
+            <m:sty m:val="p"/>
+          </m:rPr>
+          <m:t>=</m:t>
+        </m:r>
+        <m:r>
+          <m:t>12</m:t>
+        </m:r>
+      </m:oMath>
+      <w:r>
+        <w:t xml:space="preserve"> </w:t>
+      </w:r>
+      <w:r>
+        <w:rPr>
+          <w:iCs/>
+          <w:i/>
+        </w:rPr>
+        <w:t xml:space="preserve">if</w:t>
+      </w:r>
+      <w:r>
+        <w:t xml:space="preserve"> </w:t>
+      </w:r>
+      <w:r>
+        <w:t xml:space="preserve">the power laws continued and if one had the oracle step count. At the</w:t>
+      </w:r>
+      <w:r>
+        <w:t xml:space="preserve"> </w:t>
+      </w:r>
+      <w:r>
+        <w:rPr>
+          <w:iCs/>
+          <w:i/>
+        </w:rPr>
+        <w:t xml:space="preserve">bound’s</w:t>
+      </w:r>
+      <w:r>
+        <w:t xml:space="preserve"> </w:t>
+      </w:r>
+      <w:r>
+        <w:t xml:space="preserve">step count the filter stays 131–448</w:t>
+      </w:r>
+      <m:oMath>
+        <m:r>
+          <m:rPr>
+            <m:sty m:val="p"/>
+          </m:rPr>
+          <m:t>×</m:t>
+        </m:r>
+      </m:oMath>
+      <w:r>
+        <w:t xml:space="preserve"> </w:t>
+      </w:r>
+      <w:r>
+        <w:t xml:space="preserve">more expensive than generic preparation throughout. These are fits over</w:t>
+      </w:r>
+      <w:r>
+        <w:t xml:space="preserve"> </w:t>
+      </w:r>
+      <m:oMath>
+        <m:r>
+          <m:t>N</m:t>
+        </m:r>
+        <m:r>
+          <m:rPr>
+            <m:sty m:val="p"/>
+          </m:rPr>
+          <m:t>=</m:t>
+        </m:r>
+        <m:r>
+          <m:t>6</m:t>
+        </m:r>
+      </m:oMath>
+      <w:r>
+        <w:t xml:space="preserve">–</w:t>
+      </w:r>
+      <m:oMath>
+        <m:r>
+          <m:t>12</m:t>
+        </m:r>
+      </m:oMath>
+      <w:r>
+        <w:t xml:space="preserve"> </w:t>
+      </w:r>
+      <w:r>
+        <w:t xml:space="preserve">(five points at most) and not a prediction; exact generic preparation is also a weak baseline. Any structured preparation of an MPS (companion study) is cheaper still for these chains.</w:t>
+      </w:r>
+    </w:p>
+    <w:bookmarkEnd w:id="48"/>
+    <w:bookmarkStart w:id="49" w:name="pinsker-numerics"/>
+    <w:p>
+      <w:pPr>
+        <w:pStyle w:val="Heading3"/>
+      </w:pPr>
+      <w:r>
+        <w:t xml:space="preserve">5.8 Pinsker numerics</w:t>
       </w:r>
     </w:p>
     <w:p>
@@ -24354,633 +27116,15 @@
         <w:t xml:space="preserve">. We therefore treat Pinsker as an explanatory remark, not as part of the guarantee.</w:t>
       </w:r>
     </w:p>
-    <w:bookmarkEnd w:id="45"/>
-    <w:bookmarkEnd w:id="46"/>
-    <w:bookmarkStart w:id="47" w:name="discussion-and-limitations"/>
+    <w:bookmarkEnd w:id="49"/>
+    <w:bookmarkEnd w:id="50"/>
+    <w:bookmarkStart w:id="51" w:name="discussion-and-limitations"/>
     <w:p>
       <w:pPr>
         <w:pStyle w:val="Heading2"/>
       </w:pPr>
       <w:r>
         <w:t xml:space="preserve">6. Discussion and limitations</w:t>
-      </w:r>
-    </w:p>
-    <w:p>
-      <w:pPr>
-        <w:numPr>
-          <w:ilvl w:val="0"/>
-          <w:numId w:val="1007"/>
-        </w:numPr>
-        <w:pStyle w:val="Compact"/>
-      </w:pPr>
-      <w:r>
-        <w:rPr>
-          <w:bCs/>
-          <w:b/>
-        </w:rPr>
-        <w:t xml:space="preserve">Inputs.</w:t>
-      </w:r>
-      <w:r>
-        <w:t xml:space="preserve"> </w:t>
-      </w:r>
-      <w:r>
-        <w:t xml:space="preserve">The bound is conditional on exact</w:t>
-      </w:r>
-      <w:r>
-        <w:t xml:space="preserve"> </w:t>
-      </w:r>
-      <m:oMath>
-        <m:r>
-          <m:t>γ</m:t>
-        </m:r>
-      </m:oMath>
-      <w:r>
-        <w:t xml:space="preserve"> </w:t>
-      </w:r>
-      <w:r>
-        <w:t xml:space="preserve">and</w:t>
-      </w:r>
-      <w:r>
-        <w:t xml:space="preserve"> </w:t>
-      </w:r>
-      <m:oMath>
-        <m:r>
-          <m:t>Δ</m:t>
-        </m:r>
-      </m:oMath>
-      <w:r>
-        <w:t xml:space="preserve"> </w:t>
-      </w:r>
-      <w:r>
-        <w:t xml:space="preserve">(and</w:t>
-      </w:r>
-      <w:r>
-        <w:t xml:space="preserve"> </w:t>
-      </w:r>
-      <m:oMath>
-        <m:sSub>
-          <m:e>
-            <m:r>
-              <m:t>E</m:t>
-            </m:r>
-          </m:e>
-          <m:sub>
-            <m:r>
-              <m:t>0</m:t>
-            </m:r>
-          </m:sub>
-        </m:sSub>
-      </m:oMath>
-      <w:r>
-        <w:t xml:space="preserve"> </w:t>
-      </w:r>
-      <w:r>
-        <w:t xml:space="preserve">for the shift). Here they come from exact diagonalisation, so everything is restricted to</w:t>
-      </w:r>
-      <w:r>
-        <w:t xml:space="preserve"> </w:t>
-      </w:r>
-      <m:oMath>
-        <m:r>
-          <m:t>N</m:t>
-        </m:r>
-        <m:r>
-          <m:rPr>
-            <m:sty m:val="p"/>
-          </m:rPr>
-          <m:t>≤</m:t>
-        </m:r>
-        <m:r>
-          <m:t>12</m:t>
-        </m:r>
-      </m:oMath>
-      <w:r>
-        <w:t xml:space="preserve">. At larger</w:t>
-      </w:r>
-      <w:r>
-        <w:t xml:space="preserve"> </w:t>
-      </w:r>
-      <m:oMath>
-        <m:r>
-          <m:t>N</m:t>
-        </m:r>
-      </m:oMath>
-      <w:r>
-        <w:t xml:space="preserve"> </w:t>
-      </w:r>
-      <w:r>
-        <w:t xml:space="preserve">the energies come from DMRG, which gives estimates, not bounds: the penalty-method first-excitation energy is an</w:t>
-      </w:r>
-      <w:r>
-        <w:t xml:space="preserve"> </w:t>
-      </w:r>
-      <w:r>
-        <w:rPr>
-          <w:iCs/>
-          <w:i/>
-        </w:rPr>
-        <w:t xml:space="preserve">upper</w:t>
-      </w:r>
-      <w:r>
-        <w:t xml:space="preserve"> </w:t>
-      </w:r>
-      <w:r>
-        <w:t xml:space="preserve">bound on</w:t>
-      </w:r>
-      <w:r>
-        <w:t xml:space="preserve"> </w:t>
-      </w:r>
-      <m:oMath>
-        <m:sSub>
-          <m:e>
-            <m:r>
-              <m:t>E</m:t>
-            </m:r>
-          </m:e>
-          <m:sub>
-            <m:r>
-              <m:t>1</m:t>
-            </m:r>
-          </m:sub>
-        </m:sSub>
-      </m:oMath>
-      <w:r>
-        <w:t xml:space="preserve">, the wrong side for a gap lower bound, and an overlap with a DMRG state is an overlap with an approximation of</w:t>
-      </w:r>
-      <w:r>
-        <w:t xml:space="preserve"> </w:t>
-      </w:r>
-      <m:oMath>
-        <m:r>
-          <m:rPr>
-            <m:sty m:val="p"/>
-          </m:rPr>
-          <m:t>|</m:t>
-        </m:r>
-        <m:sSub>
-          <m:e>
-            <m:r>
-              <m:t>E</m:t>
-            </m:r>
-          </m:e>
-          <m:sub>
-            <m:r>
-              <m:t>0</m:t>
-            </m:r>
-          </m:sub>
-        </m:sSub>
-        <m:r>
-          <m:rPr>
-            <m:sty m:val="p"/>
-          </m:rPr>
-          <m:t>⟩</m:t>
-        </m:r>
-      </m:oMath>
-      <w:r>
-        <w:t xml:space="preserve">. Certifying</w:t>
-      </w:r>
-      <w:r>
-        <w:t xml:space="preserve"> </w:t>
-      </w:r>
-      <m:oMath>
-        <m:r>
-          <m:t>Δ</m:t>
-        </m:r>
-      </m:oMath>
-      <w:r>
-        <w:t xml:space="preserve"> </w:t>
-      </w:r>
-      <w:r>
-        <w:t xml:space="preserve">and</w:t>
-      </w:r>
-      <w:r>
-        <w:t xml:space="preserve"> </w:t>
-      </w:r>
-      <m:oMath>
-        <m:r>
-          <m:t>γ</m:t>
-        </m:r>
-      </m:oMath>
-      <w:r>
-        <w:t xml:space="preserve"> </w:t>
-      </w:r>
-      <w:r>
-        <w:t xml:space="preserve">at large</w:t>
-      </w:r>
-      <w:r>
-        <w:t xml:space="preserve"> </w:t>
-      </w:r>
-      <m:oMath>
-        <m:r>
-          <m:t>N</m:t>
-        </m:r>
-      </m:oMath>
-      <w:r>
-        <w:t xml:space="preserve"> </w:t>
-      </w:r>
-      <w:r>
-        <w:t xml:space="preserve">is the main open point for turning this into a large-</w:t>
-      </w:r>
-      <m:oMath>
-        <m:r>
-          <m:t>N</m:t>
-        </m:r>
-      </m:oMath>
-      <w:r>
-        <w:t xml:space="preserve"> </w:t>
-      </w:r>
-      <w:r>
-        <w:t xml:space="preserve">workflow.</w:t>
-      </w:r>
-    </w:p>
-    <w:p>
-      <w:pPr>
-        <w:numPr>
-          <w:ilvl w:val="0"/>
-          <w:numId w:val="1007"/>
-        </w:numPr>
-        <w:pStyle w:val="Compact"/>
-      </w:pPr>
-      <w:r>
-        <w:rPr>
-          <w:bCs/>
-          <w:b/>
-        </w:rPr>
-        <w:t xml:space="preserve">Trial state.</w:t>
-      </w:r>
-      <w:r>
-        <w:t xml:space="preserve"> </w:t>
-      </w:r>
-      <w:r>
-        <w:t xml:space="preserve">The trial states are SVD truncations of the exact ground state standing in for DMRG/MPS-circuit states. Circuit compilation would reduce</w:t>
-      </w:r>
-      <w:r>
-        <w:t xml:space="preserve"> </w:t>
-      </w:r>
-      <m:oMath>
-        <m:r>
-          <m:t>γ</m:t>
-        </m:r>
-      </m:oMath>
-      <w:r>
-        <w:t xml:space="preserve"> </w:t>
-      </w:r>
-      <w:r>
-        <w:t xml:space="preserve">further; the bound applies unchanged given the true</w:t>
-      </w:r>
-      <w:r>
-        <w:t xml:space="preserve"> </w:t>
-      </w:r>
-      <m:oMath>
-        <m:r>
-          <m:t>γ</m:t>
-        </m:r>
-      </m:oMath>
-      <w:r>
-        <w:t xml:space="preserve">.</w:t>
-      </w:r>
-    </w:p>
-    <w:p>
-      <w:pPr>
-        <w:numPr>
-          <w:ilvl w:val="0"/>
-          <w:numId w:val="1007"/>
-        </w:numPr>
-        <w:pStyle w:val="Compact"/>
-      </w:pPr>
-      <w:r>
-        <w:rPr>
-          <w:bCs/>
-          <w:b/>
-        </w:rPr>
-        <w:t xml:space="preserve">First order only.</w:t>
-      </w:r>
-      <w:r>
-        <w:t xml:space="preserve"> </w:t>
-      </w:r>
-      <w:r>
-        <w:t xml:space="preserve">Lemma 2 is a first-order product-formula statement.</w:t>
-      </w:r>
-    </w:p>
-    <w:p>
-      <w:pPr>
-        <w:numPr>
-          <w:ilvl w:val="0"/>
-          <w:numId w:val="1007"/>
-        </w:numPr>
-        <w:pStyle w:val="Compact"/>
-      </w:pPr>
-      <w:r>
-        <w:rPr>
-          <w:bCs/>
-          <w:b/>
-        </w:rPr>
-        <w:t xml:space="preserve">Conservatism.</w:t>
-      </w:r>
-      <w:r>
-        <w:t xml:space="preserve"> </w:t>
-      </w:r>
-      <w:r>
-        <w:t xml:space="preserve">The Trotter term is the loose one (10–39×). Using the Richardson estimate in its place gives a practical, non-rigorous complement.</w:t>
-      </w:r>
-    </w:p>
-    <w:p>
-      <w:pPr>
-        <w:numPr>
-          <w:ilvl w:val="0"/>
-          <w:numId w:val="1007"/>
-        </w:numPr>
-        <w:pStyle w:val="Compact"/>
-      </w:pPr>
-      <w:r>
-        <w:rPr>
-          <w:bCs/>
-          <w:b/>
-        </w:rPr>
-        <w:t xml:space="preserve">Noise.</w:t>
-      </w:r>
-      <w:r>
-        <w:t xml:space="preserve"> </w:t>
-      </w:r>
-      <w:r>
-        <w:t xml:space="preserve">Not modelled; (D2) adds a noise term as in Section 3.5.</w:t>
-      </w:r>
-    </w:p>
-    <w:p>
-      <w:pPr>
-        <w:numPr>
-          <w:ilvl w:val="0"/>
-          <w:numId w:val="1007"/>
-        </w:numPr>
-        <w:pStyle w:val="Compact"/>
-      </w:pPr>
-      <w:r>
-        <w:rPr>
-          <w:bCs/>
-          <w:b/>
-        </w:rPr>
-        <w:t xml:space="preserve">Cost.</w:t>
-      </w:r>
-      <w:r>
-        <w:t xml:space="preserve"> </w:t>
-      </w:r>
-      <w:r>
-        <w:t xml:space="preserve">We report steps, not CX or T counts, and make no claim of advantage over direct MPS-circuit preparation (see the companion study).</w:t>
-      </w:r>
-    </w:p>
-    <w:p>
-      <w:pPr>
-        <w:numPr>
-          <w:ilvl w:val="0"/>
-          <w:numId w:val="1007"/>
-        </w:numPr>
-        <w:pStyle w:val="Compact"/>
-      </w:pPr>
-      <w:r>
-        <w:rPr>
-          <w:bCs/>
-          <w:b/>
-        </w:rPr>
-        <w:t xml:space="preserve">Scale.</w:t>
-      </w:r>
-      <w:r>
-        <w:t xml:space="preserve"> </w:t>
-      </w:r>
-      <m:oMath>
-        <m:r>
-          <m:t>N</m:t>
-        </m:r>
-        <m:r>
-          <m:rPr>
-            <m:sty m:val="p"/>
-          </m:rPr>
-          <m:t>≤</m:t>
-        </m:r>
-        <m:r>
-          <m:t>12</m:t>
-        </m:r>
-      </m:oMath>
-      <w:r>
-        <w:t xml:space="preserve">, two couplings, dense simulation.</w:t>
-      </w:r>
-    </w:p>
-    <w:bookmarkEnd w:id="47"/>
-    <w:bookmarkStart w:id="48" w:name="reproducibility"/>
-    <w:p>
-      <w:pPr>
-        <w:pStyle w:val="Heading2"/>
-      </w:pPr>
-      <w:r>
-        <w:t xml:space="preserve">7. Reproducibility</w:t>
-      </w:r>
-    </w:p>
-    <w:p>
-      <w:pPr>
-        <w:pStyle w:val="FirstParagraph"/>
-      </w:pPr>
-      <w:r>
-        <w:t xml:space="preserve">Everything is in</w:t>
-      </w:r>
-      <w:r>
-        <w:t xml:space="preserve"> </w:t>
-      </w:r>
-      <w:r>
-        <w:rPr>
-          <w:rStyle w:val="VerbatimChar"/>
-        </w:rPr>
-        <w:t xml:space="preserve">simple_paper/</w:t>
-      </w:r>
-      <w:r>
-        <w:t xml:space="preserve">:</w:t>
-      </w:r>
-      <w:r>
-        <w:t xml:space="preserve"> </w:t>
-      </w:r>
-      <w:r>
-        <w:rPr>
-          <w:rStyle w:val="VerbatimChar"/>
-        </w:rPr>
-        <w:t xml:space="preserve">workflow.py</w:t>
-      </w:r>
-      <w:r>
-        <w:t xml:space="preserve"> </w:t>
-      </w:r>
-      <w:r>
-        <w:t xml:space="preserve">(Hamiltonian, trial state, pulses, bound),</w:t>
-      </w:r>
-      <w:r>
-        <w:t xml:space="preserve"> </w:t>
-      </w:r>
-      <w:r>
-        <w:rPr>
-          <w:rStyle w:val="VerbatimChar"/>
-        </w:rPr>
-        <w:t xml:space="preserve">run_experiments.py</w:t>
-      </w:r>
-      <w:r>
-        <w:t xml:space="preserve"> </w:t>
-      </w:r>
-      <w:r>
-        <w:t xml:space="preserve">(cases, writes</w:t>
-      </w:r>
-      <w:r>
-        <w:t xml:space="preserve"> </w:t>
-      </w:r>
-      <w:r>
-        <w:rPr>
-          <w:rStyle w:val="VerbatimChar"/>
-        </w:rPr>
-        <w:t xml:space="preserve">results/case_*.json</w:t>
-      </w:r>
-      <w:r>
-        <w:t xml:space="preserve">),</w:t>
-      </w:r>
-      <w:r>
-        <w:t xml:space="preserve"> </w:t>
-      </w:r>
-      <w:r>
-        <w:rPr>
-          <w:rStyle w:val="VerbatimChar"/>
-        </w:rPr>
-        <w:t xml:space="preserve">pinsker_check.py</w:t>
-      </w:r>
-      <w:r>
-        <w:t xml:space="preserve">,</w:t>
-      </w:r>
-      <w:r>
-        <w:t xml:space="preserve"> </w:t>
-      </w:r>
-      <w:r>
-        <w:rPr>
-          <w:rStyle w:val="VerbatimChar"/>
-        </w:rPr>
-        <w:t xml:space="preserve">make_report.py</w:t>
-      </w:r>
-      <w:r>
-        <w:t xml:space="preserve"> </w:t>
-      </w:r>
-      <w:r>
-        <w:t xml:space="preserve">(tables, figures),</w:t>
-      </w:r>
-      <w:r>
-        <w:t xml:space="preserve"> </w:t>
-      </w:r>
-      <w:r>
-        <w:rPr>
-          <w:rStyle w:val="VerbatimChar"/>
-        </w:rPr>
-        <w:t xml:space="preserve">build_paper.py</w:t>
-      </w:r>
-      <w:r>
-        <w:t xml:space="preserve"> </w:t>
-      </w:r>
-      <w:r>
-        <w:t xml:space="preserve">(this document). The filter design and certification are</w:t>
-      </w:r>
-      <w:r>
-        <w:t xml:space="preserve"> </w:t>
-      </w:r>
-      <w:r>
-        <w:rPr>
-          <w:rStyle w:val="VerbatimChar"/>
-        </w:rPr>
-        <w:t xml:space="preserve">j1j2_filter/floor.py</w:t>
-      </w:r>
-      <w:r>
-        <w:t xml:space="preserve">. Requirements: numpy, scipy, matplotlib; no qiskit or quimb. The full grid takes a few minutes on one CPU core (the</w:t>
-      </w:r>
-      <w:r>
-        <w:t xml:space="preserve"> </w:t>
-      </w:r>
-      <m:oMath>
-        <m:r>
-          <m:t>N</m:t>
-        </m:r>
-        <m:r>
-          <m:rPr>
-            <m:sty m:val="p"/>
-          </m:rPr>
-          <m:t>=</m:t>
-        </m:r>
-        <m:r>
-          <m:t>12</m:t>
-        </m:r>
-      </m:oMath>
-      <w:r>
-        <w:t xml:space="preserve"> </w:t>
-      </w:r>
-      <w:r>
-        <w:t xml:space="preserve">cases dominate). Seeds are fixed (the</w:t>
-      </w:r>
-      <w:r>
-        <w:t xml:space="preserve"> </w:t>
-      </w:r>
-      <m:oMath>
-        <m:r>
-          <m:t>N</m:t>
-        </m:r>
-        <m:r>
-          <m:rPr>
-            <m:sty m:val="p"/>
-          </m:rPr>
-          <m:t>=</m:t>
-        </m:r>
-        <m:r>
-          <m:t>12</m:t>
-        </m:r>
-      </m:oMath>
-      <w:r>
-        <w:t xml:space="preserve"> </w:t>
-      </w:r>
-      <w:r>
-        <w:t xml:space="preserve">ground state uses a fixed Lanczos start vector, since</w:t>
-      </w:r>
-      <w:r>
-        <w:t xml:space="preserve"> </w:t>
-      </w:r>
-      <m:oMath>
-        <m:r>
-          <m:t>χ</m:t>
-        </m:r>
-        <m:r>
-          <m:rPr>
-            <m:sty m:val="p"/>
-          </m:rPr>
-          <m:t>=</m:t>
-        </m:r>
-        <m:r>
-          <m:t>2</m:t>
-        </m:r>
-      </m:oMath>
-      <w:r>
-        <w:t xml:space="preserve"> </w:t>
-      </w:r>
-      <w:r>
-        <w:t xml:space="preserve">truncation cuts through degenerate Schmidt values and</w:t>
-      </w:r>
-      <w:r>
-        <w:t xml:space="preserve"> </w:t>
-      </w:r>
-      <m:oMath>
-        <m:r>
-          <m:t>γ</m:t>
-        </m:r>
-      </m:oMath>
-      <w:r>
-        <w:t xml:space="preserve"> </w:t>
-      </w:r>
-      <w:r>
-        <w:t xml:space="preserve">otherwise varies in the third digit between runs).</w:t>
-      </w:r>
-    </w:p>
-    <w:bookmarkEnd w:id="48"/>
-    <w:bookmarkStart w:id="49" w:name="references"/>
-    <w:p>
-      <w:pPr>
-        <w:pStyle w:val="Heading2"/>
-      </w:pPr>
-      <w:r>
-        <w:t xml:space="preserve">References</w:t>
       </w:r>
     </w:p>
     <w:p>
@@ -24992,19 +27136,102 @@
         <w:pStyle w:val="Compact"/>
       </w:pPr>
       <w:r>
-        <w:t xml:space="preserve">I. Stetcu, A. Baroni, J. Carlson,</w:t>
-      </w:r>
-      <w:r>
-        <w:t xml:space="preserve"> </w:t>
-      </w:r>
-      <w:r>
-        <w:t xml:space="preserve">“</w:t>
-      </w:r>
-      <w:r>
-        <w:t xml:space="preserve">Projection algorithm for state preparation on quantum computers,</w:t>
-      </w:r>
-      <w:r>
-        <w:t xml:space="preserve">”</w:t>
+        <w:rPr>
+          <w:bCs/>
+          <w:b/>
+        </w:rPr>
+        <w:t xml:space="preserve">Inputs.</w:t>
+      </w:r>
+      <w:r>
+        <w:t xml:space="preserve"> </w:t>
+      </w:r>
+      <w:r>
+        <w:t xml:space="preserve">The bound is conditional on exact</w:t>
+      </w:r>
+      <w:r>
+        <w:t xml:space="preserve"> </w:t>
+      </w:r>
+      <m:oMath>
+        <m:r>
+          <m:t>γ</m:t>
+        </m:r>
+      </m:oMath>
+      <w:r>
+        <w:t xml:space="preserve"> </w:t>
+      </w:r>
+      <w:r>
+        <w:t xml:space="preserve">and</w:t>
+      </w:r>
+      <w:r>
+        <w:t xml:space="preserve"> </w:t>
+      </w:r>
+      <m:oMath>
+        <m:r>
+          <m:t>Δ</m:t>
+        </m:r>
+      </m:oMath>
+      <w:r>
+        <w:t xml:space="preserve"> </w:t>
+      </w:r>
+      <w:r>
+        <w:t xml:space="preserve">(and</w:t>
+      </w:r>
+      <w:r>
+        <w:t xml:space="preserve"> </w:t>
+      </w:r>
+      <m:oMath>
+        <m:sSub>
+          <m:e>
+            <m:r>
+              <m:t>E</m:t>
+            </m:r>
+          </m:e>
+          <m:sub>
+            <m:r>
+              <m:t>0</m:t>
+            </m:r>
+          </m:sub>
+        </m:sSub>
+      </m:oMath>
+      <w:r>
+        <w:t xml:space="preserve"> </w:t>
+      </w:r>
+      <w:r>
+        <w:t xml:space="preserve">for the shift). Here they come from exact diagonalisation, so everything is restricted to</w:t>
+      </w:r>
+      <w:r>
+        <w:t xml:space="preserve"> </w:t>
+      </w:r>
+      <m:oMath>
+        <m:r>
+          <m:t>N</m:t>
+        </m:r>
+        <m:r>
+          <m:rPr>
+            <m:sty m:val="p"/>
+          </m:rPr>
+          <m:t>≤</m:t>
+        </m:r>
+        <m:r>
+          <m:t>12</m:t>
+        </m:r>
+      </m:oMath>
+      <w:r>
+        <w:t xml:space="preserve">. At larger</w:t>
+      </w:r>
+      <w:r>
+        <w:t xml:space="preserve"> </w:t>
+      </w:r>
+      <m:oMath>
+        <m:r>
+          <m:t>N</m:t>
+        </m:r>
+      </m:oMath>
+      <w:r>
+        <w:t xml:space="preserve"> </w:t>
+      </w:r>
+      <w:r>
+        <w:t xml:space="preserve">the energies come from DMRG, which gives estimates, not bounds: the penalty-method first-excitation energy is an</w:t>
       </w:r>
       <w:r>
         <w:t xml:space="preserve"> </w:t>
@@ -25014,20 +27241,118 @@
           <w:iCs/>
           <w:i/>
         </w:rPr>
-        <w:t xml:space="preserve">Phys. Rev. C</w:t>
-      </w:r>
-      <w:r>
-        <w:t xml:space="preserve"> </w:t>
-      </w:r>
-      <w:r>
-        <w:rPr>
-          <w:bCs/>
-          <w:b/>
-        </w:rPr>
-        <w:t xml:space="preserve">105</w:t>
-      </w:r>
-      <w:r>
-        <w:t xml:space="preserve">, 064308 (2022).</w:t>
+        <w:t xml:space="preserve">upper</w:t>
+      </w:r>
+      <w:r>
+        <w:t xml:space="preserve"> </w:t>
+      </w:r>
+      <w:r>
+        <w:t xml:space="preserve">bound on</w:t>
+      </w:r>
+      <w:r>
+        <w:t xml:space="preserve"> </w:t>
+      </w:r>
+      <m:oMath>
+        <m:sSub>
+          <m:e>
+            <m:r>
+              <m:t>E</m:t>
+            </m:r>
+          </m:e>
+          <m:sub>
+            <m:r>
+              <m:t>1</m:t>
+            </m:r>
+          </m:sub>
+        </m:sSub>
+      </m:oMath>
+      <w:r>
+        <w:t xml:space="preserve">, the wrong side for a gap lower bound, and an overlap with a DMRG state is an overlap with an approximation of</w:t>
+      </w:r>
+      <w:r>
+        <w:t xml:space="preserve"> </w:t>
+      </w:r>
+      <m:oMath>
+        <m:r>
+          <m:rPr>
+            <m:sty m:val="p"/>
+          </m:rPr>
+          <m:t>|</m:t>
+        </m:r>
+        <m:sSub>
+          <m:e>
+            <m:r>
+              <m:t>E</m:t>
+            </m:r>
+          </m:e>
+          <m:sub>
+            <m:r>
+              <m:t>0</m:t>
+            </m:r>
+          </m:sub>
+        </m:sSub>
+        <m:r>
+          <m:rPr>
+            <m:sty m:val="p"/>
+          </m:rPr>
+          <m:t>⟩</m:t>
+        </m:r>
+      </m:oMath>
+      <w:r>
+        <w:t xml:space="preserve">. Certifying</w:t>
+      </w:r>
+      <w:r>
+        <w:t xml:space="preserve"> </w:t>
+      </w:r>
+      <m:oMath>
+        <m:r>
+          <m:t>Δ</m:t>
+        </m:r>
+      </m:oMath>
+      <w:r>
+        <w:t xml:space="preserve"> </w:t>
+      </w:r>
+      <w:r>
+        <w:t xml:space="preserve">and</w:t>
+      </w:r>
+      <w:r>
+        <w:t xml:space="preserve"> </w:t>
+      </w:r>
+      <m:oMath>
+        <m:r>
+          <m:t>γ</m:t>
+        </m:r>
+      </m:oMath>
+      <w:r>
+        <w:t xml:space="preserve"> </w:t>
+      </w:r>
+      <w:r>
+        <w:t xml:space="preserve">at large</w:t>
+      </w:r>
+      <w:r>
+        <w:t xml:space="preserve"> </w:t>
+      </w:r>
+      <m:oMath>
+        <m:r>
+          <m:t>N</m:t>
+        </m:r>
+      </m:oMath>
+      <w:r>
+        <w:t xml:space="preserve"> </w:t>
+      </w:r>
+      <w:r>
+        <w:t xml:space="preserve">is the main open point for turning this into a large-</w:t>
+      </w:r>
+      <m:oMath>
+        <m:r>
+          <m:t>N</m:t>
+        </m:r>
+      </m:oMath>
+      <w:r>
+        <w:t xml:space="preserve"> </w:t>
+      </w:r>
+      <w:r>
+        <w:t xml:space="preserve">workflow.</w:t>
       </w:r>
     </w:p>
     <w:p>
@@ -25039,42 +27364,42 @@
         <w:pStyle w:val="Compact"/>
       </w:pPr>
       <w:r>
-        <w:t xml:space="preserve">K. Choi, D. Lee, J. Bonitati, Z. Qian, J. Watkins,</w:t>
-      </w:r>
-      <w:r>
-        <w:t xml:space="preserve"> </w:t>
-      </w:r>
-      <w:r>
-        <w:t xml:space="preserve">“</w:t>
-      </w:r>
-      <w:r>
-        <w:t xml:space="preserve">Rodeo algorithm for quantum computing,</w:t>
-      </w:r>
-      <w:r>
-        <w:t xml:space="preserve">”</w:t>
-      </w:r>
-      <w:r>
-        <w:t xml:space="preserve"> </w:t>
-      </w:r>
-      <w:r>
-        <w:rPr>
-          <w:iCs/>
-          <w:i/>
-        </w:rPr>
-        <w:t xml:space="preserve">Phys. Rev. Lett.</w:t>
-      </w:r>
-      <w:r>
-        <w:t xml:space="preserve"> </w:t>
-      </w:r>
-      <w:r>
         <w:rPr>
           <w:bCs/>
           <w:b/>
         </w:rPr>
-        <w:t xml:space="preserve">127</w:t>
-      </w:r>
-      <w:r>
-        <w:t xml:space="preserve">, 040505 (2021).</w:t>
+        <w:t xml:space="preserve">Trial state.</w:t>
+      </w:r>
+      <w:r>
+        <w:t xml:space="preserve"> </w:t>
+      </w:r>
+      <w:r>
+        <w:t xml:space="preserve">The trial states are SVD truncations of the exact ground state standing in for DMRG/MPS-circuit states. Circuit compilation would reduce</w:t>
+      </w:r>
+      <w:r>
+        <w:t xml:space="preserve"> </w:t>
+      </w:r>
+      <m:oMath>
+        <m:r>
+          <m:t>γ</m:t>
+        </m:r>
+      </m:oMath>
+      <w:r>
+        <w:t xml:space="preserve"> </w:t>
+      </w:r>
+      <w:r>
+        <w:t xml:space="preserve">further; the bound applies unchanged given the true</w:t>
+      </w:r>
+      <w:r>
+        <w:t xml:space="preserve"> </w:t>
+      </w:r>
+      <m:oMath>
+        <m:r>
+          <m:t>γ</m:t>
+        </m:r>
+      </m:oMath>
+      <w:r>
+        <w:t xml:space="preserve">.</w:t>
       </w:r>
     </w:p>
     <w:p>
@@ -25086,42 +27411,17 @@
         <w:pStyle w:val="Compact"/>
       </w:pPr>
       <w:r>
-        <w:t xml:space="preserve">A. M. Childs, Y. Su, M. C. Tran, N. Wiebe, S. Zhu,</w:t>
-      </w:r>
-      <w:r>
-        <w:t xml:space="preserve"> </w:t>
-      </w:r>
-      <w:r>
-        <w:t xml:space="preserve">“</w:t>
-      </w:r>
-      <w:r>
-        <w:t xml:space="preserve">Theory of Trotter error with commutator scaling,</w:t>
-      </w:r>
-      <w:r>
-        <w:t xml:space="preserve">”</w:t>
-      </w:r>
-      <w:r>
-        <w:t xml:space="preserve"> </w:t>
-      </w:r>
-      <w:r>
-        <w:rPr>
-          <w:iCs/>
-          <w:i/>
-        </w:rPr>
-        <w:t xml:space="preserve">Phys. Rev. X</w:t>
-      </w:r>
-      <w:r>
-        <w:t xml:space="preserve"> </w:t>
-      </w:r>
-      <w:r>
         <w:rPr>
           <w:bCs/>
           <w:b/>
         </w:rPr>
-        <w:t xml:space="preserve">11</w:t>
-      </w:r>
-      <w:r>
-        <w:t xml:space="preserve">, 011020 (2021).</w:t>
+        <w:t xml:space="preserve">First order only.</w:t>
+      </w:r>
+      <w:r>
+        <w:t xml:space="preserve"> </w:t>
+      </w:r>
+      <w:r>
+        <w:t xml:space="preserve">Lemma 2 is a first-order product-formula statement.</w:t>
       </w:r>
     </w:p>
     <w:p>
@@ -25133,23 +27433,17 @@
         <w:pStyle w:val="Compact"/>
       </w:pPr>
       <w:r>
-        <w:t xml:space="preserve">M. A. Nielsen, I. L. Chuang,</w:t>
-      </w:r>
-      <w:r>
-        <w:t xml:space="preserve"> </w:t>
-      </w:r>
-      <w:r>
         <w:rPr>
-          <w:iCs/>
-          <w:i/>
+          <w:bCs/>
+          <w:b/>
         </w:rPr>
-        <w:t xml:space="preserve">Quantum Computation and Quantum Information</w:t>
-      </w:r>
-      <w:r>
-        <w:t xml:space="preserve"> </w:t>
-      </w:r>
-      <w:r>
-        <w:t xml:space="preserve">(Cambridge University Press, 2000), Ch. 9 (trace distance, fidelity).</w:t>
+        <w:t xml:space="preserve">Conservatism.</w:t>
+      </w:r>
+      <w:r>
+        <w:t xml:space="preserve"> </w:t>
+      </w:r>
+      <w:r>
+        <w:t xml:space="preserve">The Trotter term is the loose one (10–39×). Using the Richardson estimate in its place gives a practical, non-rigorous complement.</w:t>
       </w:r>
     </w:p>
     <w:p>
@@ -25161,42 +27455,17 @@
         <w:pStyle w:val="Compact"/>
       </w:pPr>
       <w:r>
-        <w:t xml:space="preserve">C. A. Fuchs, J. van de Graaf,</w:t>
-      </w:r>
-      <w:r>
-        <w:t xml:space="preserve"> </w:t>
-      </w:r>
-      <w:r>
-        <w:t xml:space="preserve">“</w:t>
-      </w:r>
-      <w:r>
-        <w:t xml:space="preserve">Cryptographic distinguishability measures for quantum-mechanical states,</w:t>
-      </w:r>
-      <w:r>
-        <w:t xml:space="preserve">”</w:t>
-      </w:r>
-      <w:r>
-        <w:t xml:space="preserve"> </w:t>
-      </w:r>
-      <w:r>
-        <w:rPr>
-          <w:iCs/>
-          <w:i/>
-        </w:rPr>
-        <w:t xml:space="preserve">IEEE Trans. Inf. Theory</w:t>
-      </w:r>
-      <w:r>
-        <w:t xml:space="preserve"> </w:t>
-      </w:r>
-      <w:r>
         <w:rPr>
           <w:bCs/>
           <w:b/>
         </w:rPr>
-        <w:t xml:space="preserve">45</w:t>
-      </w:r>
-      <w:r>
-        <w:t xml:space="preserve">, 1216 (1999).</w:t>
+        <w:t xml:space="preserve">Noise.</w:t>
+      </w:r>
+      <w:r>
+        <w:t xml:space="preserve"> </w:t>
+      </w:r>
+      <w:r>
+        <w:t xml:space="preserve">Not modelled; (D2) adds a noise term as in Section 3.5.</w:t>
       </w:r>
     </w:p>
     <w:p>
@@ -25208,23 +27477,34 @@
         <w:pStyle w:val="Compact"/>
       </w:pPr>
       <w:r>
-        <w:t xml:space="preserve">T. M. Cover, J. A. Thomas,</w:t>
-      </w:r>
-      <w:r>
-        <w:t xml:space="preserve"> </w:t>
-      </w:r>
-      <w:r>
         <w:rPr>
-          <w:iCs/>
-          <w:i/>
+          <w:bCs/>
+          <w:b/>
         </w:rPr>
-        <w:t xml:space="preserve">Elements of Information Theory</w:t>
-      </w:r>
-      <w:r>
-        <w:t xml:space="preserve"> </w:t>
-      </w:r>
-      <w:r>
-        <w:t xml:space="preserve">(Wiley, 2006), Lemma 11.6.1 (Pinsker’s inequality).</w:t>
+        <w:t xml:space="preserve">Cost.</w:t>
+      </w:r>
+      <w:r>
+        <w:t xml:space="preserve"> </w:t>
+      </w:r>
+      <w:r>
+        <w:t xml:space="preserve">CX counts are for the filter alone, noiseless, without T-count or synthesis error, and from short power-law fits (</w:t>
+      </w:r>
+      <m:oMath>
+        <m:r>
+          <m:t>N</m:t>
+        </m:r>
+        <m:r>
+          <m:rPr>
+            <m:sty m:val="p"/>
+          </m:rPr>
+          <m:t>≤</m:t>
+        </m:r>
+        <m:r>
+          <m:t>12</m:t>
+        </m:r>
+      </m:oMath>
+      <w:r>
+        <w:t xml:space="preserve">). We make no claim of advantage over direct MPS-circuit preparation (see the companion study).</w:t>
       </w:r>
     </w:p>
     <w:p>
@@ -25236,7 +27516,292 @@
         <w:pStyle w:val="Compact"/>
       </w:pPr>
       <w:r>
-        <w:t xml:space="preserve">S. R. White,</w:t>
+        <w:rPr>
+          <w:bCs/>
+          <w:b/>
+        </w:rPr>
+        <w:t xml:space="preserve">Scale.</w:t>
+      </w:r>
+      <w:r>
+        <w:t xml:space="preserve"> </w:t>
+      </w:r>
+      <m:oMath>
+        <m:r>
+          <m:t>N</m:t>
+        </m:r>
+        <m:r>
+          <m:rPr>
+            <m:sty m:val="p"/>
+          </m:rPr>
+          <m:t>≤</m:t>
+        </m:r>
+        <m:r>
+          <m:t>12</m:t>
+        </m:r>
+      </m:oMath>
+      <w:r>
+        <w:t xml:space="preserve">, two couplings, dense simulation.</w:t>
+      </w:r>
+    </w:p>
+    <w:bookmarkEnd w:id="51"/>
+    <w:bookmarkStart w:id="52" w:name="reproducibility"/>
+    <w:p>
+      <w:pPr>
+        <w:pStyle w:val="Heading2"/>
+      </w:pPr>
+      <w:r>
+        <w:t xml:space="preserve">7. Reproducibility</w:t>
+      </w:r>
+    </w:p>
+    <w:p>
+      <w:pPr>
+        <w:pStyle w:val="FirstParagraph"/>
+      </w:pPr>
+      <w:r>
+        <w:t xml:space="preserve">Everything is in</w:t>
+      </w:r>
+      <w:r>
+        <w:t xml:space="preserve"> </w:t>
+      </w:r>
+      <w:r>
+        <w:rPr>
+          <w:rStyle w:val="VerbatimChar"/>
+        </w:rPr>
+        <w:t xml:space="preserve">simple_paper/</w:t>
+      </w:r>
+      <w:r>
+        <w:t xml:space="preserve">:</w:t>
+      </w:r>
+      <w:r>
+        <w:t xml:space="preserve"> </w:t>
+      </w:r>
+      <w:r>
+        <w:rPr>
+          <w:rStyle w:val="VerbatimChar"/>
+        </w:rPr>
+        <w:t xml:space="preserve">workflow.py</w:t>
+      </w:r>
+      <w:r>
+        <w:t xml:space="preserve"> </w:t>
+      </w:r>
+      <w:r>
+        <w:t xml:space="preserve">(Hamiltonian, trial state, pulses, bound),</w:t>
+      </w:r>
+      <w:r>
+        <w:t xml:space="preserve"> </w:t>
+      </w:r>
+      <w:r>
+        <w:rPr>
+          <w:rStyle w:val="VerbatimChar"/>
+        </w:rPr>
+        <w:t xml:space="preserve">run_experiments.py</w:t>
+      </w:r>
+      <w:r>
+        <w:t xml:space="preserve"> </w:t>
+      </w:r>
+      <w:r>
+        <w:t xml:space="preserve">(cases, writes</w:t>
+      </w:r>
+      <w:r>
+        <w:t xml:space="preserve"> </w:t>
+      </w:r>
+      <w:r>
+        <w:rPr>
+          <w:rStyle w:val="VerbatimChar"/>
+        </w:rPr>
+        <w:t xml:space="preserve">results/case_*.json</w:t>
+      </w:r>
+      <w:r>
+        <w:t xml:space="preserve">),</w:t>
+      </w:r>
+      <w:r>
+        <w:t xml:space="preserve"> </w:t>
+      </w:r>
+      <w:r>
+        <w:rPr>
+          <w:rStyle w:val="VerbatimChar"/>
+        </w:rPr>
+        <w:t xml:space="preserve">pinsker_check.py</w:t>
+      </w:r>
+      <w:r>
+        <w:t xml:space="preserve">,</w:t>
+      </w:r>
+      <w:r>
+        <w:t xml:space="preserve"> </w:t>
+      </w:r>
+      <w:r>
+        <w:rPr>
+          <w:rStyle w:val="VerbatimChar"/>
+        </w:rPr>
+        <w:t xml:space="preserve">resources.py</w:t>
+      </w:r>
+      <w:r>
+        <w:t xml:space="preserve"> </w:t>
+      </w:r>
+      <w:r>
+        <w:t xml:space="preserve">(CX counts; the only script that needs qiskit),</w:t>
+      </w:r>
+      <w:r>
+        <w:t xml:space="preserve"> </w:t>
+      </w:r>
+      <w:r>
+        <w:rPr>
+          <w:rStyle w:val="VerbatimChar"/>
+        </w:rPr>
+        <w:t xml:space="preserve">make_report.py</w:t>
+      </w:r>
+      <w:r>
+        <w:t xml:space="preserve"> </w:t>
+      </w:r>
+      <w:r>
+        <w:t xml:space="preserve">(tables, figures),</w:t>
+      </w:r>
+      <w:r>
+        <w:t xml:space="preserve"> </w:t>
+      </w:r>
+      <w:r>
+        <w:rPr>
+          <w:rStyle w:val="VerbatimChar"/>
+        </w:rPr>
+        <w:t xml:space="preserve">build_paper.py</w:t>
+      </w:r>
+      <w:r>
+        <w:t xml:space="preserve"> </w:t>
+      </w:r>
+      <w:r>
+        <w:t xml:space="preserve">(this document). The filter design and certification are</w:t>
+      </w:r>
+      <w:r>
+        <w:t xml:space="preserve"> </w:t>
+      </w:r>
+      <w:r>
+        <w:rPr>
+          <w:rStyle w:val="VerbatimChar"/>
+        </w:rPr>
+        <w:t xml:space="preserve">j1j2_filter/floor.py</w:t>
+      </w:r>
+      <w:r>
+        <w:t xml:space="preserve">. Requirements: numpy, scipy, matplotlib;</w:t>
+      </w:r>
+      <w:r>
+        <w:t xml:space="preserve"> </w:t>
+      </w:r>
+      <w:r>
+        <w:rPr>
+          <w:rStyle w:val="VerbatimChar"/>
+        </w:rPr>
+        <w:t xml:space="preserve">resources.py</w:t>
+      </w:r>
+      <w:r>
+        <w:t xml:space="preserve"> </w:t>
+      </w:r>
+      <w:r>
+        <w:t xml:space="preserve">additionally needs qiskit. No quimb or mps-to-circuit. The full grid takes a few minutes on one CPU core (the</w:t>
+      </w:r>
+      <w:r>
+        <w:t xml:space="preserve"> </w:t>
+      </w:r>
+      <m:oMath>
+        <m:r>
+          <m:t>N</m:t>
+        </m:r>
+        <m:r>
+          <m:rPr>
+            <m:sty m:val="p"/>
+          </m:rPr>
+          <m:t>=</m:t>
+        </m:r>
+        <m:r>
+          <m:t>12</m:t>
+        </m:r>
+      </m:oMath>
+      <w:r>
+        <w:t xml:space="preserve"> </w:t>
+      </w:r>
+      <w:r>
+        <w:t xml:space="preserve">cases dominate). Seeds are fixed (the</w:t>
+      </w:r>
+      <w:r>
+        <w:t xml:space="preserve"> </w:t>
+      </w:r>
+      <m:oMath>
+        <m:r>
+          <m:t>N</m:t>
+        </m:r>
+        <m:r>
+          <m:rPr>
+            <m:sty m:val="p"/>
+          </m:rPr>
+          <m:t>=</m:t>
+        </m:r>
+        <m:r>
+          <m:t>12</m:t>
+        </m:r>
+      </m:oMath>
+      <w:r>
+        <w:t xml:space="preserve"> </w:t>
+      </w:r>
+      <w:r>
+        <w:t xml:space="preserve">ground state uses a fixed Lanczos start vector, since</w:t>
+      </w:r>
+      <w:r>
+        <w:t xml:space="preserve"> </w:t>
+      </w:r>
+      <m:oMath>
+        <m:r>
+          <m:t>χ</m:t>
+        </m:r>
+        <m:r>
+          <m:rPr>
+            <m:sty m:val="p"/>
+          </m:rPr>
+          <m:t>=</m:t>
+        </m:r>
+        <m:r>
+          <m:t>2</m:t>
+        </m:r>
+      </m:oMath>
+      <w:r>
+        <w:t xml:space="preserve"> </w:t>
+      </w:r>
+      <w:r>
+        <w:t xml:space="preserve">truncation cuts through degenerate Schmidt values and</w:t>
+      </w:r>
+      <w:r>
+        <w:t xml:space="preserve"> </w:t>
+      </w:r>
+      <m:oMath>
+        <m:r>
+          <m:t>γ</m:t>
+        </m:r>
+      </m:oMath>
+      <w:r>
+        <w:t xml:space="preserve"> </w:t>
+      </w:r>
+      <w:r>
+        <w:t xml:space="preserve">otherwise varies in the third digit between runs).</w:t>
+      </w:r>
+    </w:p>
+    <w:bookmarkEnd w:id="52"/>
+    <w:bookmarkStart w:id="53" w:name="references"/>
+    <w:p>
+      <w:pPr>
+        <w:pStyle w:val="Heading2"/>
+      </w:pPr>
+      <w:r>
+        <w:t xml:space="preserve">References</w:t>
+      </w:r>
+    </w:p>
+    <w:p>
+      <w:pPr>
+        <w:numPr>
+          <w:ilvl w:val="0"/>
+          <w:numId w:val="1009"/>
+        </w:numPr>
+        <w:pStyle w:val="Compact"/>
+      </w:pPr>
+      <w:r>
+        <w:t xml:space="preserve">I. Stetcu, A. Baroni, J. Carlson,</w:t>
       </w:r>
       <w:r>
         <w:t xml:space="preserve"> </w:t>
@@ -25245,7 +27810,54 @@
         <w:t xml:space="preserve">“</w:t>
       </w:r>
       <w:r>
-        <w:t xml:space="preserve">Density matrix formulation for quantum renormalization groups,</w:t>
+        <w:t xml:space="preserve">Projection algorithm for state preparation on quantum computers,</w:t>
+      </w:r>
+      <w:r>
+        <w:t xml:space="preserve">”</w:t>
+      </w:r>
+      <w:r>
+        <w:t xml:space="preserve"> </w:t>
+      </w:r>
+      <w:r>
+        <w:rPr>
+          <w:iCs/>
+          <w:i/>
+        </w:rPr>
+        <w:t xml:space="preserve">Phys. Rev. C</w:t>
+      </w:r>
+      <w:r>
+        <w:t xml:space="preserve"> </w:t>
+      </w:r>
+      <w:r>
+        <w:rPr>
+          <w:bCs/>
+          <w:b/>
+        </w:rPr>
+        <w:t xml:space="preserve">105</w:t>
+      </w:r>
+      <w:r>
+        <w:t xml:space="preserve">, 064308 (2022).</w:t>
+      </w:r>
+    </w:p>
+    <w:p>
+      <w:pPr>
+        <w:numPr>
+          <w:ilvl w:val="0"/>
+          <w:numId w:val="1009"/>
+        </w:numPr>
+        <w:pStyle w:val="Compact"/>
+      </w:pPr>
+      <w:r>
+        <w:t xml:space="preserve">K. Choi, D. Lee, J. Bonitati, Z. Qian, J. Watkins,</w:t>
+      </w:r>
+      <w:r>
+        <w:t xml:space="preserve"> </w:t>
+      </w:r>
+      <w:r>
+        <w:t xml:space="preserve">“</w:t>
+      </w:r>
+      <w:r>
+        <w:t xml:space="preserve">Rodeo algorithm for quantum computing,</w:t>
       </w:r>
       <w:r>
         <w:t xml:space="preserve">”</w:t>
@@ -25268,6 +27880,203 @@
           <w:bCs/>
           <w:b/>
         </w:rPr>
+        <w:t xml:space="preserve">127</w:t>
+      </w:r>
+      <w:r>
+        <w:t xml:space="preserve">, 040505 (2021).</w:t>
+      </w:r>
+    </w:p>
+    <w:p>
+      <w:pPr>
+        <w:numPr>
+          <w:ilvl w:val="0"/>
+          <w:numId w:val="1009"/>
+        </w:numPr>
+        <w:pStyle w:val="Compact"/>
+      </w:pPr>
+      <w:r>
+        <w:t xml:space="preserve">A. M. Childs, Y. Su, M. C. Tran, N. Wiebe, S. Zhu,</w:t>
+      </w:r>
+      <w:r>
+        <w:t xml:space="preserve"> </w:t>
+      </w:r>
+      <w:r>
+        <w:t xml:space="preserve">“</w:t>
+      </w:r>
+      <w:r>
+        <w:t xml:space="preserve">Theory of Trotter error with commutator scaling,</w:t>
+      </w:r>
+      <w:r>
+        <w:t xml:space="preserve">”</w:t>
+      </w:r>
+      <w:r>
+        <w:t xml:space="preserve"> </w:t>
+      </w:r>
+      <w:r>
+        <w:rPr>
+          <w:iCs/>
+          <w:i/>
+        </w:rPr>
+        <w:t xml:space="preserve">Phys. Rev. X</w:t>
+      </w:r>
+      <w:r>
+        <w:t xml:space="preserve"> </w:t>
+      </w:r>
+      <w:r>
+        <w:rPr>
+          <w:bCs/>
+          <w:b/>
+        </w:rPr>
+        <w:t xml:space="preserve">11</w:t>
+      </w:r>
+      <w:r>
+        <w:t xml:space="preserve">, 011020 (2021).</w:t>
+      </w:r>
+    </w:p>
+    <w:p>
+      <w:pPr>
+        <w:numPr>
+          <w:ilvl w:val="0"/>
+          <w:numId w:val="1009"/>
+        </w:numPr>
+        <w:pStyle w:val="Compact"/>
+      </w:pPr>
+      <w:r>
+        <w:t xml:space="preserve">M. A. Nielsen, I. L. Chuang,</w:t>
+      </w:r>
+      <w:r>
+        <w:t xml:space="preserve"> </w:t>
+      </w:r>
+      <w:r>
+        <w:rPr>
+          <w:iCs/>
+          <w:i/>
+        </w:rPr>
+        <w:t xml:space="preserve">Quantum Computation and Quantum Information</w:t>
+      </w:r>
+      <w:r>
+        <w:t xml:space="preserve"> </w:t>
+      </w:r>
+      <w:r>
+        <w:t xml:space="preserve">(Cambridge University Press, 2000), Ch. 9 (trace distance, fidelity).</w:t>
+      </w:r>
+    </w:p>
+    <w:p>
+      <w:pPr>
+        <w:numPr>
+          <w:ilvl w:val="0"/>
+          <w:numId w:val="1009"/>
+        </w:numPr>
+        <w:pStyle w:val="Compact"/>
+      </w:pPr>
+      <w:r>
+        <w:t xml:space="preserve">C. A. Fuchs, J. van de Graaf,</w:t>
+      </w:r>
+      <w:r>
+        <w:t xml:space="preserve"> </w:t>
+      </w:r>
+      <w:r>
+        <w:t xml:space="preserve">“</w:t>
+      </w:r>
+      <w:r>
+        <w:t xml:space="preserve">Cryptographic distinguishability measures for quantum-mechanical states,</w:t>
+      </w:r>
+      <w:r>
+        <w:t xml:space="preserve">”</w:t>
+      </w:r>
+      <w:r>
+        <w:t xml:space="preserve"> </w:t>
+      </w:r>
+      <w:r>
+        <w:rPr>
+          <w:iCs/>
+          <w:i/>
+        </w:rPr>
+        <w:t xml:space="preserve">IEEE Trans. Inf. Theory</w:t>
+      </w:r>
+      <w:r>
+        <w:t xml:space="preserve"> </w:t>
+      </w:r>
+      <w:r>
+        <w:rPr>
+          <w:bCs/>
+          <w:b/>
+        </w:rPr>
+        <w:t xml:space="preserve">45</w:t>
+      </w:r>
+      <w:r>
+        <w:t xml:space="preserve">, 1216 (1999).</w:t>
+      </w:r>
+    </w:p>
+    <w:p>
+      <w:pPr>
+        <w:numPr>
+          <w:ilvl w:val="0"/>
+          <w:numId w:val="1009"/>
+        </w:numPr>
+        <w:pStyle w:val="Compact"/>
+      </w:pPr>
+      <w:r>
+        <w:t xml:space="preserve">T. M. Cover, J. A. Thomas,</w:t>
+      </w:r>
+      <w:r>
+        <w:t xml:space="preserve"> </w:t>
+      </w:r>
+      <w:r>
+        <w:rPr>
+          <w:iCs/>
+          <w:i/>
+        </w:rPr>
+        <w:t xml:space="preserve">Elements of Information Theory</w:t>
+      </w:r>
+      <w:r>
+        <w:t xml:space="preserve"> </w:t>
+      </w:r>
+      <w:r>
+        <w:t xml:space="preserve">(Wiley, 2006), Lemma 11.6.1 (Pinsker’s inequality).</w:t>
+      </w:r>
+    </w:p>
+    <w:p>
+      <w:pPr>
+        <w:numPr>
+          <w:ilvl w:val="0"/>
+          <w:numId w:val="1009"/>
+        </w:numPr>
+        <w:pStyle w:val="Compact"/>
+      </w:pPr>
+      <w:r>
+        <w:t xml:space="preserve">S. R. White,</w:t>
+      </w:r>
+      <w:r>
+        <w:t xml:space="preserve"> </w:t>
+      </w:r>
+      <w:r>
+        <w:t xml:space="preserve">“</w:t>
+      </w:r>
+      <w:r>
+        <w:t xml:space="preserve">Density matrix formulation for quantum renormalization groups,</w:t>
+      </w:r>
+      <w:r>
+        <w:t xml:space="preserve">”</w:t>
+      </w:r>
+      <w:r>
+        <w:t xml:space="preserve"> </w:t>
+      </w:r>
+      <w:r>
+        <w:rPr>
+          <w:iCs/>
+          <w:i/>
+        </w:rPr>
+        <w:t xml:space="preserve">Phys. Rev. Lett.</w:t>
+      </w:r>
+      <w:r>
+        <w:t xml:space="preserve"> </w:t>
+      </w:r>
+      <w:r>
+        <w:rPr>
+          <w:bCs/>
+          <w:b/>
+        </w:rPr>
         <w:t xml:space="preserve">69</w:t>
       </w:r>
       <w:r>
@@ -25309,8 +28118,8 @@
         <w:t xml:space="preserve">, 96 (2011).</w:t>
       </w:r>
     </w:p>
-    <w:bookmarkEnd w:id="49"/>
-    <w:bookmarkStart w:id="50" w:name="appendix-a.-first-order-trotter-bound"/>
+    <w:bookmarkEnd w:id="53"/>
+    <w:bookmarkStart w:id="54" w:name="appendix-a.-first-order-trotter-bound"/>
     <w:p>
       <w:pPr>
         <w:pStyle w:val="Heading2"/>
@@ -27424,7 +30233,7 @@
         <w:t xml:space="preserve">commutes with everything and is applied exactly.</w:t>
       </w:r>
     </w:p>
-    <w:bookmarkEnd w:id="50"/>
+    <w:bookmarkEnd w:id="54"/>
     <w:sectPr/>
   </w:body>
 </w:document>
@@ -27771,6 +30580,9 @@
     <w:abstractNumId w:val="991"/>
   </w:num>
   <w:num w:numId="1008">
+    <w:abstractNumId w:val="991"/>
+  </w:num>
+  <w:num w:numId="1009">
     <w:abstractNumId w:val="99411"/>
     <w:lvlOverride w:ilvl="0">
       <w:startOverride w:val="1"/>

</xml_diff>

<commit_message>
Audit: independent re-derivation of all stored results; direct (level-1) gate counts; correct Trotter-lemma ordering, spectral-window shift, triplet/singlet claim, bond dimension, design-search settings; docs regenerated
Co-Authored-By: Claude Sonnet 5.5 <noreply@anthropic.com>
Claude-Session: https://claude.ai/code/session_01MwP9ak6eXBRPY8cKeU4Bsg
</commit_message>
<xml_diff>
--- a/simple_paper/paper.docx
+++ b/simple_paper/paper.docx
@@ -327,7 +327,7 @@
         </m:r>
       </m:oMath>
       <w:r>
-        <w:t xml:space="preserve">); the excited state is the lowest state of any symmetry, as required across the Berezinskii–Kosterlitz–Thouless point of the chain, and the bandwidth is certified by Weyl’s inequality without a DMRG value for the top of the spectrum. The paper is organised around three questions.</w:t>
+        <w:t xml:space="preserve">); the excited state is the lowest state of any symmetry (its symmetry is not assumed; it was a triplet in every exact case checked), and the bandwidth is certified by Weyl’s inequality without a DMRG value for the top of the spectrum. The paper is organised around three questions.</w:t>
       </w:r>
       <w:r>
         <w:t xml:space="preserve"> </w:t>
@@ -822,14 +822,14 @@
         <w:t xml:space="preserve"> </w:t>
       </w:r>
       <w:r>
-        <w:t xml:space="preserve">CX and</w:t>
-      </w:r>
-      <w:r>
-        <w:t xml:space="preserve"> </w:t>
-      </w:r>
-      <m:oMath>
-        <m:r>
-          <m:t>3.6</m:t>
+        <w:t xml:space="preserve">CX (re-synthesised;</w:t>
+      </w:r>
+      <w:r>
+        <w:t xml:space="preserve"> </w:t>
+      </w:r>
+      <m:oMath>
+        <m:r>
+          <m:t>4.8</m:t>
         </m:r>
         <m:r>
           <m:rPr>
@@ -855,7 +855,7 @@
       </w:r>
       <m:oMath>
         <m:r>
-          <m:t>1.2</m:t>
+          <m:t>1.6</m:t>
         </m:r>
         <m:r>
           <m:rPr>
@@ -880,7 +880,65 @@
         <w:t xml:space="preserve"> </w:t>
       </w:r>
       <w:r>
-        <w:t xml:space="preserve">non-Clifford rotations. The workflow is a conditionally certified, reproducible way to use the filter and a calibrated account of its cost, not a resource advantage on these chains.</w:t>
+        <w:t xml:space="preserve">direct) and</w:t>
+      </w:r>
+      <w:r>
+        <w:t xml:space="preserve"> </w:t>
+      </w:r>
+      <m:oMath>
+        <m:r>
+          <m:t>1.2</m:t>
+        </m:r>
+        <m:r>
+          <m:rPr>
+            <m:sty m:val="p"/>
+          </m:rPr>
+          <m:t>×</m:t>
+        </m:r>
+        <m:sSup>
+          <m:e>
+            <m:r>
+              <m:t>10</m:t>
+            </m:r>
+          </m:e>
+          <m:sup>
+            <m:r>
+              <m:t>6</m:t>
+            </m:r>
+          </m:sup>
+        </m:sSup>
+      </m:oMath>
+      <w:r>
+        <w:t xml:space="preserve">–</w:t>
+      </w:r>
+      <m:oMath>
+        <m:r>
+          <m:t>4.1</m:t>
+        </m:r>
+        <m:r>
+          <m:rPr>
+            <m:sty m:val="p"/>
+          </m:rPr>
+          <m:t>×</m:t>
+        </m:r>
+        <m:sSup>
+          <m:e>
+            <m:r>
+              <m:t>10</m:t>
+            </m:r>
+          </m:e>
+          <m:sup>
+            <m:r>
+              <m:t>7</m:t>
+            </m:r>
+          </m:sup>
+        </m:sSup>
+      </m:oMath>
+      <w:r>
+        <w:t xml:space="preserve"> </w:t>
+      </w:r>
+      <w:r>
+        <w:t xml:space="preserve">non-Clifford rotations (direct). The workflow is a conditionally certified, reproducible way to use the filter and a calibrated account of its cost, not a resource advantage on these chains.</w:t>
       </w:r>
     </w:p>
     <w:bookmarkEnd w:id="20"/>
@@ -1925,7 +1983,42 @@
         </m:sSub>
       </m:oMath>
       <w:r>
-        <w:t xml:space="preserve">, which matters because the first excitation of the</w:t>
+        <w:t xml:space="preserve">, so the symmetry of the first excitation is not assumed. In every exact case checked (</w:t>
+      </w:r>
+      <m:oMath>
+        <m:r>
+          <m:t>N</m:t>
+        </m:r>
+        <m:r>
+          <m:rPr>
+            <m:sty m:val="p"/>
+          </m:rPr>
+          <m:t>=</m:t>
+        </m:r>
+        <m:r>
+          <m:t>8</m:t>
+        </m:r>
+        <m:r>
+          <m:rPr>
+            <m:sty m:val="p"/>
+          </m:rPr>
+          <m:t>,</m:t>
+        </m:r>
+        <m:r>
+          <m:t>10</m:t>
+        </m:r>
+        <m:r>
+          <m:rPr>
+            <m:sty m:val="p"/>
+          </m:rPr>
+          <m:t>,</m:t>
+        </m:r>
+        <m:r>
+          <m:t>12</m:t>
+        </m:r>
+      </m:oMath>
+      <w:r>
+        <w:t xml:space="preserve">,</w:t>
       </w:r>
       <w:r>
         <w:t xml:space="preserve"> </w:t>
@@ -1939,33 +2032,40 @@
           </m:e>
           <m:sub>
             <m:r>
-              <m:t>1</m:t>
+              <m:t>2</m:t>
             </m:r>
           </m:sub>
         </m:sSub>
-      </m:oMath>
-      <w:r>
-        <w:t xml:space="preserve">–</w:t>
-      </w:r>
-      <m:oMath>
-        <m:sSub>
-          <m:e>
-            <m:r>
-              <m:t>J</m:t>
-            </m:r>
-          </m:e>
-          <m:sub>
-            <m:r>
-              <m:t>2</m:t>
-            </m:r>
-          </m:sub>
-        </m:sSub>
-      </m:oMath>
-      <w:r>
-        <w:t xml:space="preserve"> </w:t>
-      </w:r>
-      <w:r>
-        <w:t xml:space="preserve">chain is a triplet below the Berezinskii–Kosterlitz–Thouless point</w:t>
+        <m:r>
+          <m:rPr>
+            <m:sty m:val="p"/>
+          </m:rPr>
+          <m:t>=</m:t>
+        </m:r>
+        <m:r>
+          <m:t>0</m:t>
+        </m:r>
+        <m:r>
+          <m:rPr>
+            <m:sty m:val="p"/>
+          </m:rPr>
+          <m:t>,</m:t>
+        </m:r>
+        <m:r>
+          <m:t>0.2411</m:t>
+        </m:r>
+        <m:r>
+          <m:rPr>
+            <m:sty m:val="p"/>
+          </m:rPr>
+          <m:t>,</m:t>
+        </m:r>
+        <m:r>
+          <m:t>0.4</m:t>
+        </m:r>
+      </m:oMath>
+      <w:r>
+        <w:t xml:space="preserve">, open chains) it is a triplet, but the critical point</w:t>
       </w:r>
       <w:r>
         <w:t xml:space="preserve"> </w:t>
@@ -2002,7 +2102,7 @@
         <w:t xml:space="preserve"> </w:t>
       </w:r>
       <w:r>
-        <w:t xml:space="preserve">[12,13] but can be a singlet in the dimerised phase. The bandwidth is certified without DMRG: by Weyl’s inequality</w:t>
+        <w:t xml:space="preserve">[12,13] is itself located by a singlet–triplet level crossing in periodic chains, so the lowest excitation need not stay a triplet elsewhere in the phase diagram. The bandwidth is certified without DMRG: by Weyl’s inequality</w:t>
       </w:r>
       <w:r>
         <w:t xml:space="preserve"> </w:t>
@@ -8594,7 +8694,7 @@
               <w:t xml:space="preserve"> </w:t>
             </w:r>
             <w:r>
-              <w:t xml:space="preserve">its total weight; the chains studied have a nondegenerate singlet ground state (a degenerate space would show up as</w:t>
+              <w:t xml:space="preserve">its total weight; in every case computed the gap is positive, i.e. the ground state is nondegenerate (a degenerate space would show up as</w:t>
             </w:r>
             <w:r>
               <w:t xml:space="preserve"> </w:t>
@@ -9057,7 +9157,7 @@
           <m:t>≤</m:t>
         </m:r>
         <m:r>
-          <m:t>114</m:t>
+          <m:t>133</m:t>
         </m:r>
       </m:oMath>
       <w:r>
@@ -9437,61 +9537,21 @@
           <w:bCs/>
           <w:b/>
         </w:rPr>
-        <w:t xml:space="preserve">Simulation.</w:t>
-      </w:r>
-      <w:r>
-        <w:t xml:space="preserve"> </w:t>
-      </w:r>
-      <w:r>
-        <w:t xml:space="preserve">Exact statevector simulation of the Trotterised filter, the ideal filter, and the ground state. A run is simulated only if</w:t>
-      </w:r>
-      <w:r>
-        <w:t xml:space="preserve"> </w:t>
-      </w:r>
-      <m:oMath>
-        <m:r>
-          <m:t>n</m:t>
-        </m:r>
-        <m:r>
-          <m:rPr>
-            <m:sty m:val="p"/>
-          </m:rPr>
-          <m:t>×</m:t>
-        </m:r>
-        <m:r>
-          <m:rPr>
-            <m:nor/>
-            <m:sty m:val="p"/>
-          </m:rPr>
-          <m:t>bonds</m:t>
-        </m:r>
-        <m:r>
-          <m:rPr>
-            <m:sty m:val="p"/>
-          </m:rPr>
-          <m:t>×</m:t>
-        </m:r>
-        <m:r>
-          <m:t>2</m:t>
-        </m:r>
-        <m:r>
-          <m:rPr>
-            <m:sty m:val="p"/>
-          </m:rPr>
-          <m:t>×</m:t>
-        </m:r>
-        <m:sSup>
-          <m:e>
-            <m:r>
-              <m:t>2</m:t>
-            </m:r>
-          </m:e>
-          <m:sup>
-            <m:r>
-              <m:t>N</m:t>
-            </m:r>
-          </m:sup>
-        </m:sSup>
+        <w:t xml:space="preserve">Filter design search.</w:t>
+      </w:r>
+      <w:r>
+        <w:t xml:space="preserve"> </w:t>
+      </w:r>
+      <w:r>
+        <w:t xml:space="preserve">For</w:t>
+      </w:r>
+      <w:r>
+        <w:t xml:space="preserve"> </w:t>
+      </w:r>
+      <m:oMath>
+        <m:r>
+          <m:t>N</m:t>
+        </m:r>
         <m:r>
           <m:rPr>
             <m:sty m:val="p"/>
@@ -9499,87 +9559,596 @@
           <m:t>≤</m:t>
         </m:r>
         <m:r>
-          <m:t>1.5</m:t>
-        </m:r>
-        <m:r>
-          <m:rPr>
-            <m:sty m:val="p"/>
-          </m:rPr>
-          <m:t>×</m:t>
-        </m:r>
-        <m:sSup>
-          <m:e>
-            <m:r>
-              <m:t>10</m:t>
-            </m:r>
-          </m:e>
-          <m:sup>
-            <m:r>
-              <m:t>10</m:t>
-            </m:r>
-          </m:sup>
-        </m:sSup>
-      </m:oMath>
-      <w:r>
-        <w:t xml:space="preserve">; the</w:t>
-      </w:r>
-      <w:r>
-        <w:t xml:space="preserve"> </w:t>
-      </w:r>
-      <m:oMath>
-        <m:r>
-          <m:t>N</m:t>
-        </m:r>
-        <m:r>
-          <m:rPr>
-            <m:sty m:val="p"/>
-          </m:rPr>
-          <m:t>=</m:t>
-        </m:r>
-        <m:r>
           <m:t>16</m:t>
         </m:r>
       </m:oMath>
       <w:r>
-        <w:t xml:space="preserve">,</w:t>
-      </w:r>
-      <w:r>
-        <w:t xml:space="preserve"> </w:t>
-      </w:r>
-      <m:oMath>
-        <m:r>
-          <m:t>ε</m:t>
-        </m:r>
-        <m:r>
-          <m:rPr>
-            <m:sty m:val="p"/>
-          </m:rPr>
-          <m:t>=</m:t>
-        </m:r>
-        <m:sSup>
-          <m:e>
-            <m:r>
-              <m:t>10</m:t>
-            </m:r>
-          </m:e>
-          <m:sup>
+        <w:t xml:space="preserve"> </w:t>
+      </w:r>
+      <w:r>
+        <w:t xml:space="preserve">(</w:t>
+      </w:r>
+      <w:r>
+        <w:rPr>
+          <w:rStyle w:val="VerbatimChar"/>
+        </w:rPr>
+        <w:t xml:space="preserve">simple_paper/run_experiments.py</w:t>
+      </w:r>
+      <w:r>
+        <w:t xml:space="preserve">): leakage share</w:t>
+      </w:r>
+      <w:r>
+        <w:t xml:space="preserve"> </w:t>
+      </w:r>
+      <m:oMath>
+        <m:sSub>
+          <m:e>
+            <m:r>
+              <m:t>ε</m:t>
+            </m:r>
+          </m:e>
+          <m:sub>
             <m:r>
               <m:rPr>
                 <m:sty m:val="p"/>
               </m:rPr>
-              <m:t>−</m:t>
-            </m:r>
-            <m:r>
-              <m:t>2</m:t>
-            </m:r>
-          </m:sup>
-        </m:sSup>
-      </m:oMath>
-      <w:r>
-        <w:t xml:space="preserve"> </w:t>
-      </w:r>
-      <w:r>
-        <w:t xml:space="preserve">certified circuits are not simulated, and their step counts and CX are reported from the certificate.</w:t>
+              <m:t>ℓ</m:t>
+            </m:r>
+          </m:sub>
+        </m:sSub>
+        <m:r>
+          <m:rPr>
+            <m:sty m:val="p"/>
+          </m:rPr>
+          <m:t>=</m:t>
+        </m:r>
+        <m:r>
+          <m:t>ε</m:t>
+        </m:r>
+        <m:r>
+          <m:rPr>
+            <m:sty m:val="p"/>
+          </m:rPr>
+          <m:t>/</m:t>
+        </m:r>
+        <m:r>
+          <m:t>4</m:t>
+        </m:r>
+      </m:oMath>
+      <w:r>
+        <w:t xml:space="preserve">,</w:t>
+      </w:r>
+      <w:r>
+        <w:t xml:space="preserve"> </w:t>
+      </w:r>
+      <m:oMath>
+        <m:r>
+          <m:t>x</m:t>
+        </m:r>
+        <m:r>
+          <m:rPr>
+            <m:sty m:val="p"/>
+          </m:rPr>
+          <m:t>=</m:t>
+        </m:r>
+        <m:r>
+          <m:t>T</m:t>
+        </m:r>
+        <m:r>
+          <m:t>Δ</m:t>
+        </m:r>
+        <m:r>
+          <m:rPr>
+            <m:sty m:val="p"/>
+          </m:rPr>
+          <m:t>/</m:t>
+        </m:r>
+        <m:r>
+          <m:t>π</m:t>
+        </m:r>
+        <m:r>
+          <m:rPr>
+            <m:sty m:val="p"/>
+          </m:rPr>
+          <m:t>∈</m:t>
+        </m:r>
+        <m:r>
+          <m:rPr>
+            <m:sty m:val="p"/>
+          </m:rPr>
+          <m:t>{</m:t>
+        </m:r>
+        <m:r>
+          <m:t>0.6</m:t>
+        </m:r>
+        <m:r>
+          <m:rPr>
+            <m:sty m:val="p"/>
+          </m:rPr>
+          <m:t>,</m:t>
+        </m:r>
+        <m:r>
+          <m:t>1</m:t>
+        </m:r>
+        <m:r>
+          <m:rPr>
+            <m:sty m:val="p"/>
+          </m:rPr>
+          <m:t>,</m:t>
+        </m:r>
+        <m:r>
+          <m:t>1.5</m:t>
+        </m:r>
+        <m:r>
+          <m:rPr>
+            <m:sty m:val="p"/>
+          </m:rPr>
+          <m:t>,</m:t>
+        </m:r>
+        <m:r>
+          <m:t>2</m:t>
+        </m:r>
+        <m:r>
+          <m:rPr>
+            <m:sty m:val="p"/>
+          </m:rPr>
+          <m:t>}</m:t>
+        </m:r>
+      </m:oMath>
+      <w:r>
+        <w:t xml:space="preserve"> </w:t>
+      </w:r>
+      <w:r>
+        <w:t xml:space="preserve">and</w:t>
+      </w:r>
+      <w:r>
+        <w:t xml:space="preserve"> </w:t>
+      </w:r>
+      <m:oMath>
+        <m:r>
+          <m:t>m</m:t>
+        </m:r>
+        <m:r>
+          <m:rPr>
+            <m:sty m:val="p"/>
+          </m:rPr>
+          <m:t>∈</m:t>
+        </m:r>
+        <m:r>
+          <m:rPr>
+            <m:sty m:val="p"/>
+          </m:rPr>
+          <m:t>{</m:t>
+        </m:r>
+        <m:r>
+          <m:t>4</m:t>
+        </m:r>
+        <m:r>
+          <m:rPr>
+            <m:sty m:val="p"/>
+          </m:rPr>
+          <m:t>,</m:t>
+        </m:r>
+        <m:r>
+          <m:t>6</m:t>
+        </m:r>
+        <m:r>
+          <m:rPr>
+            <m:sty m:val="p"/>
+          </m:rPr>
+          <m:t>}</m:t>
+        </m:r>
+      </m:oMath>
+      <w:r>
+        <w:t xml:space="preserve"> </w:t>
+      </w:r>
+      <w:r>
+        <w:t xml:space="preserve">pulses, widened to</w:t>
+      </w:r>
+      <w:r>
+        <w:t xml:space="preserve"> </w:t>
+      </w:r>
+      <m:oMath>
+        <m:r>
+          <m:t>x</m:t>
+        </m:r>
+        <m:r>
+          <m:rPr>
+            <m:sty m:val="p"/>
+          </m:rPr>
+          <m:t>≤</m:t>
+        </m:r>
+        <m:r>
+          <m:t>4</m:t>
+        </m:r>
+      </m:oMath>
+      <w:r>
+        <w:t xml:space="preserve"> </w:t>
+      </w:r>
+      <w:r>
+        <w:t xml:space="preserve">and</w:t>
+      </w:r>
+      <w:r>
+        <w:t xml:space="preserve"> </w:t>
+      </w:r>
+      <m:oMath>
+        <m:r>
+          <m:t>m</m:t>
+        </m:r>
+        <m:r>
+          <m:rPr>
+            <m:sty m:val="p"/>
+          </m:rPr>
+          <m:t>≤</m:t>
+        </m:r>
+        <m:r>
+          <m:t>10</m:t>
+        </m:r>
+      </m:oMath>
+      <w:r>
+        <w:t xml:space="preserve"> </w:t>
+      </w:r>
+      <w:r>
+        <w:t xml:space="preserve">if no design is feasible;</w:t>
+      </w:r>
+      <w:r>
+        <w:t xml:space="preserve"> </w:t>
+      </w:r>
+      <m:oMath>
+        <m:sSub>
+          <m:e>
+            <m:r>
+              <m:t>t</m:t>
+            </m:r>
+          </m:e>
+          <m:sub>
+            <m:r>
+              <m:rPr>
+                <m:sty m:val="p"/>
+              </m:rPr>
+              <m:t>min</m:t>
+            </m:r>
+          </m:sub>
+        </m:sSub>
+        <m:r>
+          <m:rPr>
+            <m:sty m:val="p"/>
+          </m:rPr>
+          <m:t>=</m:t>
+        </m:r>
+        <m:r>
+          <m:t>0.05</m:t>
+        </m:r>
+        <m:r>
+          <m:t> </m:t>
+        </m:r>
+        <m:r>
+          <m:t>T</m:t>
+        </m:r>
+        <m:r>
+          <m:rPr>
+            <m:sty m:val="p"/>
+          </m:rPr>
+          <m:t>/</m:t>
+        </m:r>
+        <m:r>
+          <m:t>m</m:t>
+        </m:r>
+      </m:oMath>
+      <w:r>
+        <w:t xml:space="preserve">,</w:t>
+      </w:r>
+      <w:r>
+        <w:t xml:space="preserve"> </w:t>
+      </w:r>
+      <m:oMath>
+        <m:sSub>
+          <m:e>
+            <m:r>
+              <m:t>t</m:t>
+            </m:r>
+          </m:e>
+          <m:sub>
+            <m:r>
+              <m:rPr>
+                <m:sty m:val="p"/>
+              </m:rPr>
+              <m:t>max</m:t>
+            </m:r>
+          </m:sub>
+        </m:sSub>
+        <m:r>
+          <m:rPr>
+            <m:sty m:val="p"/>
+          </m:rPr>
+          <m:t>=</m:t>
+        </m:r>
+        <m:r>
+          <m:t>T</m:t>
+        </m:r>
+        <m:r>
+          <m:rPr>
+            <m:sty m:val="p"/>
+          </m:rPr>
+          <m:t>/</m:t>
+        </m:r>
+        <m:r>
+          <m:t>3</m:t>
+        </m:r>
+      </m:oMath>
+      <w:r>
+        <w:t xml:space="preserve">; ties go to fewer pulses. For</w:t>
+      </w:r>
+      <w:r>
+        <w:t xml:space="preserve"> </w:t>
+      </w:r>
+      <m:oMath>
+        <m:r>
+          <m:t>N</m:t>
+        </m:r>
+        <m:r>
+          <m:rPr>
+            <m:sty m:val="p"/>
+          </m:rPr>
+          <m:t>≥</m:t>
+        </m:r>
+        <m:r>
+          <m:t>14</m:t>
+        </m:r>
+      </m:oMath>
+      <w:r>
+        <w:t xml:space="preserve"> </w:t>
+      </w:r>
+      <w:r>
+        <w:t xml:space="preserve">(</w:t>
+      </w:r>
+      <w:r>
+        <w:rPr>
+          <w:rStyle w:val="VerbatimChar"/>
+        </w:rPr>
+        <w:t xml:space="preserve">j1j2_filter/pipeline.py</w:t>
+      </w:r>
+      <w:r>
+        <w:t xml:space="preserve">): leakage shares</w:t>
+      </w:r>
+      <w:r>
+        <w:t xml:space="preserve"> </w:t>
+      </w:r>
+      <m:oMath>
+        <m:r>
+          <m:rPr>
+            <m:sty m:val="p"/>
+          </m:rPr>
+          <m:t>{</m:t>
+        </m:r>
+        <m:r>
+          <m:t>0.4</m:t>
+        </m:r>
+        <m:r>
+          <m:rPr>
+            <m:sty m:val="p"/>
+          </m:rPr>
+          <m:t>,</m:t>
+        </m:r>
+        <m:r>
+          <m:t>0.2</m:t>
+        </m:r>
+        <m:r>
+          <m:rPr>
+            <m:sty m:val="p"/>
+          </m:rPr>
+          <m:t>,</m:t>
+        </m:r>
+        <m:r>
+          <m:t>0.1</m:t>
+        </m:r>
+        <m:r>
+          <m:rPr>
+            <m:sty m:val="p"/>
+          </m:rPr>
+          <m:t>,</m:t>
+        </m:r>
+        <m:r>
+          <m:t>0.05</m:t>
+        </m:r>
+        <m:r>
+          <m:rPr>
+            <m:sty m:val="p"/>
+          </m:rPr>
+          <m:t>,</m:t>
+        </m:r>
+        <m:r>
+          <m:t>0.02</m:t>
+        </m:r>
+        <m:r>
+          <m:rPr>
+            <m:sty m:val="p"/>
+          </m:rPr>
+          <m:t>,</m:t>
+        </m:r>
+        <m:r>
+          <m:t>0.01</m:t>
+        </m:r>
+        <m:r>
+          <m:rPr>
+            <m:sty m:val="p"/>
+          </m:rPr>
+          <m:t>}</m:t>
+        </m:r>
+        <m:r>
+          <m:t>ε</m:t>
+        </m:r>
+      </m:oMath>
+      <w:r>
+        <w:t xml:space="preserve"> </w:t>
+      </w:r>
+      <w:r>
+        <w:t xml:space="preserve">scanned,</w:t>
+      </w:r>
+      <w:r>
+        <w:t xml:space="preserve"> </w:t>
+      </w:r>
+      <m:oMath>
+        <m:r>
+          <m:t>x</m:t>
+        </m:r>
+        <m:r>
+          <m:rPr>
+            <m:sty m:val="p"/>
+          </m:rPr>
+          <m:t>∈</m:t>
+        </m:r>
+        <m:d>
+          <m:dPr>
+            <m:begChr m:val="["/>
+            <m:endChr m:val="]"/>
+            <m:sepChr m:val=""/>
+            <m:grow/>
+          </m:dPr>
+          <m:e>
+            <m:r>
+              <m:t>0.4</m:t>
+            </m:r>
+            <m:r>
+              <m:rPr>
+                <m:sty m:val="p"/>
+              </m:rPr>
+              <m:t>,</m:t>
+            </m:r>
+            <m:r>
+              <m:t>2.5</m:t>
+            </m:r>
+          </m:e>
+        </m:d>
+      </m:oMath>
+      <w:r>
+        <w:t xml:space="preserve"> </w:t>
+      </w:r>
+      <w:r>
+        <w:t xml:space="preserve">(ten values),</w:t>
+      </w:r>
+      <w:r>
+        <w:t xml:space="preserve"> </w:t>
+      </w:r>
+      <m:oMath>
+        <m:r>
+          <m:t>m</m:t>
+        </m:r>
+        <m:r>
+          <m:rPr>
+            <m:sty m:val="p"/>
+          </m:rPr>
+          <m:t>∈</m:t>
+        </m:r>
+        <m:r>
+          <m:rPr>
+            <m:sty m:val="p"/>
+          </m:rPr>
+          <m:t>{</m:t>
+        </m:r>
+        <m:r>
+          <m:t>4</m:t>
+        </m:r>
+        <m:r>
+          <m:rPr>
+            <m:sty m:val="p"/>
+          </m:rPr>
+          <m:t>,</m:t>
+        </m:r>
+        <m:r>
+          <m:t>6</m:t>
+        </m:r>
+        <m:r>
+          <m:rPr>
+            <m:sty m:val="p"/>
+          </m:rPr>
+          <m:t>,</m:t>
+        </m:r>
+        <m:r>
+          <m:t>8</m:t>
+        </m:r>
+        <m:r>
+          <m:rPr>
+            <m:sty m:val="p"/>
+          </m:rPr>
+          <m:t>}</m:t>
+        </m:r>
+      </m:oMath>
+      <w:r>
+        <w:t xml:space="preserve">,</w:t>
+      </w:r>
+      <w:r>
+        <w:t xml:space="preserve"> </w:t>
+      </w:r>
+      <m:oMath>
+        <m:sSub>
+          <m:e>
+            <m:r>
+              <m:t>t</m:t>
+            </m:r>
+          </m:e>
+          <m:sub>
+            <m:r>
+              <m:rPr>
+                <m:sty m:val="p"/>
+              </m:rPr>
+              <m:t>max</m:t>
+            </m:r>
+          </m:sub>
+        </m:sSub>
+        <m:r>
+          <m:rPr>
+            <m:sty m:val="p"/>
+          </m:rPr>
+          <m:t>=</m:t>
+        </m:r>
+        <m:r>
+          <m:t>T</m:t>
+        </m:r>
+        <m:r>
+          <m:rPr>
+            <m:sty m:val="p"/>
+          </m:rPr>
+          <m:t>/</m:t>
+        </m:r>
+        <m:r>
+          <m:t>2</m:t>
+        </m:r>
+      </m:oMath>
+      <w:r>
+        <w:t xml:space="preserve">, and the share minimising</w:t>
+      </w:r>
+      <w:r>
+        <w:t xml:space="preserve"> </w:t>
+      </w:r>
+      <m:oMath>
+        <m:r>
+          <m:t>n</m:t>
+        </m:r>
+        <m:r>
+          <m:rPr>
+            <m:sty m:val="p"/>
+          </m:rPr>
+          <m:t>/</m:t>
+        </m:r>
+        <m:sSub>
+          <m:e>
+            <m:r>
+              <m:t>p</m:t>
+            </m:r>
+          </m:e>
+          <m:sub>
+            <m:r>
+              <m:t>g</m:t>
+            </m:r>
+          </m:sub>
+        </m:sSub>
+      </m:oMath>
+      <w:r>
+        <w:t xml:space="preserve"> </w:t>
+      </w:r>
+      <w:r>
+        <w:t xml:space="preserve">is kept. Both use the same certificate; the settings are search choices, not part of the proof.</w:t>
       </w:r>
     </w:p>
     <w:p>
@@ -9595,7 +10164,94 @@
           <w:bCs/>
           <w:b/>
         </w:rPr>
-        <w:t xml:space="preserve">Larger chains (</w:t>
+        <w:t xml:space="preserve">Simulation.</w:t>
+      </w:r>
+      <w:r>
+        <w:t xml:space="preserve"> </w:t>
+      </w:r>
+      <w:r>
+        <w:t xml:space="preserve">Exact statevector simulation of the Trotterised filter, the ideal filter, and the ground state. A run is simulated only if</w:t>
+      </w:r>
+      <w:r>
+        <w:t xml:space="preserve"> </w:t>
+      </w:r>
+      <m:oMath>
+        <m:r>
+          <m:t>n</m:t>
+        </m:r>
+        <m:r>
+          <m:rPr>
+            <m:sty m:val="p"/>
+          </m:rPr>
+          <m:t>×</m:t>
+        </m:r>
+        <m:r>
+          <m:rPr>
+            <m:nor/>
+            <m:sty m:val="p"/>
+          </m:rPr>
+          <m:t>bonds</m:t>
+        </m:r>
+        <m:r>
+          <m:rPr>
+            <m:sty m:val="p"/>
+          </m:rPr>
+          <m:t>×</m:t>
+        </m:r>
+        <m:r>
+          <m:t>2</m:t>
+        </m:r>
+        <m:r>
+          <m:rPr>
+            <m:sty m:val="p"/>
+          </m:rPr>
+          <m:t>×</m:t>
+        </m:r>
+        <m:sSup>
+          <m:e>
+            <m:r>
+              <m:t>2</m:t>
+            </m:r>
+          </m:e>
+          <m:sup>
+            <m:r>
+              <m:t>N</m:t>
+            </m:r>
+          </m:sup>
+        </m:sSup>
+        <m:r>
+          <m:rPr>
+            <m:sty m:val="p"/>
+          </m:rPr>
+          <m:t>≤</m:t>
+        </m:r>
+        <m:r>
+          <m:t>1.5</m:t>
+        </m:r>
+        <m:r>
+          <m:rPr>
+            <m:sty m:val="p"/>
+          </m:rPr>
+          <m:t>×</m:t>
+        </m:r>
+        <m:sSup>
+          <m:e>
+            <m:r>
+              <m:t>10</m:t>
+            </m:r>
+          </m:e>
+          <m:sup>
+            <m:r>
+              <m:t>10</m:t>
+            </m:r>
+          </m:sup>
+        </m:sSup>
+      </m:oMath>
+      <w:r>
+        <w:t xml:space="preserve">; the</w:t>
+      </w:r>
+      <w:r>
+        <w:t xml:space="preserve"> </w:t>
       </w:r>
       <m:oMath>
         <m:r>
@@ -9605,189 +10261,27 @@
           <m:rPr>
             <m:sty m:val="p"/>
           </m:rPr>
-          <m:t>≤</m:t>
-        </m:r>
-        <m:r>
-          <m:t>32</m:t>
-        </m:r>
-      </m:oMath>
-      <w:r>
-        <w:rPr>
-          <w:bCs/>
-          <w:b/>
-        </w:rPr>
-        <w:t xml:space="preserve">, Section 7.4).</w:t>
-      </w:r>
-      <w:r>
-        <w:t xml:space="preserve"> </w:t>
-      </w:r>
-      <w:r>
-        <w:t xml:space="preserve">The pipeline in</w:t>
-      </w:r>
-      <w:r>
-        <w:t xml:space="preserve"> </w:t>
-      </w:r>
-      <w:r>
-        <w:rPr>
-          <w:rStyle w:val="VerbatimChar"/>
-        </w:rPr>
-        <w:t xml:space="preserve">j1j2_filter/</w:t>
-      </w:r>
-      <w:r>
-        <w:t xml:space="preserve"> </w:t>
-      </w:r>
-      <w:r>
-        <w:t xml:space="preserve">runs DMRG and the circuits without any statevector or dense operator above</w:t>
-      </w:r>
-      <w:r>
-        <w:t xml:space="preserve"> </w:t>
-      </w:r>
-      <m:oMath>
-        <m:r>
-          <m:t>N</m:t>
-        </m:r>
-        <m:r>
-          <m:rPr>
-            <m:sty m:val="p"/>
-          </m:rPr>
           <m:t>=</m:t>
         </m:r>
         <m:r>
-          <m:t>14</m:t>
-        </m:r>
-      </m:oMath>
-      <w:r>
-        <w:t xml:space="preserve">:</w:t>
-      </w:r>
-      <w:r>
-        <w:t xml:space="preserve"> </w:t>
-      </w:r>
-      <m:oMath>
-        <m:r>
-          <m:t>γ</m:t>
-        </m:r>
-      </m:oMath>
-      <w:r>
-        <w:t xml:space="preserve"> </w:t>
-      </w:r>
-      <w:r>
-        <w:t xml:space="preserve">is the overlap of the DMRG MPS with the trial circuit simulated as an MPS (Aer), the trial state is an</w:t>
-      </w:r>
-      <w:r>
-        <w:t xml:space="preserve"> </w:t>
-      </w:r>
-      <m:oMath>
-        <m:r>
-          <m:t>L</m:t>
+          <m:t>16</m:t>
+        </m:r>
+      </m:oMath>
+      <w:r>
+        <w:t xml:space="preserve">,</w:t>
+      </w:r>
+      <w:r>
+        <w:t xml:space="preserve"> </w:t>
+      </w:r>
+      <m:oMath>
+        <m:r>
+          <m:t>ε</m:t>
         </m:r>
         <m:r>
           <m:rPr>
             <m:sty m:val="p"/>
           </m:rPr>
           <m:t>=</m:t>
-        </m:r>
-        <m:r>
-          <m:t>1</m:t>
-        </m:r>
-      </m:oMath>
-      <w:r>
-        <w:t xml:space="preserve"> </w:t>
-      </w:r>
-      <w:r>
-        <w:t xml:space="preserve">brickwork</w:t>
-      </w:r>
-      <w:r>
-        <w:t xml:space="preserve"> </w:t>
-      </w:r>
-      <w:r>
-        <w:rPr>
-          <w:rStyle w:val="VerbatimChar"/>
-        </w:rPr>
-        <w:t xml:space="preserve">mps-to-circuit</w:t>
-      </w:r>
-      <w:r>
-        <w:t xml:space="preserve"> </w:t>
-      </w:r>
-      <w:r>
-        <w:t xml:space="preserve">compilation,</w:t>
-      </w:r>
-      <w:r>
-        <w:t xml:space="preserve"> </w:t>
-      </w:r>
-      <m:oMath>
-        <m:sSub>
-          <m:e>
-            <m:r>
-              <m:t>J</m:t>
-            </m:r>
-          </m:e>
-          <m:sub>
-            <m:r>
-              <m:t>2</m:t>
-            </m:r>
-          </m:sub>
-        </m:sSub>
-        <m:r>
-          <m:rPr>
-            <m:sty m:val="p"/>
-          </m:rPr>
-          <m:t>∈</m:t>
-        </m:r>
-        <m:r>
-          <m:rPr>
-            <m:sty m:val="p"/>
-          </m:rPr>
-          <m:t>{</m:t>
-        </m:r>
-        <m:r>
-          <m:t>0</m:t>
-        </m:r>
-        <m:r>
-          <m:rPr>
-            <m:sty m:val="p"/>
-          </m:rPr>
-          <m:t>,</m:t>
-        </m:r>
-        <m:r>
-          <m:t>0.2411</m:t>
-        </m:r>
-        <m:r>
-          <m:rPr>
-            <m:sty m:val="p"/>
-          </m:rPr>
-          <m:t>,</m:t>
-        </m:r>
-        <m:r>
-          <m:t>0.4</m:t>
-        </m:r>
-        <m:r>
-          <m:rPr>
-            <m:sty m:val="p"/>
-          </m:rPr>
-          <m:t>}</m:t>
-        </m:r>
-      </m:oMath>
-      <w:r>
-        <w:t xml:space="preserve">,</w:t>
-      </w:r>
-      <w:r>
-        <w:t xml:space="preserve"> </w:t>
-      </w:r>
-      <m:oMath>
-        <m:r>
-          <m:t>ε</m:t>
-        </m:r>
-        <m:r>
-          <m:rPr>
-            <m:sty m:val="p"/>
-          </m:rPr>
-          <m:t>∈</m:t>
-        </m:r>
-        <m:r>
-          <m:rPr>
-            <m:sty m:val="p"/>
-          </m:rPr>
-          <m:t>{</m:t>
         </m:r>
         <m:sSup>
           <m:e>
@@ -9803,101 +10297,16 @@
               <m:t>−</m:t>
             </m:r>
             <m:r>
-              <m:t>1</m:t>
+              <m:t>2</m:t>
             </m:r>
           </m:sup>
         </m:sSup>
-        <m:r>
-          <m:rPr>
-            <m:sty m:val="p"/>
-          </m:rPr>
-          <m:t>,</m:t>
-        </m:r>
-        <m:sSup>
-          <m:e>
-            <m:r>
-              <m:t>10</m:t>
-            </m:r>
-          </m:e>
-          <m:sup>
-            <m:r>
-              <m:rPr>
-                <m:sty m:val="p"/>
-              </m:rPr>
-              <m:t>−</m:t>
-            </m:r>
-            <m:r>
-              <m:t>2</m:t>
-            </m:r>
-          </m:sup>
-        </m:sSup>
-        <m:r>
-          <m:rPr>
-            <m:sty m:val="p"/>
-          </m:rPr>
-          <m:t>}</m:t>
-        </m:r>
-      </m:oMath>
-      <w:r>
-        <w:t xml:space="preserve">, and the circuits are</w:t>
-      </w:r>
-      <w:r>
-        <w:t xml:space="preserve"> </w:t>
-      </w:r>
-      <w:r>
-        <w:rPr>
-          <w:iCs/>
-          <w:i/>
-        </w:rPr>
-        <w:t xml:space="preserve">counted, not simulated</w:t>
-      </w:r>
-      <w:r>
-        <w:t xml:space="preserve"> </w:t>
-      </w:r>
-      <w:r>
-        <w:t xml:space="preserve">(per-step transpile times</w:t>
-      </w:r>
-      <w:r>
-        <w:t xml:space="preserve"> </w:t>
-      </w:r>
-      <m:oMath>
-        <m:r>
-          <m:t>n</m:t>
-        </m:r>
-      </m:oMath>
-      <w:r>
-        <w:t xml:space="preserve">, validated against a full transpile at</w:t>
-      </w:r>
-      <w:r>
-        <w:t xml:space="preserve"> </w:t>
-      </w:r>
-      <m:oMath>
-        <m:r>
-          <m:t>n</m:t>
-        </m:r>
-        <m:r>
-          <m:rPr>
-            <m:sty m:val="p"/>
-          </m:rPr>
-          <m:t>=</m:t>
-        </m:r>
-        <m:r>
-          <m:t>48</m:t>
-        </m:r>
-      </m:oMath>
-      <w:r>
-        <w:t xml:space="preserve">). Trotter terms are the individual Pauli rotations (</w:t>
-      </w:r>
-      <m:oMath>
-        <m:r>
-          <m:t>α</m:t>
-        </m:r>
-      </m:oMath>
-      <w:r>
-        <w:t xml:space="preserve"> </w:t>
-      </w:r>
-      <w:r>
-        <w:t xml:space="preserve">at Pauli level), so its step counts are not directly comparable with the bond-gate counts of Sections 4–7.3.</w:t>
+      </m:oMath>
+      <w:r>
+        <w:t xml:space="preserve"> </w:t>
+      </w:r>
+      <w:r>
+        <w:t xml:space="preserve">certified circuits are not simulated, and their step counts and CX are reported from the certificate.</w:t>
       </w:r>
     </w:p>
     <w:p>
@@ -9913,6 +10322,324 @@
           <w:bCs/>
           <w:b/>
         </w:rPr>
+        <w:t xml:space="preserve">Larger chains (</w:t>
+      </w:r>
+      <m:oMath>
+        <m:r>
+          <m:t>N</m:t>
+        </m:r>
+        <m:r>
+          <m:rPr>
+            <m:sty m:val="p"/>
+          </m:rPr>
+          <m:t>≤</m:t>
+        </m:r>
+        <m:r>
+          <m:t>32</m:t>
+        </m:r>
+      </m:oMath>
+      <w:r>
+        <w:rPr>
+          <w:bCs/>
+          <w:b/>
+        </w:rPr>
+        <w:t xml:space="preserve">, Section 7.4).</w:t>
+      </w:r>
+      <w:r>
+        <w:t xml:space="preserve"> </w:t>
+      </w:r>
+      <w:r>
+        <w:t xml:space="preserve">The pipeline in</w:t>
+      </w:r>
+      <w:r>
+        <w:t xml:space="preserve"> </w:t>
+      </w:r>
+      <w:r>
+        <w:rPr>
+          <w:rStyle w:val="VerbatimChar"/>
+        </w:rPr>
+        <w:t xml:space="preserve">j1j2_filter/</w:t>
+      </w:r>
+      <w:r>
+        <w:t xml:space="preserve"> </w:t>
+      </w:r>
+      <w:r>
+        <w:t xml:space="preserve">runs DMRG and the circuits without any statevector or dense operator above</w:t>
+      </w:r>
+      <w:r>
+        <w:t xml:space="preserve"> </w:t>
+      </w:r>
+      <m:oMath>
+        <m:r>
+          <m:t>N</m:t>
+        </m:r>
+        <m:r>
+          <m:rPr>
+            <m:sty m:val="p"/>
+          </m:rPr>
+          <m:t>=</m:t>
+        </m:r>
+        <m:r>
+          <m:t>14</m:t>
+        </m:r>
+      </m:oMath>
+      <w:r>
+        <w:t xml:space="preserve">:</w:t>
+      </w:r>
+      <w:r>
+        <w:t xml:space="preserve"> </w:t>
+      </w:r>
+      <m:oMath>
+        <m:r>
+          <m:t>γ</m:t>
+        </m:r>
+      </m:oMath>
+      <w:r>
+        <w:t xml:space="preserve"> </w:t>
+      </w:r>
+      <w:r>
+        <w:t xml:space="preserve">is the overlap of the DMRG MPS with the trial circuit simulated as an MPS (Aer), the trial state is an</w:t>
+      </w:r>
+      <w:r>
+        <w:t xml:space="preserve"> </w:t>
+      </w:r>
+      <m:oMath>
+        <m:r>
+          <m:t>L</m:t>
+        </m:r>
+        <m:r>
+          <m:rPr>
+            <m:sty m:val="p"/>
+          </m:rPr>
+          <m:t>=</m:t>
+        </m:r>
+        <m:r>
+          <m:t>1</m:t>
+        </m:r>
+      </m:oMath>
+      <w:r>
+        <w:t xml:space="preserve"> </w:t>
+      </w:r>
+      <w:r>
+        <w:t xml:space="preserve">brickwork</w:t>
+      </w:r>
+      <w:r>
+        <w:t xml:space="preserve"> </w:t>
+      </w:r>
+      <w:r>
+        <w:rPr>
+          <w:rStyle w:val="VerbatimChar"/>
+        </w:rPr>
+        <w:t xml:space="preserve">mps-to-circuit</w:t>
+      </w:r>
+      <w:r>
+        <w:t xml:space="preserve"> </w:t>
+      </w:r>
+      <w:r>
+        <w:t xml:space="preserve">compilation,</w:t>
+      </w:r>
+      <w:r>
+        <w:t xml:space="preserve"> </w:t>
+      </w:r>
+      <m:oMath>
+        <m:sSub>
+          <m:e>
+            <m:r>
+              <m:t>J</m:t>
+            </m:r>
+          </m:e>
+          <m:sub>
+            <m:r>
+              <m:t>2</m:t>
+            </m:r>
+          </m:sub>
+        </m:sSub>
+        <m:r>
+          <m:rPr>
+            <m:sty m:val="p"/>
+          </m:rPr>
+          <m:t>∈</m:t>
+        </m:r>
+        <m:r>
+          <m:rPr>
+            <m:sty m:val="p"/>
+          </m:rPr>
+          <m:t>{</m:t>
+        </m:r>
+        <m:r>
+          <m:t>0</m:t>
+        </m:r>
+        <m:r>
+          <m:rPr>
+            <m:sty m:val="p"/>
+          </m:rPr>
+          <m:t>,</m:t>
+        </m:r>
+        <m:r>
+          <m:t>0.2411</m:t>
+        </m:r>
+        <m:r>
+          <m:rPr>
+            <m:sty m:val="p"/>
+          </m:rPr>
+          <m:t>,</m:t>
+        </m:r>
+        <m:r>
+          <m:t>0.4</m:t>
+        </m:r>
+        <m:r>
+          <m:rPr>
+            <m:sty m:val="p"/>
+          </m:rPr>
+          <m:t>}</m:t>
+        </m:r>
+      </m:oMath>
+      <w:r>
+        <w:t xml:space="preserve">,</w:t>
+      </w:r>
+      <w:r>
+        <w:t xml:space="preserve"> </w:t>
+      </w:r>
+      <m:oMath>
+        <m:r>
+          <m:t>ε</m:t>
+        </m:r>
+        <m:r>
+          <m:rPr>
+            <m:sty m:val="p"/>
+          </m:rPr>
+          <m:t>∈</m:t>
+        </m:r>
+        <m:r>
+          <m:rPr>
+            <m:sty m:val="p"/>
+          </m:rPr>
+          <m:t>{</m:t>
+        </m:r>
+        <m:sSup>
+          <m:e>
+            <m:r>
+              <m:t>10</m:t>
+            </m:r>
+          </m:e>
+          <m:sup>
+            <m:r>
+              <m:rPr>
+                <m:sty m:val="p"/>
+              </m:rPr>
+              <m:t>−</m:t>
+            </m:r>
+            <m:r>
+              <m:t>1</m:t>
+            </m:r>
+          </m:sup>
+        </m:sSup>
+        <m:r>
+          <m:rPr>
+            <m:sty m:val="p"/>
+          </m:rPr>
+          <m:t>,</m:t>
+        </m:r>
+        <m:sSup>
+          <m:e>
+            <m:r>
+              <m:t>10</m:t>
+            </m:r>
+          </m:e>
+          <m:sup>
+            <m:r>
+              <m:rPr>
+                <m:sty m:val="p"/>
+              </m:rPr>
+              <m:t>−</m:t>
+            </m:r>
+            <m:r>
+              <m:t>2</m:t>
+            </m:r>
+          </m:sup>
+        </m:sSup>
+        <m:r>
+          <m:rPr>
+            <m:sty m:val="p"/>
+          </m:rPr>
+          <m:t>}</m:t>
+        </m:r>
+      </m:oMath>
+      <w:r>
+        <w:t xml:space="preserve">, and the circuits are</w:t>
+      </w:r>
+      <w:r>
+        <w:t xml:space="preserve"> </w:t>
+      </w:r>
+      <w:r>
+        <w:rPr>
+          <w:iCs/>
+          <w:i/>
+        </w:rPr>
+        <w:t xml:space="preserve">counted, not simulated</w:t>
+      </w:r>
+      <w:r>
+        <w:t xml:space="preserve"> </w:t>
+      </w:r>
+      <w:r>
+        <w:t xml:space="preserve">(per-step transpile times</w:t>
+      </w:r>
+      <w:r>
+        <w:t xml:space="preserve"> </w:t>
+      </w:r>
+      <m:oMath>
+        <m:r>
+          <m:t>n</m:t>
+        </m:r>
+      </m:oMath>
+      <w:r>
+        <w:t xml:space="preserve">, validated against a full transpile at</w:t>
+      </w:r>
+      <w:r>
+        <w:t xml:space="preserve"> </w:t>
+      </w:r>
+      <m:oMath>
+        <m:r>
+          <m:t>n</m:t>
+        </m:r>
+        <m:r>
+          <m:rPr>
+            <m:sty m:val="p"/>
+          </m:rPr>
+          <m:t>=</m:t>
+        </m:r>
+        <m:r>
+          <m:t>48</m:t>
+        </m:r>
+      </m:oMath>
+      <w:r>
+        <w:t xml:space="preserve">). Trotter terms are the individual Pauli rotations (</w:t>
+      </w:r>
+      <m:oMath>
+        <m:r>
+          <m:t>α</m:t>
+        </m:r>
+      </m:oMath>
+      <w:r>
+        <w:t xml:space="preserve"> </w:t>
+      </w:r>
+      <w:r>
+        <w:t xml:space="preserve">at Pauli level), so its step counts are not directly comparable with the bond-gate counts of Sections 4–7.3.</w:t>
+      </w:r>
+    </w:p>
+    <w:p>
+      <w:pPr>
+        <w:numPr>
+          <w:ilvl w:val="0"/>
+          <w:numId w:val="1002"/>
+        </w:numPr>
+        <w:pStyle w:val="Compact"/>
+      </w:pPr>
+      <w:r>
+        <w:rPr>
+          <w:bCs/>
+          <w:b/>
+        </w:rPr>
         <w:t xml:space="preserve">Cost.</w:t>
       </w:r>
       <w:r>
@@ -10068,7 +10795,130 @@
         <w:t xml:space="preserve"> </w:t>
       </w:r>
       <w:r>
-        <w:t xml:space="preserve">CX per step. The fault-tolerant metric reported for the larger chains is the number of</w:t>
+        <w:t xml:space="preserve">CX per step. The CX counts of this paper are for qiskit’s level-3 compilation, which re-synthesises two-qubit blocks (21 CX per step at</w:t>
+      </w:r>
+      <w:r>
+        <w:t xml:space="preserve"> </w:t>
+      </w:r>
+      <m:oMath>
+        <m:r>
+          <m:t>N</m:t>
+        </m:r>
+        <m:r>
+          <m:rPr>
+            <m:sty m:val="p"/>
+          </m:rPr>
+          <m:t>=</m:t>
+        </m:r>
+        <m:r>
+          <m:t>4</m:t>
+        </m:r>
+      </m:oMath>
+      <w:r>
+        <w:t xml:space="preserve">,</w:t>
+      </w:r>
+      <w:r>
+        <w:t xml:space="preserve"> </w:t>
+      </w:r>
+      <m:oMath>
+        <m:sSub>
+          <m:e>
+            <m:r>
+              <m:t>J</m:t>
+            </m:r>
+          </m:e>
+          <m:sub>
+            <m:r>
+              <m:t>2</m:t>
+            </m:r>
+          </m:sub>
+        </m:sSub>
+        <m:r>
+          <m:rPr>
+            <m:sty m:val="p"/>
+          </m:rPr>
+          <m:t>=</m:t>
+        </m:r>
+        <m:r>
+          <m:t>0</m:t>
+        </m:r>
+      </m:oMath>
+      <w:r>
+        <w:t xml:space="preserve">); direct compilation of the same circuit (one CX ladder per Pauli rotation, level 1) uses</w:t>
+      </w:r>
+      <w:r>
+        <w:t xml:space="preserve"> </w:t>
+      </w:r>
+      <m:oMath>
+        <m:r>
+          <m:t>12</m:t>
+        </m:r>
+      </m:oMath>
+      <w:r>
+        <w:t xml:space="preserve"> </w:t>
+      </w:r>
+      <w:r>
+        <w:t xml:space="preserve">CX per bond, about</w:t>
+      </w:r>
+      <w:r>
+        <w:t xml:space="preserve"> </w:t>
+      </w:r>
+      <m:oMath>
+        <m:r>
+          <m:t>1.7</m:t>
+        </m:r>
+        <m:r>
+          <m:rPr>
+            <m:sty m:val="p"/>
+          </m:rPr>
+          <m:t>×</m:t>
+        </m:r>
+      </m:oMath>
+      <w:r>
+        <w:t xml:space="preserve"> </w:t>
+      </w:r>
+      <w:r>
+        <w:t xml:space="preserve">more, but about</w:t>
+      </w:r>
+      <w:r>
+        <w:t xml:space="preserve"> </w:t>
+      </w:r>
+      <m:oMath>
+        <m:r>
+          <m:t>3</m:t>
+        </m:r>
+        <m:r>
+          <m:rPr>
+            <m:sty m:val="p"/>
+          </m:rPr>
+          <m:t>×</m:t>
+        </m:r>
+      </m:oMath>
+      <w:r>
+        <w:t xml:space="preserve"> </w:t>
+      </w:r>
+      <w:r>
+        <w:t xml:space="preserve">fewer non-Clifford</w:t>
+      </w:r>
+      <w:r>
+        <w:t xml:space="preserve"> </w:t>
+      </w:r>
+      <m:oMath>
+        <m:sSub>
+          <m:e>
+            <m:r>
+              <m:t>R</m:t>
+            </m:r>
+          </m:e>
+          <m:sub>
+            <m:r>
+              <m:t>z</m:t>
+            </m:r>
+          </m:sub>
+        </m:sSub>
+      </m:oMath>
+      <w:r>
+        <w:t xml:space="preserve">. The fault-tolerant metric reported for the larger chains is the number of</w:t>
       </w:r>
       <w:r>
         <w:t xml:space="preserve"> </w:t>
@@ -10121,7 +10971,7 @@
         </m:r>
       </m:oMath>
       <w:r>
-        <w:t xml:space="preserve">); no</w:t>
+        <w:t xml:space="preserve">) of the direct compilation; no</w:t>
       </w:r>
       <w:r>
         <w:t xml:space="preserve"> </w:t>
@@ -34038,17 +34888,18 @@
         <w:jc w:val="start"/>
       </w:tblPr>
       <w:tblGrid>
-        <w:gridCol w:w="719"/>
-        <w:gridCol w:w="719"/>
-        <w:gridCol w:w="719"/>
-        <w:gridCol w:w="719"/>
-        <w:gridCol w:w="719"/>
-        <w:gridCol w:w="719"/>
-        <w:gridCol w:w="719"/>
-        <w:gridCol w:w="719"/>
-        <w:gridCol w:w="719"/>
-        <w:gridCol w:w="719"/>
-        <w:gridCol w:w="719"/>
+        <w:gridCol w:w="660"/>
+        <w:gridCol w:w="660"/>
+        <w:gridCol w:w="660"/>
+        <w:gridCol w:w="660"/>
+        <w:gridCol w:w="660"/>
+        <w:gridCol w:w="660"/>
+        <w:gridCol w:w="660"/>
+        <w:gridCol w:w="660"/>
+        <w:gridCol w:w="660"/>
+        <w:gridCol w:w="660"/>
+        <w:gridCol w:w="660"/>
+        <w:gridCol w:w="660"/>
       </w:tblGrid>
       <w:tr>
         <w:trPr>
@@ -34193,19 +35044,31 @@
               <w:jc w:val="left"/>
             </w:pPr>
             <w:r>
-              <w:t xml:space="preserve">CX total</w:t>
-            </w:r>
-          </w:p>
-        </w:tc>
-        <w:tc>
-          <w:tcPr/>
-          <w:p>
-            <w:pPr>
-              <w:pStyle w:val="Compact"/>
-              <w:jc w:val="left"/>
-            </w:pPr>
-            <w:r>
-              <w:t xml:space="preserve">non-Clifford Rz</w:t>
+              <w:t xml:space="preserve">CX total (level 3)</w:t>
+            </w:r>
+          </w:p>
+        </w:tc>
+        <w:tc>
+          <w:tcPr/>
+          <w:p>
+            <w:pPr>
+              <w:pStyle w:val="Compact"/>
+              <w:jc w:val="left"/>
+            </w:pPr>
+            <w:r>
+              <w:t xml:space="preserve">CX (direct)</w:t>
+            </w:r>
+          </w:p>
+        </w:tc>
+        <w:tc>
+          <w:tcPr/>
+          <w:p>
+            <w:pPr>
+              <w:pStyle w:val="Compact"/>
+              <w:jc w:val="left"/>
+            </w:pPr>
+            <w:r>
+              <w:t xml:space="preserve">non-Clifford Rz (direct)</w:t>
             </w:r>
           </w:p>
         </w:tc>
@@ -34377,7 +35240,19 @@
               <w:jc w:val="left"/>
             </w:pPr>
             <w:r>
-              <w:t xml:space="preserve">2.02e+06</w:t>
+              <w:t xml:space="preserve">2.65e+06</w:t>
+            </w:r>
+          </w:p>
+        </w:tc>
+        <w:tc>
+          <w:tcPr/>
+          <w:p>
+            <w:pPr>
+              <w:pStyle w:val="Compact"/>
+              <w:jc w:val="left"/>
+            </w:pPr>
+            <w:r>
+              <w:t xml:space="preserve">6.79e+05</w:t>
             </w:r>
           </w:p>
         </w:tc>
@@ -34511,7 +35386,19 @@
               <w:jc w:val="left"/>
             </w:pPr>
             <w:r>
-              <w:t xml:space="preserve">3.64e+06</w:t>
+              <w:t xml:space="preserve">4.78e+06</w:t>
+            </w:r>
+          </w:p>
+        </w:tc>
+        <w:tc>
+          <w:tcPr/>
+          <w:p>
+            <w:pPr>
+              <w:pStyle w:val="Compact"/>
+              <w:jc w:val="left"/>
+            </w:pPr>
+            <w:r>
+              <w:t xml:space="preserve">1.22e+06</w:t>
             </w:r>
           </w:p>
         </w:tc>
@@ -34645,7 +35532,19 @@
               <w:jc w:val="left"/>
             </w:pPr>
             <w:r>
-              <w:t xml:space="preserve">6.54e+06</w:t>
+              <w:t xml:space="preserve">8.61e+06</w:t>
+            </w:r>
+          </w:p>
+        </w:tc>
+        <w:tc>
+          <w:tcPr/>
+          <w:p>
+            <w:pPr>
+              <w:pStyle w:val="Compact"/>
+              <w:jc w:val="left"/>
+            </w:pPr>
+            <w:r>
+              <w:t xml:space="preserve">2.19e+06</w:t>
             </w:r>
           </w:p>
         </w:tc>
@@ -34779,7 +35678,19 @@
               <w:jc w:val="left"/>
             </w:pPr>
             <w:r>
-              <w:t xml:space="preserve">1.05e+07</w:t>
+              <w:t xml:space="preserve">1.38e+07</w:t>
+            </w:r>
+          </w:p>
+        </w:tc>
+        <w:tc>
+          <w:tcPr/>
+          <w:p>
+            <w:pPr>
+              <w:pStyle w:val="Compact"/>
+              <w:jc w:val="left"/>
+            </w:pPr>
+            <w:r>
+              <w:t xml:space="preserve">3.50e+06</w:t>
             </w:r>
           </w:p>
         </w:tc>
@@ -34913,7 +35824,19 @@
               <w:jc w:val="left"/>
             </w:pPr>
             <w:r>
-              <w:t xml:space="preserve">3.52e+07</w:t>
+              <w:t xml:space="preserve">4.64e+07</w:t>
+            </w:r>
+          </w:p>
+        </w:tc>
+        <w:tc>
+          <w:tcPr/>
+          <w:p>
+            <w:pPr>
+              <w:pStyle w:val="Compact"/>
+              <w:jc w:val="left"/>
+            </w:pPr>
+            <w:r>
+              <w:t xml:space="preserve">1.18e+07</w:t>
             </w:r>
           </w:p>
         </w:tc>
@@ -35063,6 +35986,18 @@
             </w:r>
           </w:p>
         </w:tc>
+        <w:tc>
+          <w:tcPr/>
+          <w:p>
+            <w:pPr>
+              <w:pStyle w:val="Compact"/>
+              <w:jc w:val="left"/>
+            </w:pPr>
+            <w:r>
+              <w:t xml:space="preserve">–</w:t>
+            </w:r>
+          </w:p>
+        </w:tc>
       </w:tr>
       <w:tr>
         <w:tc>
@@ -35197,6 +36132,18 @@
             </w:r>
           </w:p>
         </w:tc>
+        <w:tc>
+          <w:tcPr/>
+          <w:p>
+            <w:pPr>
+              <w:pStyle w:val="Compact"/>
+              <w:jc w:val="left"/>
+            </w:pPr>
+            <w:r>
+              <w:t xml:space="preserve">–</w:t>
+            </w:r>
+          </w:p>
+        </w:tc>
       </w:tr>
       <w:tr>
         <w:tc>
@@ -35315,7 +36262,19 @@
               <w:jc w:val="left"/>
             </w:pPr>
             <w:r>
-              <w:t xml:space="preserve">5.20e+06</w:t>
+              <w:t xml:space="preserve">6.87e+06</w:t>
+            </w:r>
+          </w:p>
+        </w:tc>
+        <w:tc>
+          <w:tcPr/>
+          <w:p>
+            <w:pPr>
+              <w:pStyle w:val="Compact"/>
+              <w:jc w:val="left"/>
+            </w:pPr>
+            <w:r>
+              <w:t xml:space="preserve">1.74e+06</w:t>
             </w:r>
           </w:p>
         </w:tc>
@@ -35449,7 +36408,19 @@
               <w:jc w:val="left"/>
             </w:pPr>
             <w:r>
-              <w:t xml:space="preserve">9.89e+06</w:t>
+              <w:t xml:space="preserve">1.31e+07</w:t>
+            </w:r>
+          </w:p>
+        </w:tc>
+        <w:tc>
+          <w:tcPr/>
+          <w:p>
+            <w:pPr>
+              <w:pStyle w:val="Compact"/>
+              <w:jc w:val="left"/>
+            </w:pPr>
+            <w:r>
+              <w:t xml:space="preserve">3.31e+06</w:t>
             </w:r>
           </w:p>
         </w:tc>
@@ -35583,7 +36554,19 @@
               <w:jc w:val="left"/>
             </w:pPr>
             <w:r>
-              <w:t xml:space="preserve">1.69e+07</w:t>
+              <w:t xml:space="preserve">2.24e+07</w:t>
+            </w:r>
+          </w:p>
+        </w:tc>
+        <w:tc>
+          <w:tcPr/>
+          <w:p>
+            <w:pPr>
+              <w:pStyle w:val="Compact"/>
+              <w:jc w:val="left"/>
+            </w:pPr>
+            <w:r>
+              <w:t xml:space="preserve">5.65e+06</w:t>
             </w:r>
           </w:p>
         </w:tc>
@@ -35717,7 +36700,19 @@
               <w:jc w:val="left"/>
             </w:pPr>
             <w:r>
-              <w:t xml:space="preserve">2.98e+07</w:t>
+              <w:t xml:space="preserve">3.95e+07</w:t>
+            </w:r>
+          </w:p>
+        </w:tc>
+        <w:tc>
+          <w:tcPr/>
+          <w:p>
+            <w:pPr>
+              <w:pStyle w:val="Compact"/>
+              <w:jc w:val="left"/>
+            </w:pPr>
+            <w:r>
+              <w:t xml:space="preserve">9.97e+06</w:t>
             </w:r>
           </w:p>
         </w:tc>
@@ -35851,7 +36846,19 @@
               <w:jc w:val="left"/>
             </w:pPr>
             <w:r>
-              <w:t xml:space="preserve">7.12e+07</w:t>
+              <w:t xml:space="preserve">9.45e+07</w:t>
+            </w:r>
+          </w:p>
+        </w:tc>
+        <w:tc>
+          <w:tcPr/>
+          <w:p>
+            <w:pPr>
+              <w:pStyle w:val="Compact"/>
+              <w:jc w:val="left"/>
+            </w:pPr>
+            <w:r>
+              <w:t xml:space="preserve">2.38e+07</w:t>
             </w:r>
           </w:p>
         </w:tc>
@@ -36001,6 +37008,18 @@
             </w:r>
           </w:p>
         </w:tc>
+        <w:tc>
+          <w:tcPr/>
+          <w:p>
+            <w:pPr>
+              <w:pStyle w:val="Compact"/>
+              <w:jc w:val="left"/>
+            </w:pPr>
+            <w:r>
+              <w:t xml:space="preserve">–</w:t>
+            </w:r>
+          </w:p>
+        </w:tc>
       </w:tr>
       <w:tr>
         <w:tc>
@@ -36135,6 +37154,18 @@
             </w:r>
           </w:p>
         </w:tc>
+        <w:tc>
+          <w:tcPr/>
+          <w:p>
+            <w:pPr>
+              <w:pStyle w:val="Compact"/>
+              <w:jc w:val="left"/>
+            </w:pPr>
+            <w:r>
+              <w:t xml:space="preserve">–</w:t>
+            </w:r>
+          </w:p>
+        </w:tc>
       </w:tr>
       <w:tr>
         <w:tc>
@@ -36253,7 +37284,19 @@
               <w:jc w:val="left"/>
             </w:pPr>
             <w:r>
-              <w:t xml:space="preserve">2.40e+06</w:t>
+              <w:t xml:space="preserve">3.17e+06</w:t>
+            </w:r>
+          </w:p>
+        </w:tc>
+        <w:tc>
+          <w:tcPr/>
+          <w:p>
+            <w:pPr>
+              <w:pStyle w:val="Compact"/>
+              <w:jc w:val="left"/>
+            </w:pPr>
+            <w:r>
+              <w:t xml:space="preserve">8.03e+05</w:t>
             </w:r>
           </w:p>
         </w:tc>
@@ -36387,7 +37430,19 @@
               <w:jc w:val="left"/>
             </w:pPr>
             <w:r>
-              <w:t xml:space="preserve">4.56e+06</w:t>
+              <w:t xml:space="preserve">6.03e+06</w:t>
+            </w:r>
+          </w:p>
+        </w:tc>
+        <w:tc>
+          <w:tcPr/>
+          <w:p>
+            <w:pPr>
+              <w:pStyle w:val="Compact"/>
+              <w:jc w:val="left"/>
+            </w:pPr>
+            <w:r>
+              <w:t xml:space="preserve">1.53e+06</w:t>
             </w:r>
           </w:p>
         </w:tc>
@@ -36521,7 +37576,19 @@
               <w:jc w:val="left"/>
             </w:pPr>
             <w:r>
-              <w:t xml:space="preserve">8.47e+06</w:t>
+              <w:t xml:space="preserve">1.12e+07</w:t>
+            </w:r>
+          </w:p>
+        </w:tc>
+        <w:tc>
+          <w:tcPr/>
+          <w:p>
+            <w:pPr>
+              <w:pStyle w:val="Compact"/>
+              <w:jc w:val="left"/>
+            </w:pPr>
+            <w:r>
+              <w:t xml:space="preserve">2.83e+06</w:t>
             </w:r>
           </w:p>
         </w:tc>
@@ -36655,7 +37722,19 @@
               <w:jc w:val="left"/>
             </w:pPr>
             <w:r>
-              <w:t xml:space="preserve">1.41e+07</w:t>
+              <w:t xml:space="preserve">1.87e+07</w:t>
+            </w:r>
+          </w:p>
+        </w:tc>
+        <w:tc>
+          <w:tcPr/>
+          <w:p>
+            <w:pPr>
+              <w:pStyle w:val="Compact"/>
+              <w:jc w:val="left"/>
+            </w:pPr>
+            <w:r>
+              <w:t xml:space="preserve">4.73e+06</w:t>
             </w:r>
           </w:p>
         </w:tc>
@@ -36789,7 +37868,19 @@
               <w:jc w:val="left"/>
             </w:pPr>
             <w:r>
-              <w:t xml:space="preserve">2.97e+07</w:t>
+              <w:t xml:space="preserve">3.95e+07</w:t>
+            </w:r>
+          </w:p>
+        </w:tc>
+        <w:tc>
+          <w:tcPr/>
+          <w:p>
+            <w:pPr>
+              <w:pStyle w:val="Compact"/>
+              <w:jc w:val="left"/>
+            </w:pPr>
+            <w:r>
+              <w:t xml:space="preserve">9.94e+06</w:t>
             </w:r>
           </w:p>
         </w:tc>
@@ -36923,7 +38014,19 @@
               <w:jc w:val="left"/>
             </w:pPr>
             <w:r>
-              <w:t xml:space="preserve">5.55e+07</w:t>
+              <w:t xml:space="preserve">7.37e+07</w:t>
+            </w:r>
+          </w:p>
+        </w:tc>
+        <w:tc>
+          <w:tcPr/>
+          <w:p>
+            <w:pPr>
+              <w:pStyle w:val="Compact"/>
+              <w:jc w:val="left"/>
+            </w:pPr>
+            <w:r>
+              <w:t xml:space="preserve">1.85e+07</w:t>
             </w:r>
           </w:p>
         </w:tc>
@@ -37057,7 +38160,19 @@
               <w:jc w:val="left"/>
             </w:pPr>
             <w:r>
-              <w:t xml:space="preserve">1.24e+08</w:t>
+              <w:t xml:space="preserve">1.64e+08</w:t>
+            </w:r>
+          </w:p>
+        </w:tc>
+        <w:tc>
+          <w:tcPr/>
+          <w:p>
+            <w:pPr>
+              <w:pStyle w:val="Compact"/>
+              <w:jc w:val="left"/>
+            </w:pPr>
+            <w:r>
+              <w:t xml:space="preserve">4.13e+07</w:t>
             </w:r>
           </w:p>
         </w:tc>
@@ -37317,14 +38432,11 @@
         <w:t xml:space="preserve"> </w:t>
       </w:r>
       <w:r>
-        <w:t xml:space="preserve">CX and</w:t>
-      </w:r>
-      <w:r>
-        <w:t xml:space="preserve"> </w:t>
-      </w:r>
-      <m:oMath>
-        <m:r>
-          <m:t>3.6</m:t>
+        <w:t xml:space="preserve">CX with block re-synthesis (</w:t>
+      </w:r>
+      <m:oMath>
+        <m:r>
+          <m:t>4.8</m:t>
         </m:r>
         <m:r>
           <m:rPr>
@@ -37350,7 +38462,7 @@
       </w:r>
       <m:oMath>
         <m:r>
-          <m:t>1.2</m:t>
+          <m:t>1.6</m:t>
         </m:r>
         <m:r>
           <m:rPr>
@@ -37375,6 +38487,64 @@
         <w:t xml:space="preserve"> </w:t>
       </w:r>
       <w:r>
+        <w:t xml:space="preserve">with direct compilation) and</w:t>
+      </w:r>
+      <w:r>
+        <w:t xml:space="preserve"> </w:t>
+      </w:r>
+      <m:oMath>
+        <m:r>
+          <m:t>1.2</m:t>
+        </m:r>
+        <m:r>
+          <m:rPr>
+            <m:sty m:val="p"/>
+          </m:rPr>
+          <m:t>×</m:t>
+        </m:r>
+        <m:sSup>
+          <m:e>
+            <m:r>
+              <m:t>10</m:t>
+            </m:r>
+          </m:e>
+          <m:sup>
+            <m:r>
+              <m:t>6</m:t>
+            </m:r>
+          </m:sup>
+        </m:sSup>
+      </m:oMath>
+      <w:r>
+        <w:t xml:space="preserve">–</w:t>
+      </w:r>
+      <m:oMath>
+        <m:r>
+          <m:t>4.1</m:t>
+        </m:r>
+        <m:r>
+          <m:rPr>
+            <m:sty m:val="p"/>
+          </m:rPr>
+          <m:t>×</m:t>
+        </m:r>
+        <m:sSup>
+          <m:e>
+            <m:r>
+              <m:t>10</m:t>
+            </m:r>
+          </m:e>
+          <m:sup>
+            <m:r>
+              <m:t>7</m:t>
+            </m:r>
+          </m:sup>
+        </m:sSup>
+      </m:oMath>
+      <w:r>
+        <w:t xml:space="preserve"> </w:t>
+      </w:r>
+      <w:r>
         <w:t xml:space="preserve">non-Clifford</w:t>
       </w:r>
       <w:r>
@@ -37395,7 +38565,30 @@
         </m:sSub>
       </m:oMath>
       <w:r>
-        <w:t xml:space="preserve">, with a physical evolution time of 7.9–20.5 (units of</w:t>
+        <w:t xml:space="preserve"> </w:t>
+      </w:r>
+      <w:r>
+        <w:t xml:space="preserve">(direct compilation; about</w:t>
+      </w:r>
+      <w:r>
+        <w:t xml:space="preserve"> </w:t>
+      </w:r>
+      <m:oMath>
+        <m:r>
+          <m:t>3</m:t>
+        </m:r>
+        <m:r>
+          <m:rPr>
+            <m:sty m:val="p"/>
+          </m:rPr>
+          <m:t>×</m:t>
+        </m:r>
+      </m:oMath>
+      <w:r>
+        <w:t xml:space="preserve"> </w:t>
+      </w:r>
+      <w:r>
+        <w:t xml:space="preserve">more with re-synthesis), with a physical evolution time of 7.9–20.5 (units of</w:t>
       </w:r>
       <w:r>
         <w:t xml:space="preserve"> </w:t>
@@ -38950,7 +40143,7 @@
         </m:r>
       </m:oMath>
       <w:r>
-        <w:t xml:space="preserve">. The ground state is a nondegenerate singlet; the theorem is stated for a ground space, but a degenerate target is not tested.</w:t>
+        <w:t xml:space="preserve">. The ground state is nondegenerate in every case computed; the theorem is stated for a ground space, but a degenerate target is not tested.</w:t>
       </w:r>
     </w:p>
     <w:p>

</xml_diff>

<commit_message>
Verify first excitation is a triplet by ED (N=8-16, J2 in [0,1]); resolve bibliography notes
Co-Authored-By: Claude Sonnet 5.5 <noreply@anthropic.com>
Claude-Session: https://claude.ai/code/session_01MwP9ak6eXBRPY8cKeU4Bsg
</commit_message>
<xml_diff>
--- a/simple_paper/paper.docx
+++ b/simple_paper/paper.docx
@@ -327,7 +327,75 @@
         </m:r>
       </m:oMath>
       <w:r>
-        <w:t xml:space="preserve">); the excited state is the lowest state of any symmetry (its symmetry is not assumed; it was a triplet in every exact case checked), and the bandwidth is certified by Weyl’s inequality without a DMRG value for the top of the spectrum. The paper is organised around three questions.</w:t>
+        <w:t xml:space="preserve">); the excited state is the lowest state of any symmetry (its symmetry is not assumed; it was a triplet in every exact case checked,</w:t>
+      </w:r>
+      <w:r>
+        <w:t xml:space="preserve"> </w:t>
+      </w:r>
+      <m:oMath>
+        <m:r>
+          <m:t>N</m:t>
+        </m:r>
+        <m:r>
+          <m:rPr>
+            <m:sty m:val="p"/>
+          </m:rPr>
+          <m:t>≤</m:t>
+        </m:r>
+        <m:r>
+          <m:t>16</m:t>
+        </m:r>
+      </m:oMath>
+      <w:r>
+        <w:t xml:space="preserve">,</w:t>
+      </w:r>
+      <w:r>
+        <w:t xml:space="preserve"> </w:t>
+      </w:r>
+      <m:oMath>
+        <m:sSub>
+          <m:e>
+            <m:r>
+              <m:t>J</m:t>
+            </m:r>
+          </m:e>
+          <m:sub>
+            <m:r>
+              <m:t>2</m:t>
+            </m:r>
+          </m:sub>
+        </m:sSub>
+        <m:r>
+          <m:rPr>
+            <m:sty m:val="p"/>
+          </m:rPr>
+          <m:t>∈</m:t>
+        </m:r>
+        <m:d>
+          <m:dPr>
+            <m:begChr m:val="["/>
+            <m:endChr m:val="]"/>
+            <m:sepChr m:val=""/>
+            <m:grow/>
+          </m:dPr>
+          <m:e>
+            <m:r>
+              <m:t>0</m:t>
+            </m:r>
+            <m:r>
+              <m:rPr>
+                <m:sty m:val="p"/>
+              </m:rPr>
+              <m:t>,</m:t>
+            </m:r>
+            <m:r>
+              <m:t>1</m:t>
+            </m:r>
+          </m:e>
+        </m:d>
+      </m:oMath>
+      <w:r>
+        <w:t xml:space="preserve">), and the bandwidth is certified by Weyl’s inequality without a DMRG value for the top of the spectrum. The paper is organised around three questions.</w:t>
       </w:r>
       <w:r>
         <w:t xml:space="preserve"> </w:t>
@@ -1983,7 +2051,10 @@
         </m:sSub>
       </m:oMath>
       <w:r>
-        <w:t xml:space="preserve">, so the symmetry of the first excitation is not assumed. In every exact case checked (</w:t>
+        <w:t xml:space="preserve">, so the symmetry of the first excitation is not assumed. Exact diagonalisation (scripts/check_first_excitation.py) of open chains with</w:t>
+      </w:r>
+      <w:r>
+        <w:t xml:space="preserve"> </w:t>
       </w:r>
       <m:oMath>
         <m:r>
@@ -1998,27 +2069,20 @@
         <m:r>
           <m:t>8</m:t>
         </m:r>
-        <m:r>
-          <m:rPr>
-            <m:sty m:val="p"/>
-          </m:rPr>
-          <m:t>,</m:t>
-        </m:r>
-        <m:r>
-          <m:t>10</m:t>
-        </m:r>
-        <m:r>
-          <m:rPr>
-            <m:sty m:val="p"/>
-          </m:rPr>
-          <m:t>,</m:t>
-        </m:r>
-        <m:r>
-          <m:t>12</m:t>
-        </m:r>
-      </m:oMath>
-      <w:r>
-        <w:t xml:space="preserve">,</w:t>
+      </m:oMath>
+      <w:r>
+        <w:t xml:space="preserve">–</w:t>
+      </w:r>
+      <m:oMath>
+        <m:r>
+          <m:t>16</m:t>
+        </m:r>
+      </m:oMath>
+      <w:r>
+        <w:t xml:space="preserve"> </w:t>
+      </w:r>
+      <w:r>
+        <w:t xml:space="preserve">at 22 values of</w:t>
       </w:r>
       <w:r>
         <w:t xml:space="preserve"> </w:t>
@@ -2040,32 +2104,143 @@
           <m:rPr>
             <m:sty m:val="p"/>
           </m:rPr>
+          <m:t>∈</m:t>
+        </m:r>
+        <m:d>
+          <m:dPr>
+            <m:begChr m:val="["/>
+            <m:endChr m:val="]"/>
+            <m:sepChr m:val=""/>
+            <m:grow/>
+          </m:dPr>
+          <m:e>
+            <m:r>
+              <m:t>0</m:t>
+            </m:r>
+            <m:r>
+              <m:rPr>
+                <m:sty m:val="p"/>
+              </m:rPr>
+              <m:t>,</m:t>
+            </m:r>
+            <m:r>
+              <m:t>1</m:t>
+            </m:r>
+          </m:e>
+        </m:d>
+      </m:oMath>
+      <w:r>
+        <w:t xml:space="preserve"> </w:t>
+      </w:r>
+      <w:r>
+        <w:t xml:space="preserve">(step 0.05, plus 0.2411) finds a non-degenerate singlet ground state and a triplet first excitation in every case (lowest</w:t>
+      </w:r>
+      <w:r>
+        <w:t xml:space="preserve"> </w:t>
+      </w:r>
+      <m:oMath>
+        <m:sSup>
+          <m:e>
+            <m:r>
+              <m:t>S</m:t>
+            </m:r>
+          </m:e>
+          <m:sup>
+            <m:r>
+              <m:t>z</m:t>
+            </m:r>
+          </m:sup>
+        </m:sSup>
+        <m:r>
+          <m:rPr>
+            <m:sty m:val="p"/>
+          </m:rPr>
           <m:t>=</m:t>
         </m:r>
         <m:r>
+          <m:t>1</m:t>
+        </m:r>
+      </m:oMath>
+      <w:r>
+        <w:t xml:space="preserve"> </w:t>
+      </w:r>
+      <w:r>
+        <w:t xml:space="preserve">level equals the second</w:t>
+      </w:r>
+      <w:r>
+        <w:t xml:space="preserve"> </w:t>
+      </w:r>
+      <m:oMath>
+        <m:sSup>
+          <m:e>
+            <m:r>
+              <m:t>S</m:t>
+            </m:r>
+          </m:e>
+          <m:sup>
+            <m:r>
+              <m:t>z</m:t>
+            </m:r>
+          </m:sup>
+        </m:sSup>
+        <m:r>
+          <m:rPr>
+            <m:sty m:val="p"/>
+          </m:rPr>
+          <m:t>=</m:t>
+        </m:r>
+        <m:r>
           <m:t>0</m:t>
         </m:r>
-        <m:r>
-          <m:rPr>
-            <m:sty m:val="p"/>
-          </m:rPr>
-          <m:t>,</m:t>
-        </m:r>
-        <m:r>
-          <m:t>0.2411</m:t>
-        </m:r>
-        <m:r>
-          <m:rPr>
-            <m:sty m:val="p"/>
-          </m:rPr>
-          <m:t>,</m:t>
-        </m:r>
-        <m:r>
-          <m:t>0.4</m:t>
-        </m:r>
-      </m:oMath>
-      <w:r>
-        <w:t xml:space="preserve">, open chains) it is a triplet, but the critical point</w:t>
+      </m:oMath>
+      <w:r>
+        <w:t xml:space="preserve"> </w:t>
+      </w:r>
+      <w:r>
+        <w:t xml:space="preserve">level and lies below the lowest</w:t>
+      </w:r>
+      <w:r>
+        <w:t xml:space="preserve"> </w:t>
+      </w:r>
+      <m:oMath>
+        <m:sSup>
+          <m:e>
+            <m:r>
+              <m:t>S</m:t>
+            </m:r>
+          </m:e>
+          <m:sup>
+            <m:r>
+              <m:t>z</m:t>
+            </m:r>
+          </m:sup>
+        </m:sSup>
+        <m:r>
+          <m:rPr>
+            <m:sty m:val="p"/>
+          </m:rPr>
+          <m:t>=</m:t>
+        </m:r>
+        <m:r>
+          <m:t>2</m:t>
+        </m:r>
+      </m:oMath>
+      <w:r>
+        <w:t xml:space="preserve"> </w:t>
+      </w:r>
+      <w:r>
+        <w:t xml:space="preserve">level); this is a finite-size, finite-grid check, not a proof for larger</w:t>
+      </w:r>
+      <w:r>
+        <w:t xml:space="preserve"> </w:t>
+      </w:r>
+      <m:oMath>
+        <m:r>
+          <m:t>N</m:t>
+        </m:r>
+      </m:oMath>
+      <w:r>
+        <w:t xml:space="preserve">. The critical point</w:t>
       </w:r>
       <w:r>
         <w:t xml:space="preserve"> </w:t>
@@ -2102,7 +2277,23 @@
         <w:t xml:space="preserve"> </w:t>
       </w:r>
       <w:r>
-        <w:t xml:space="preserve">[12,13] is itself located by a singlet–triplet level crossing in periodic chains, so the lowest excitation need not stay a triplet elsewhere in the phase diagram. The bandwidth is certified without DMRG: by Weyl’s inequality</w:t>
+        <w:t xml:space="preserve">[12,13] is located by a singlet–triplet crossing in</w:t>
+      </w:r>
+      <w:r>
+        <w:t xml:space="preserve"> </w:t>
+      </w:r>
+      <w:r>
+        <w:rPr>
+          <w:iCs/>
+          <w:i/>
+        </w:rPr>
+        <w:t xml:space="preserve">periodic</w:t>
+      </w:r>
+      <w:r>
+        <w:t xml:space="preserve"> </w:t>
+      </w:r>
+      <w:r>
+        <w:t xml:space="preserve">chains. The bandwidth is certified without DMRG: by Weyl’s inequality</w:t>
       </w:r>
       <w:r>
         <w:t xml:space="preserve"> </w:t>

</xml_diff>